<commit_message>
Adopta la versión revisada como artículo definitivo con los datos de autoría
- El artículo definitivo pasa a ser la versión que responde al arbitraje
  (Bertonio, Duviols, Barnadas, Rivera Cusicanqui, Zavaleta, Cornejo Polar,
  Ingold, Seguí, Choque Canqui); se retiran los archivos «_revisado».
- Autoría: nombre, nota 1 (80 palabras), investigación «en desarrollo»,
  cinco palabras clave por lengua, conflicto de intereses y declaración
  de uso de IA ajustada al uso real.
- Se devuelve Zavaleta (1986: 21, n. 1) al radio urbano.
- Extensión: 49.486 caracteres; resumen de 99 palabras y abstract de 92;
  139 citas de la novela verificadas.
- Documentación puesta al día: README, convocatoria, verificaciones y
  pendientes, fichero de pasajes, cinco libros, respuesta al arbitraje,
  guía de los pasteles y LEEME de figuras (plano (3) *Contraste*).

Co-Authored-By: Claude Opus 5.5 <noreply@anthropic.com>
Claude-Session: https://claude.ai/code/session_01QWC9b4jcZbzQ8czhYUvPYd
</commit_message>
<xml_diff>
--- a/articulo/articulo_cosecha_de_piedras.docx
+++ b/articulo/articulo_cosecha_de_piedras.docx
@@ -60,7 +60,7 @@
         <w:pStyle w:val="BodyText"/>
       </w:pPr>
       <w:r>
-        <w:t xml:space="preserve">⟦Nombre y apellidos del autor o autora⟧</w:t>
+        <w:t xml:space="preserve">Joaquin Max Cuevas Ventura</w:t>
       </w:r>
       <w:r>
         <w:rPr>
@@ -102,7 +102,7 @@
         <w:t xml:space="preserve"> </w:t>
       </w:r>
       <w:r>
-        <w:t xml:space="preserve">(1945), de Raúl Botelho Gosálvez, desde su «cosecha de piedras». Cruza la crítica histórica del concepto de espacio, el manuaje, la tectónica, la legibilidad estatal, la lectura arquitectónica de la ficción y el método de Simon Lundberg, y propone seis pasteles al óleo como instrumentos de lectura. Sostiene que la novela piensa el habitar como manipulación de la piedra, el despojo como su captura por una red de personas, papeles y máquinas, y la memoria como reparación selectiva del lugar; y que su narrador, al denunciar, también petrifica a quienes describe.</w:t>
+        <w:t xml:space="preserve">(1945), de Raúl Botelho Gosálvez, desde su «cosecha de piedras». Si la crítica mostró que el narrador indigenista vuelve naturaleza la historia india, aquí se lee lo que la novela registra a sus espaldas: la mecánica material del despojo. Con el léxico aymara colonial, la historiografía andina, la tectónica y el manuaje, y seis pasteles al óleo como instrumento de lectura, sostiene que la novela inscribe la posesión en piedra (mojón, pirca, montón), narra su captura por papeles y máquinas, calla el uso indio de la letra y hace de la memoria una reparación selectiva.</w:t>
       </w:r>
     </w:p>
     <w:p>
@@ -120,20 +120,7 @@
         <w:t xml:space="preserve"> </w:t>
       </w:r>
       <w:r>
-        <w:t xml:space="preserve">Botelho Gosálvez;</w:t>
-      </w:r>
-      <w:r>
-        <w:t xml:space="preserve"> </w:t>
-      </w:r>
-      <w:r>
-        <w:rPr>
-          <w:i/>
-          <w:iCs/>
-        </w:rPr>
-        <w:t xml:space="preserve">Altiplano</w:t>
-      </w:r>
-      <w:r>
-        <w:t xml:space="preserve">; espacialidad literaria; manuaje; dibujo como investigación.</w:t>
+        <w:t xml:space="preserve">Botelho Gosálvez; ayllu; despojo; manuaje; dibujo como investigación.</w:t>
       </w:r>
     </w:p>
     <w:p>
@@ -178,7 +165,7 @@
         <w:t xml:space="preserve">“harvest of stones”</w:t>
       </w:r>
       <w:r>
-        <w:t xml:space="preserve">. It brings together the historical critique of the concept of space, manuage, tectonics, state legibility, the architectural reading of fiction and Simon Lundberg’s drawing method, and proposes six oil pastels as reading instruments. It argues that the novel conceives dwelling as the handling of stone, dispossession as the capture of that handling by a network of people, papers and machines, and memory as a selective repair of place; and that its narrator, while denouncing, also petrifies the people portrayed.</w:t>
+        <w:t xml:space="preserve">. Criticism has shown that the indigenista narrator turns Indian history into nature; this study reads what the novel records behind the narrator’s back: the material mechanics of dispossession. Drawing on colonial Aymara lexicography, Andean historiography, tectonics and manuage, with six oil pastels as reading instruments, it argues that the novel inscribes possession in stone (boundary marker, dry wall, heap), narrates its capture by papers and machines, silences Indian uses of writing, and turns memory into a selective repair.</w:t>
       </w:r>
     </w:p>
     <w:p>
@@ -196,7 +183,82 @@
         <w:t xml:space="preserve"> </w:t>
       </w:r>
       <w:r>
-        <w:t xml:space="preserve">Botelho Gosálvez;</w:t>
+        <w:t xml:space="preserve">Botelho Gosálvez; ayllu; dispossession; manuage; drawing as research.</w:t>
+      </w:r>
+    </w:p>
+    <w:bookmarkStart w:id="11" w:name="X94b173b7fb504ed78693e654fa32ba243fe5226"/>
+    <w:p>
+      <w:pPr>
+        <w:pStyle w:val="Heading2"/>
+      </w:pPr>
+      <w:r>
+        <w:t xml:space="preserve">1. Introducción: la cosecha de piedras y la anatomía del habitar</w:t>
+      </w:r>
+    </w:p>
+    <w:p>
+      <w:pPr>
+        <w:pStyle w:val="FirstParagraph"/>
+      </w:pPr>
+      <w:r>
+        <w:t xml:space="preserve">En Jatun-Kolla, el ayllu aymara que Raúl Botelho Gosálvez asienta «en la planta de una alta y rojiza peñería» (Botelho Gosálvez, 1982 [1945]: 6), la tierra de labranza no pasa de cien hectáreas; el resto es «erial de piedras». Los comunarios lo limpian año tras año, sin fortuna:</w:t>
+      </w:r>
+    </w:p>
+    <w:p>
+      <w:pPr>
+        <w:pStyle w:val="BlockText"/>
+      </w:pPr>
+      <w:r>
+        <w:t xml:space="preserve">A medida que extraen piedras y las amontonan, brotan más y más, como paridas por la tierra. ¡Piedras! El trabajo más duro, más reñido y tenaz en Jatun-Kolla, rinde cosecha de piedras. Pero no importa: quizá un día la montaña de piedras sobrepase la altura del cerro; entonces será buena la tierra rescatada (ibid.: 9).</w:t>
+      </w:r>
+    </w:p>
+    <w:p>
+      <w:pPr>
+        <w:pStyle w:val="FirstParagraph"/>
+      </w:pPr>
+      <w:r>
+        <w:t xml:space="preserve">La paradoja es exacta: lo cosechado es el obstáculo; la tierra</w:t>
+      </w:r>
+      <w:r>
+        <w:t xml:space="preserve"> </w:t>
+      </w:r>
+      <w:r>
+        <w:rPr>
+          <w:i/>
+          <w:iCs/>
+        </w:rPr>
+        <w:t xml:space="preserve">pare</w:t>
+      </w:r>
+      <w:r>
+        <w:t xml:space="preserve"> </w:t>
+      </w:r>
+      <w:r>
+        <w:t xml:space="preserve">lo que impide sembrar; la utopía del ayllu tiene forma de montón. Habitar empieza por despejar, y su producto es un residuo que cambia de oficio: con esas piedras se hicieron «los cimientos y paredes de las chujllas» (ibid.: 8); con ellas cubre Juan Condori a su compañera muerta: «amontonó piedras sobre el cadáver» (ibid.: 35); en la mina, a Condori, asesinado, lo sepulta «un informe montón de rocas, lodo y maderos astillados» (ibid.: 154). El aymara colonial nombraba ese tránsito: el vocabulario de Ludovico Bertonio tiene verbo para la faena,</w:t>
+      </w:r>
+      <w:r>
+        <w:t xml:space="preserve"> </w:t>
+      </w:r>
+      <w:r>
+        <w:rPr>
+          <w:i/>
+          <w:iCs/>
+        </w:rPr>
+        <w:t xml:space="preserve">wanqathapiña</w:t>
+      </w:r>
+      <w:r>
+        <w:t xml:space="preserve">, «amontonar piedras sacándolas» (Bertonio, 2011 [1612]: 77), y un solo nombre,</w:t>
+      </w:r>
+      <w:r>
+        <w:t xml:space="preserve"> </w:t>
+      </w:r>
+      <w:r>
+        <w:rPr>
+          <w:i/>
+          <w:iCs/>
+        </w:rPr>
+        <w:t xml:space="preserve">chhaxwa</w:t>
+      </w:r>
+      <w:r>
+        <w:t xml:space="preserve">, para las piedras «que amontonan limpiando las chácaras» y para la piedra «hincada en la pared para atar en ella los palos del techo» (ibid.: 330). Pirca, casa, tumba, escombro: el montón es la arquitectura mínima de</w:t>
       </w:r>
       <w:r>
         <w:t xml:space="preserve"> </w:t>
@@ -209,56 +271,40 @@
         <w:t xml:space="preserve">Altiplano</w:t>
       </w:r>
       <w:r>
-        <w:t xml:space="preserve">; literary spatiality; manuage; drawing as research.</w:t>
-      </w:r>
-    </w:p>
-    <w:bookmarkStart w:id="11" w:name="X94b173b7fb504ed78693e654fa32ba243fe5226"/>
-    <w:p>
-      <w:pPr>
-        <w:pStyle w:val="Heading2"/>
-      </w:pPr>
-      <w:r>
-        <w:t xml:space="preserve">1. Introducción: la cosecha de piedras y la anatomía del habitar</w:t>
-      </w:r>
-    </w:p>
-    <w:p>
-      <w:pPr>
-        <w:pStyle w:val="FirstParagraph"/>
-      </w:pPr>
-      <w:r>
-        <w:t xml:space="preserve">En Jatun-Kolla, el ayllu aymara que Raúl Botelho Gosálvez asienta «en la planta de una alta y rojiza peñería» (Botelho Gosálvez, 1982 [1945]: 6), la tierra de labranza no pasa de cien hectáreas; el resto es «erial de piedras». Los comunarios lo limpian año tras año, sin fortuna:</w:t>
-      </w:r>
-    </w:p>
-    <w:p>
-      <w:pPr>
-        <w:pStyle w:val="BlockText"/>
-      </w:pPr>
-      <w:r>
-        <w:t xml:space="preserve">A medida que extraen piedras y las amontonan, brotan más y más, como paridas por la tierra. ¡Piedras! El trabajo más duro, más reñido y tenaz en Jatun-Kolla, rinde cosecha de piedras. Pero no importa: quizá un día la montaña de piedras sobrepase la altura del cerro; entonces será buena la tierra rescatada (ibid.: 9).</w:t>
-      </w:r>
-    </w:p>
-    <w:p>
-      <w:pPr>
-        <w:pStyle w:val="FirstParagraph"/>
-      </w:pPr>
-      <w:r>
-        <w:t xml:space="preserve">La paradoja es exacta: lo cosechado es el obstáculo; la tierra</w:t>
-      </w:r>
-      <w:r>
-        <w:t xml:space="preserve"> </w:t>
-      </w:r>
-      <w:r>
-        <w:rPr>
-          <w:i/>
-          <w:iCs/>
-        </w:rPr>
-        <w:t xml:space="preserve">pare</w:t>
-      </w:r>
-      <w:r>
-        <w:t xml:space="preserve"> </w:t>
-      </w:r>
-      <w:r>
-        <w:t xml:space="preserve">lo que impide sembrar; la utopía del ayllu tiene forma de montón. Habitar empieza por despejar, y su producto es un residuo que cambia de oficio: con esas piedras se hicieron «los cimientos y paredes de las chujllas» (ibid.: 8); con ellas cubre Juan Condori a su compañera muerta: «amontonó piedras sobre el cadáver» (ibid.: 35); en la mina, Condori acarrea cascotes hasta que, asesinado, lo sepulta «un informe montón de rocas, lodo y maderos astillados» (ibid.: 154). Pirca, casa, tumba, escombro: el montón es la arquitectura mínima de</w:t>
+        <w:t xml:space="preserve">, aquella en que habitar y enterrar se vuelven indiscernibles. Adolf Loos ilustraba la parte ínfima de la arquitectura que pertenece al arte con un túmulo hallado en el bosque, ante el cual algo nos dice que allí yace alguien (Loos, 1972 [1910]); Tim Ingold le opone el montón, que «no se construye: crece» (Ingold, 2013: 78)</w:t>
+      </w:r>
+      <w:r>
+        <w:rPr>
+          <w:rStyle w:val="FootnoteReference"/>
+        </w:rPr>
+        <w:footnoteReference w:id="10"/>
+      </w:r>
+      <w:r>
+        <w:t xml:space="preserve">. La novela conoce los dos: la cosecha es un montón; la tumba de Melchora, un túmulo. Kenneth Frampton, siguiendo a Semper, distingue la estereotomía del basamento, masa formada por «apilamiento repetitivo de elementos pesados», «ya sea piedra o adobe», de la tectónica del armazón, que ensambla «componentes ligeros y lineales» (Frampton, 1995: 5). El montón es estereotomía sin edificio;</w:t>
+      </w:r>
+      <w:r>
+        <w:t xml:space="preserve"> </w:t>
+      </w:r>
+      <w:r>
+        <w:rPr>
+          <w:i/>
+          <w:iCs/>
+        </w:rPr>
+        <w:t xml:space="preserve">chhaxwa</w:t>
+      </w:r>
+      <w:r>
+        <w:t xml:space="preserve"> </w:t>
+      </w:r>
+      <w:r>
+        <w:t xml:space="preserve">nombra el punto en que esa masa se vuelve junta, y la tensión entre la piedra que pesa y la madera que ata recorre la novela de la chujlla al socavón.</w:t>
+      </w:r>
+    </w:p>
+    <w:p>
+      <w:pPr>
+        <w:pStyle w:val="BodyText"/>
+      </w:pPr>
+      <w:r>
+        <w:t xml:space="preserve">¿Qué saber sobre el habitar produce</w:t>
       </w:r>
       <w:r>
         <w:t xml:space="preserve"> </w:t>
@@ -271,15 +317,26 @@
         <w:t xml:space="preserve">Altiplano</w:t>
       </w:r>
       <w:r>
-        <w:t xml:space="preserve">, aquella en que habitar y enterrar se vuelven indiscernibles. Adolf Loos concedía al arte una parte ínfima de la arquitectura —el sepulcro y el monumento— y la ilustraba con un túmulo hallado en el bosque, ante el cual algo nos dice que allí yace alguien (Loos, 1972 [1910]). Kenneth Frampton, siguiendo a Semper, distingue la estereotomía del basamento, masa formada por «apilamiento repetitivo de elementos pesados», «ya sea piedra o adobe», de la tectónica del armazón, que ensambla «componentes ligeros y lineales» (Frampton, 1995: 5). El túmulo y la cosecha de piedras son estereotomía sin edificio: masa que no aloja a nadie, salvo a un muerto. La tensión entre la piedra que pesa y la madera que ata recorre la novela de la chujlla al socavón.</w:t>
-      </w:r>
-    </w:p>
-    <w:p>
-      <w:pPr>
-        <w:pStyle w:val="BodyText"/>
-      </w:pPr>
-      <w:r>
-        <w:t xml:space="preserve">¿Qué saber sobre el habitar produce</w:t>
+        <w:t xml:space="preserve"> </w:t>
+      </w:r>
+      <w:r>
+        <w:t xml:space="preserve">cuando se la lee siguiendo sus piedras? ¿Y qué añade un dibujo hecho con una materia —el pastel al óleo— que, como el comunario, trabaja acumulando y extrayendo? Sostenemos que la novela registra, a espaldas de su narrador, la mecánica material del despojo: la posesión que el ayllu inscribe en la piedra al despejar, amontonar, cercar y amojonar, y su captura por una red de personas, instituciones, papeles y máquinas; y que el dibujo, al repetir esas operaciones con otra materia, obliga a decidir lo que el texto deja abierto y expone lo que su narrador impone.</w:t>
+      </w:r>
+    </w:p>
+    <w:p>
+      <w:pPr>
+        <w:pStyle w:val="BodyText"/>
+      </w:pPr>
+      <w:r>
+        <w:t xml:space="preserve">Porque hay un narrador, y no es inocente. Publicada en Buenos Aires en 1945, la novela se cita aquí por una reedición paceña de 1982 cuya nota editorial asegura que su autor «ama al indio», que enseñó en la Escuela Indigenal de Warisata y que Jatun-Kolla «es, en realidad, Warisata» (Botelho Gosálvez, 1982 [1945]: 5). Declinamos las dos lecturas que pide, la documental y la redentora. Antonio Cornejo Polar mostró que el narrador indigenista, «ajeno al mundo indio aunque se solidarice con él», imagina esa vida «más en términos de naturaleza que de historia» (Cornejo Polar, 2003 [1994]: 180). Este no es la excepción: denuncia el despojo mientras animaliza, sexualiza y petrifica; las chozas son «verrugas en la piel sarmentosa del altiplano» (Botelho Gosálvez, 1982 [1945]: 10), y un minero exhibe sus «pobres costillas zafadas como surcos» (ibid.: 145). No repetimos esa crítica: buscamos la historia que el texto guarda en sus cosas mientras el narrador la vuelve paisaje. Leer el habitar exige una anatomía de esas cosas, y el dibujo, como la disección, es uno de sus instrumentos.</w:t>
+      </w:r>
+    </w:p>
+    <w:p>
+      <w:pPr>
+        <w:pStyle w:val="BodyText"/>
+      </w:pPr>
+      <w:r>
+        <w:t xml:space="preserve">El cruce entre análisis literario, espacialidad crítica y dibujo tiene tres razones. La ficción es un archivo de saber espacial, y en</w:t>
       </w:r>
       <w:r>
         <w:t xml:space="preserve"> </w:t>
@@ -295,45 +352,7 @@
         <w:t xml:space="preserve"> </w:t>
       </w:r>
       <w:r>
-        <w:t xml:space="preserve">cuando se la lee siguiendo sus piedras? ¿Y qué añade un dibujo hecho con una materia —el pastel al óleo— que, como el comunario, trabaja acumulando y extrayendo? Sostenemos que la novela piensa el habitar como manipulación de la piedra (despejar, amontonar, cercar, cubrir, excavar) y el despojo como la captura de esa manipulación por una red de personas, instituciones, papeles y máquinas; y que el dibujo, al repetir esas operaciones con otra materia, somete a prueba lo que la novela sabe y lo que su narrador impone.</w:t>
-      </w:r>
-    </w:p>
-    <w:p>
-      <w:pPr>
-        <w:pStyle w:val="BodyText"/>
-      </w:pPr>
-      <w:r>
-        <w:t xml:space="preserve">Porque hay un narrador, y no es inocente. Publicada en Buenos Aires en 1945, la novela se cita aquí por una reedición paceña de 1982 cuya nota editorial asegura que Jatun-Kolla «es, en realidad, Warisata» y que su autor «ama al indio» (Botelho Gosálvez, 1982 [1945]: 5). Declinamos las dos lecturas que ese paratexto pide, la documental y la redentora: la novela es una representación mediada, cuyo narrador letrado denuncia el despojo mientras animaliza, sexualiza y petrifica a quienes describe. Describe las casas como cuerpos —las chozas son «verrugas en la piel sarmentosa del altiplano» (ibid.: 10)— y los cuerpos como terrenos: un minero exhibe sus «pobres costillas zafadas como surcos» (ibid.: 145). Leer el habitar exige, pues, una anatomía, y el dibujo, como la disección, es uno de sus instrumentos.</w:t>
-      </w:r>
-    </w:p>
-    <w:p>
-      <w:pPr>
-        <w:pStyle w:val="BodyText"/>
-      </w:pPr>
-      <w:r>
-        <w:t xml:space="preserve">El cruce entre análisis literario, espacialidad crítica y dibujo tiene tres razones. La ficción es un archivo de saber espacial: nuestra cultura guarda «una comprensión espacial y arquitectónica sin explotar», cuyo sitio «está en sus ficciones» (Shonfield, 2000: 173, cit. en Martin, 2014: 7)</w:t>
-      </w:r>
-      <w:r>
-        <w:rPr>
-          <w:rStyle w:val="FootnoteReference"/>
-        </w:rPr>
-        <w:footnoteReference w:id="10"/>
-      </w:r>
-      <w:r>
-        <w:t xml:space="preserve">, y en</w:t>
-      </w:r>
-      <w:r>
-        <w:t xml:space="preserve"> </w:t>
-      </w:r>
-      <w:r>
-        <w:rPr>
-          <w:i/>
-          <w:iCs/>
-        </w:rPr>
-        <w:t xml:space="preserve">Altiplano</w:t>
-      </w:r>
-      <w:r>
-        <w:t xml:space="preserve">, como en el cine de Lynch, «la arquitectura es la historia» (Martin, 2014: 13). La crítica histórica del espacio obliga a no proyectar categorías del presente, y el dibujo, que debe decidir punto de vista, escala y límite, vuelve explícitas esas proyecciones. Y si dibujar es manuaje (Cárcamo Pino, 2025b: 244), dibujar una novela es leerla con otro órgano. El recorrido sigue una progresión de escalas —vivienda y ayllu (sección 3), aldea (4), éxodo (5), cuerpo (6), retorno (7)—; en ella se sitúan los seis pasteles de la serie, de los que se reproduce el esquema de encaje (figuras 1-6). Se trata de una investigación ⟦en desarrollo / concluida⟧.</w:t>
+        <w:t xml:space="preserve">ese archivo es material. La crítica histórica del espacio obliga a no proyectar categorías del presente, y el dibujo, que debe decidir punto de vista, escala y límite, vuelve explícitas esas proyecciones. Y si dibujar es manuaje (Cárcamo Pino, 2025b: 244), dibujar una novela es leerla con otro órgano. El recorrido sigue una progresión de escalas —vivienda y ayllu (sección 3), aldea (4), éxodo (5), cuerpo (6), retorno (7)—; en ella se sitúan los seis pasteles de la serie, de los que se reproduce el esquema de encaje (figuras 1-6). Se trata de una investigación en desarrollo.</w:t>
       </w:r>
     </w:p>
     <w:bookmarkEnd w:id="11"/>
@@ -351,15 +370,15 @@
         <w:pStyle w:val="FirstParagraph"/>
       </w:pPr>
       <w:r>
-        <w:t xml:space="preserve">El espacio es un concepto moderno: lo formularon historiadores del arte entre 1893 y 1914, y los arquitectos lo adoptaron después de 1950. Es un tema «esencialmente moderno y, como tal, movedizo y, sobre todo, abstracto», que «no habla sobre la arquitectura, sino sobre nosotros» (Vázquez Ramos et al., 2023: 4). De ahí la advertencia de Edward T. Hall contra quienes «proyectan sobre el mundo visual del pasado las estructuras del mundo visual del presente» (Hall, 1973: 133, cit. en ibid.: 3). Vale dos veces: para nosotros, que no debemos atribuir al ayllu una idea de espacio que la novela no formula —sus categorías son la piedra, la pirca, el mojón, el título—, y para el narrador, que proyecta sobre Jatun-Kolla la sociología urbana: los Villca «son la burguesía usurpadora»; los Condori, Mamani y Quispe, «el proletariado campesino» (Botelho Gosálvez, 1982 [1945]: 22).</w:t>
-      </w:r>
-    </w:p>
-    <w:p>
-      <w:pPr>
-        <w:pStyle w:val="BodyText"/>
-      </w:pPr>
-      <w:r>
-        <w:t xml:space="preserve">La genealogía del concepto sirve también como instrumento. Alberti llamaba</w:t>
+        <w:t xml:space="preserve">El espacio es un tema «esencialmente moderno y, como tal, movedizo y, sobre todo, abstracto», que «no habla sobre la arquitectura, sino sobre nosotros» (Vázquez Ramos et al., 2023: 4). De ahí la advertencia de Edward T. Hall contra quienes «proyectan sobre el mundo visual del pasado las estructuras del mundo visual del presente» (Hall, 1973: 133, cit. en ibid.: 3). Vale dos veces: para nosotros, que no debemos atribuir al ayllu una idea de espacio que la novela no formula —sus categorías son la piedra, la pirca, el mojón, el título—, y para el narrador, que proyecta sobre Jatun-Kolla la sociología urbana: los Villca «son la burguesía usurpadora»; los Condori, Mamani y Quispe, «el proletariado campesino» (Botelho Gosálvez, 1982 [1945]: 22).</w:t>
+      </w:r>
+    </w:p>
+    <w:p>
+      <w:pPr>
+        <w:pStyle w:val="BodyText"/>
+      </w:pPr>
+      <w:r>
+        <w:t xml:space="preserve">La genealogía del concepto también es un instrumento, si se sabe a quién describe. Alberti llamaba</w:t>
       </w:r>
       <w:r>
         <w:t xml:space="preserve"> </w:t>
@@ -375,17 +394,7 @@
         <w:t xml:space="preserve"> </w:t>
       </w:r>
       <w:r>
-        <w:t xml:space="preserve">a «un cierto espacio […] perfectamente delimitado», rodeado por un muro, y concebía el edificio como un cuerpo «compuesto por edificios menores, que son como sus miembros, unidos y articulados entre sí» (Alberti, 2011: 147, cit. en Vázquez Ramos et al., 2023: 5); la tradición entendió la arquitectura como composición de partes hasta bien entrado el siglo XX (Vázquez Ramos et al., 2023: 5-8). Schmarsow invirtió el peso en 1893: de la caverna al Reichstag, todas las arquitecturas serían «construcciones espaciales (</w:t>
-      </w:r>
-      <w:r>
-        <w:rPr>
-          <w:i/>
-          <w:iCs/>
-        </w:rPr>
-        <w:t xml:space="preserve">Raumgebilde</w:t>
-      </w:r>
-      <w:r>
-        <w:t xml:space="preserve">)» (Schmarsow, 1994: 286, cit. en ibid.: 6).</w:t>
+        <w:t xml:space="preserve">a «un cierto espacio […] perfectamente delimitado», rodeado por un muro, y concebía el edificio como un cuerpo «compuesto por edificios menores, que son como sus miembros, unidos y articulados entre sí» (Alberti, 2011: 147, cit. en Vázquez Ramos et al., 2023: 5).</w:t>
       </w:r>
       <w:r>
         <w:t xml:space="preserve"> </w:t>
@@ -401,15 +410,60 @@
         <w:t xml:space="preserve"> </w:t>
       </w:r>
       <w:r>
-        <w:t xml:space="preserve">se sitúa del lado de Alberti: su mundo está hecho de partes —piedras, muros, miembros— y su violencia se ejerce contra su articulación. Worringer da una clave para leer al narrador: en la abstracción geométrica, «la emancipación de la accidentalidad y temporalidad que rigen el panorama universal encuentra su expresión acabada» (Worringer, 1953: 56, cit. en ibid.: 7). Cuando el narrador atribuye a los comunarios una «voluntad de siglos de piedra» (Botelho Gosálvez, 1982 [1945]: 156), practica esa abstracción: los emancipa de la historia; los petrifica.</w:t>
-      </w:r>
-    </w:p>
-    <w:p>
-      <w:pPr>
-        <w:pStyle w:val="BodyText"/>
-      </w:pPr>
-      <w:r>
-        <w:t xml:space="preserve">La piedra andina es otra. Para los incas, muestra Carolyn Dean, la petrificación «señalaba la suspensión, pero no el fin, de la vida» (Dean, 2010: 5), y las</w:t>
+        <w:t xml:space="preserve">se sitúa del lado de Alberti: su mundo está hecho de partes —piedras, muros, miembros— y su violencia se ejerce contra su articulación. Pero el área cercada es también la forma del despojo. René Zavaleta Mercado opuso en Bolivia «dos concepciones que son ambas espacialistas»: la andina, un «archipiélago» en el que «este espacio no puede concebirse sin otro espacio», y la señorial, que concibe «el dominio final del suelo como atribución ligada a una estirpe» (Zavaleta Mercado, 1986: 29-30). Worringer da una clave para leer al narrador: en la abstracción geométrica, «la emancipación de la accidentalidad y temporalidad que rigen el panorama universal encuentra su expresión acabada» (Worringer, 1953: 56, cit. en Vázquez Ramos et al., 2023: 7). Cuando el narrador atribuye a los comunarios una «voluntad de siglos de piedra» (Botelho Gosálvez, 1982 [1945]: 156), practica esa abstracción: los emancipa de la historia; los petrifica.</w:t>
+      </w:r>
+    </w:p>
+    <w:p>
+      <w:pPr>
+        <w:pStyle w:val="BodyText"/>
+      </w:pPr>
+      <w:r>
+        <w:t xml:space="preserve">La piedra andina es otra. En el aymara de Bertonio,</w:t>
+      </w:r>
+      <w:r>
+        <w:t xml:space="preserve"> </w:t>
+      </w:r>
+      <w:r>
+        <w:rPr>
+          <w:i/>
+          <w:iCs/>
+        </w:rPr>
+        <w:t xml:space="preserve">wanqa</w:t>
+      </w:r>
+      <w:r>
+        <w:t xml:space="preserve"> </w:t>
+      </w:r>
+      <w:r>
+        <w:t xml:space="preserve">es solo «piedra muy grande» (Bertonio, 2011 [1612]: 506); los diccionarios, advierte Pierre Duviols, callan el «contenido religioso» que dejan ver los procesos de idolatría, donde el</w:t>
+      </w:r>
+      <w:r>
+        <w:t xml:space="preserve"> </w:t>
+      </w:r>
+      <w:r>
+        <w:rPr>
+          <w:i/>
+          <w:iCs/>
+        </w:rPr>
+        <w:t xml:space="preserve">huanca</w:t>
+      </w:r>
+      <w:r>
+        <w:t xml:space="preserve"> </w:t>
+      </w:r>
+      <w:r>
+        <w:t xml:space="preserve">era «el doble mineral del cadáver sagrado» (Duviols, 1979: 8). Esas piedras conmemoraban «al Huari que primero amojonó tal campo, al que lo cercó, al que lo desbrozó» (ibid.: 13), y la muerte no las producía por mutación, sino por «desdoblamiento» (ibid.: 23).</w:t>
+      </w:r>
+      <w:r>
+        <w:t xml:space="preserve"> </w:t>
+      </w:r>
+      <w:r>
+        <w:rPr>
+          <w:i/>
+          <w:iCs/>
+        </w:rPr>
+        <w:t xml:space="preserve">Huanca</w:t>
+      </w:r>
+      <w:r>
+        <w:t xml:space="preserve">, grafía colonial de</w:t>
       </w:r>
       <w:r>
         <w:t xml:space="preserve"> </w:t>
@@ -422,26 +476,7 @@
         <w:t xml:space="preserve">wank’a</w:t>
       </w:r>
       <w:r>
-        <w:t xml:space="preserve"> </w:t>
-      </w:r>
-      <w:r>
-        <w:t xml:space="preserve">eran rocas entendidas como «los dueños petrificados de los lugares» —campos, valles, aldeas— que, situadas en el lugar que poseían, eran «símbolo de ocupación y posesión» (ibid.: 44).</w:t>
-      </w:r>
-      <w:r>
-        <w:t xml:space="preserve"> </w:t>
-      </w:r>
-      <w:r>
-        <w:rPr>
-          <w:i/>
-          <w:iCs/>
-        </w:rPr>
-        <w:t xml:space="preserve">Huanca</w:t>
-      </w:r>
-      <w:r>
-        <w:t xml:space="preserve"> </w:t>
-      </w:r>
-      <w:r>
-        <w:t xml:space="preserve">es una grafía colonial de</w:t>
+        <w:t xml:space="preserve">, era también nombre de varón (Dean, 2010: 44, 202, n. 86). La novela no tematiza esa ontología, pero la registra: «mojones que han sido puestos allí desde tiempos antiguos» señalan las pertenencias del ayllu (Botelho Gosálvez, 1982 [1945]: 9), y los Huanca habitan «en los linderos» (ibid.: 30). Fuera de su lugar, en cambio, el «organismo de piedra del Kollasuyo» de Paulo Huanca (ibid.: 133) se derrite en los Yungas. La</w:t>
       </w:r>
       <w:r>
         <w:t xml:space="preserve"> </w:t>
@@ -454,19 +489,6 @@
         <w:t xml:space="preserve">wank’a</w:t>
       </w:r>
       <w:r>
-        <w:t xml:space="preserve">, usada también como nombre de varón (ibid.: 44, 202, n. 86). La novela no tematiza esa ontología, pero la lleva en un apellido: fuera de su lugar, el «organismo de piedra del Kollasuyo» de Paulo Huanca (Botelho Gosálvez, 1982 [1945]: 133) no persiste como piedra viva, sino que se derrite «como muñeco de cera» (ibid.: 123). La</w:t>
-      </w:r>
-      <w:r>
-        <w:t xml:space="preserve"> </w:t>
-      </w:r>
-      <w:r>
-        <w:rPr>
-          <w:i/>
-          <w:iCs/>
-        </w:rPr>
-        <w:t xml:space="preserve">wank’a</w:t>
-      </w:r>
-      <w:r>
         <w:t xml:space="preserve"> </w:t>
       </w:r>
       <w:r>
@@ -478,7 +500,7 @@
         <w:pStyle w:val="BodyText"/>
       </w:pPr>
       <w:r>
-        <w:t xml:space="preserve">La tríada de Henri Lefebvre ordena esta materia sin abstraerla: la</w:t>
+        <w:t xml:space="preserve">La tríada de Henri Lefebvre ordena esta materia: la</w:t>
       </w:r>
       <w:r>
         <w:t xml:space="preserve"> </w:t>
@@ -526,7 +548,7 @@
         <w:t xml:space="preserve"> </w:t>
       </w:r>
       <w:r>
-        <w:t xml:space="preserve">(lo vivido), «vivido directamente a través de sus imágenes y símbolos asociados» por habitantes, usuarios y algunos artistas y escritores (Lefebvre, 1991: 38, cit. en Vázquez Ramos et al., 2023: 13). En</w:t>
+        <w:t xml:space="preserve">(lo vivido), el de habitantes, usuarios y algunos artistas y escritores (Lefebvre, 1991: 38, cit. en Vázquez Ramos et al., 2023: 13). En</w:t>
       </w:r>
       <w:r>
         <w:t xml:space="preserve"> </w:t>
@@ -539,7 +561,7 @@
         <w:t xml:space="preserve">Altiplano</w:t>
       </w:r>
       <w:r>
-        <w:t xml:space="preserve">, lo percibido es despejar, arar, pastorear, emigrar; lo concebido, el título, el mojón, la ordenanza con su «radio urbano» (Botelho Gosálvez, 1982 [1945]: 96); lo vivido, el cerro que es «una especie de padre del ayllu» (ibid.: 8), la Pachamama, la apacheta, el Tío de la mina. La novela pertenece al tercer orden y describe los otros dos; el dibujo, también.</w:t>
+        <w:t xml:space="preserve">, lo percibido es despejar, amojonar, arar, pastorear, emigrar; lo concebido, el título, el expediente, la ordenanza con su «radio urbano» (Botelho Gosálvez, 1982 [1945]: 96); lo vivido, el cerro que es «una especie de padre del ayllu» (ibid.: 8), la Pachamama, la apacheta, el Tío de la mina. La novela pertenece al tercer orden y describe los otros dos; el dibujo, también.</w:t>
       </w:r>
     </w:p>
     <w:p>
@@ -563,7 +585,7 @@
         <w:t xml:space="preserve"> </w:t>
       </w:r>
       <w:r>
-        <w:t xml:space="preserve">al conjunto de prácticas manuales que «se funda en la acción bimanual in-tensionada y los efectos de ello sobre la materia para comunicar (o autocomunicarse), expresar o inteligenciar» (Cárcamo Pino, 2019: 1412, cit. en Cárcamo Pino, 2025b: 244). No es solo escribir o dibujar, sino un «largo etcétera que incluye hacer malabares, cocinar, tocar piano o simplemente acariciar» (Cárcamo Pino, 2025b: 245, a partir de Salazar Sánchez y Cárcamo Pino, 2021: 1482). La escritura es una acción manugráfica más, y cada ámbito tiene su</w:t>
+        <w:t xml:space="preserve">al conjunto de prácticas manuales que «se funda en la acción bimanual in-tensionada y los efectos de ello sobre la materia para comunicar (o autocomunicarse), expresar o inteligenciar» (Cárcamo Pino, 2019: 1412, cit. en Cárcamo Pino, 2025b: 244). La escritura es una acción manugráfica más, y cada ámbito tiene su</w:t>
       </w:r>
       <w:r>
         <w:t xml:space="preserve"> </w:t>
@@ -592,27 +614,31 @@
         <w:t xml:space="preserve"> </w:t>
       </w:r>
       <w:r>
-        <w:t xml:space="preserve">enuncia el poder: en Umacachi, los vecinos niegan la escuela a los indios —«Que tiren palotes con el arado» (Botelho Gosálvez, 1982 [1945]: 87)—, y repetir el binarismo sería repetir su lógica. La cuestión es qué manoajes se autorizan y qué instituciones los respaldan; o, con la justicia epistémica que reclama Cárcamo Pino, qué prácticas corporales quedaron «minusvaloradas, invisibilizadas» por el «monopolio de la escritura y el lenguaje» (Cárcamo Pino, 2025b: 259).</w:t>
-      </w:r>
-    </w:p>
-    <w:p>
-      <w:pPr>
-        <w:pStyle w:val="BodyText"/>
-      </w:pPr>
-      <w:r>
-        <w:t xml:space="preserve">Dos corolarios. Si, como dice Alfonso Corona Martínez, «cada arquitectura lleva las marcas de los medios por los que ha sido proyectada» (Corona Martínez, 2009 [1990]: 50, cit. en Cárcamo Pino, 2025a: 12), la arquitectura del despojo llevará las del expediente, el sello y la firma, y la lectura dibujada, las del pastel. Y si, con Luigi Pareyson, crear «es formar y formar artísticamente,</w:t>
-      </w:r>
-      <w:r>
-        <w:t xml:space="preserve"> </w:t>
-      </w:r>
-      <w:r>
-        <w:t xml:space="preserve">“es un puro intentar”</w:t>
-      </w:r>
-      <w:r>
-        <w:t xml:space="preserve"> </w:t>
-      </w:r>
-      <w:r>
-        <w:t xml:space="preserve">sin norma previa y fruto de una acción formante que inventa</w:t>
+        <w:t xml:space="preserve">enuncia el poder: en Umacachi, los vecinos niegan la escuela a los indios —«Que tiren palotes con el arado» (Botelho Gosálvez, 1982 [1945]: 87)—, y repetir el binarismo sería repetir su lógica. La novela lo repite por omisión: el ayllu que «es, en realidad, Warisata» (ibid.: 5) no tiene escuela, cuando allí funcionaba desde 1931 la escuela-ayllu del maestro indio Avelino Siñani y de Elizardo Pérez (Rivera Cusicanqui, 2010 [1984]: 105, 113) y los</w:t>
+      </w:r>
+      <w:r>
+        <w:t xml:space="preserve"> </w:t>
+      </w:r>
+      <w:r>
+        <w:rPr>
+          <w:i/>
+          <w:iCs/>
+        </w:rPr>
+        <w:t xml:space="preserve">kuraka</w:t>
+      </w:r>
+      <w:r>
+        <w:t xml:space="preserve"> </w:t>
+      </w:r>
+      <w:r>
+        <w:t xml:space="preserve">de Achacachi sostenían escuelas propias ya en 1929 (Barnadas, 1978 [1975]: 84). La cuestión es qué manoajes se autorizan y qué instituciones los respaldan: qué prácticas quedaron «minusvaloradas, invisibilizadas» por el «monopolio de la escritura y el lenguaje» (Cárcamo Pino, 2025b: 259).</w:t>
+      </w:r>
+    </w:p>
+    <w:p>
+      <w:pPr>
+        <w:pStyle w:val="BodyText"/>
+      </w:pPr>
+      <w:r>
+        <w:t xml:space="preserve">Si, con Luigi Pareyson, formar es «un puro intentar» sin norma previa, una acción que «inventa</w:t>
       </w:r>
       <w:r>
         <w:t xml:space="preserve"> </w:t>
@@ -628,15 +654,15 @@
         <w:t xml:space="preserve"> </w:t>
       </w:r>
       <w:r>
-        <w:t xml:space="preserve">el modo de formar» (Pareyson, 2002: 18, cit. en Cárcamo Pino, 2025b: 246), ningún método es receta: lo que un pastel descubre no puede escribirse del todo antes de dibujarlo.</w:t>
-      </w:r>
-    </w:p>
-    <w:p>
-      <w:pPr>
-        <w:pStyle w:val="BodyText"/>
-      </w:pPr>
-      <w:r>
-        <w:t xml:space="preserve">Para el método, Simon Lundberg propone explorar la imagen arquitectónica «más allá del uso instrumental de la representación» en cuatro pasos: observación («representar edificios reales»), disección («desarmar y analizar»), ensamblaje («modificar, distorsionar, juntar») e inmersión («hacer creíble, animar») (Lundberg, 2019: 3). La</w:t>
+        <w:t xml:space="preserve">el modo de formar» (Pareyson, 2002: 18, cit. en Cárcamo Pino, 2025b: 246), ningún método es receta: lo que un pastel descubre no puede escribirse del todo antes de dibujarlo. Pero no todo dibujo descubre. Javier Seguí de la Riva distingue el dibujar que puede «servir como ilustración de un texto narrativo previo» del que deja a la mano configurar lo que no se sabía (Seguí de la Riva, 2010: 93); Tim Ingold separa los dibujos que cuentan de los que «especifican» (Ingold, 2013: 125). Los esquemas de encaje que aquí se reproducen pertenecen al dibujo que ilustra y especifica: no descubren; obligan a decidir.</w:t>
+      </w:r>
+    </w:p>
+    <w:p>
+      <w:pPr>
+        <w:pStyle w:val="BodyText"/>
+      </w:pPr>
+      <w:r>
+        <w:t xml:space="preserve">Para el método, Simon Lundberg propone explorar la imagen arquitectónica «más allá del uso instrumental de la representación» en cuatro pasos: observación, disección, ensamblaje e inmersión (Lundberg, 2019: 3). La</w:t>
       </w:r>
       <w:r>
         <w:t xml:space="preserve"> </w:t>
@@ -700,7 +726,7 @@
         <w:t xml:space="preserve"> </w:t>
       </w:r>
       <w:r>
-        <w:t xml:space="preserve">de Canaletto, ciudad «completamente imaginaria» hecha con edificios de ciudades distintas (ibid.: 3). La</w:t>
+        <w:t xml:space="preserve">de Canaletto, ciudad «completamente imaginaria» (ibid.: 3); sus decisiones —un perfil, una analogía— son del dibujante y no cuentan como hallazgos. La</w:t>
       </w:r>
       <w:r>
         <w:t xml:space="preserve"> </w:t>
@@ -740,7 +766,7 @@
         <w:t xml:space="preserve"> </w:t>
       </w:r>
       <w:r>
-        <w:t xml:space="preserve">a ese registro, «término paraguas» que abarca el tacto, la cinestesia, la propiocepción y el sentido vestibular (Garrington, 2013: 16). A una prosa háptica corresponde una lectura háptica: el pastel se trabaja por contacto. Cada figura se examina en tres planos: (1) lo que describe el texto; (2) la operación formal y matérica del pastel; (3) el hallazgo que surge al contrastarlos, verificable en el esquema de encaje de cada figura.</w:t>
+        <w:t xml:space="preserve">a ese registro, «término paraguas» que abarca el tacto, la cinestesia, la propiocepción y el sentido vestibular (Garrington, 2013: 16). A una prosa háptica corresponde una lectura háptica: el pastel se trabaja por contacto. Cada figura se examina en tres planos: (1) lo que describe el texto; (2) la operación formal y matérica del pastel; (3) el contraste: lo que el esquema obliga a decidir y el texto deja abierto o contradice, cotejado cuando es posible con fuentes andinas.</w:t>
       </w:r>
     </w:p>
     <w:p>
@@ -1401,7 +1427,7 @@
         <w:pStyle w:val="BodyText"/>
       </w:pPr>
       <w:r>
-        <w:t xml:space="preserve">La chujlla de los Huanca da la medida del habitáculo: dos metros de alto, paredes «renegridas por el hollín», camastros de «apenas la altura de un adobe» y, de las vigas «mal unidas con lazos de paja trenzada», las herramientas colgadas (ibid.: 30-31). Reúne así los dos modos de Frampton: muros de piedra y adobe, y un armazón atado como una cestería (Frampton, 1995: 5). Se mide con el cuerpo y guarda los instrumentos de sus manos: es una caja de herramientas, que Cárcamo Pino equipara a un repertorio de manuaje (Cárcamo Pino, 2025a: 12). Guarda también su interrupción: tras la peste, los telares parecen «extraños armatostes de madera abandonados» (Botelho Gosálvez, 1982 [1945]: 29); el lado tectónico, el del tejido, es el primero que se pierde. El narrador, en cambio, entra como intruso —los camastros son «morada de piojos y pulgas» (ibid.: 31)—, como el habitante de la casa de Loos que Beatriz Colomina describe como «un intruso en su propio espacio» (Colomina, 1992: 95, cit. en Martin, 2014: 66), solo que este intruso no habita: escribe. Para Bachelard, la casa «protege al soñador» (Bachelard, 1994 [1958]: 6, cit. en Martin, 2014: 63), y el nido, «una cosa precaria», hace soñar la seguridad (Bachelard, 1994 [1958]: 102, cit. en Martin, 2014: 71); para el narrador, la chujlla es una madriguera. Su umbral es, como en toda casa de Loos, «un punto de máxima tensión» (Colomina, 1994: 276, cit. en Martin, 2014: 88): desde el «portal de su chujlla» mira Paulo Huanca partir a los hijos que la escasez expulsa (Botelho Gosálvez, 1982 [1945]: 34).</w:t>
+        <w:t xml:space="preserve">La chujlla de los Huanca da la medida del habitáculo: dos metros de alto, paredes «renegridas por el hollín», camastros de «apenas la altura de un adobe» y, de las vigas «mal unidas con lazos de paja trenzada», las herramientas colgadas (ibid.: 30-31). Reúne así los dos modos de Frampton: muros de piedra y adobe, y un armazón atado como una cestería (Frampton, 1995: 5). Se mide con el cuerpo y guarda los instrumentos de sus manos: es una caja de herramientas, que Cárcamo Pino equipara a un repertorio de manuaje (Cárcamo Pino, 2025a: 12). El narrador, en cambio, entra como intruso —los camastros son «morada de piojos y pulgas» (Botelho Gosálvez, 1982 [1945]: 31)—, como el habitante de la casa de Loos que Beatriz Colomina describe como «un intruso en su propio espacio» (Colomina, 1992: 95, cit. en Martin, 2014: 66), solo que este intruso no habita: escribe. Para Bachelard, el nido, «una cosa precaria», hace soñar la seguridad (Bachelard, 1994 [1958]: 102, cit. en Martin, 2014: 71); para el narrador, la chujlla es una madriguera, y su umbral, el «portal de su chujlla» desde el que Paulo Huanca mira partir a los hijos que la escasez expulsa (Botelho Gosálvez, 1982 [1945]: 34).</w:t>
       </w:r>
     </w:p>
     <w:p>
@@ -1468,20 +1494,20 @@
         <w:t xml:space="preserve">Operación</w:t>
       </w:r>
       <w:r>
-        <w:t xml:space="preserve">. Corte a la altura del cuerpo sentado junto al brasero. El soporte se cubre de negro y siena —el hollín— y la luz se obtiene por extracción: el esgrafiado abre en la masa oscura vigas, hoces y yugo, como el comunario abre la tierra quitándole piedras; los muros van en empaste; el humo, con el dedo. El corte toma el perfil de un cráneo: la bóveda de paja como calota, la puerta como órbita, el fuego en el lugar del pensamiento. (3)</w:t>
-      </w:r>
-      <w:r>
-        <w:t xml:space="preserve"> </w:t>
-      </w:r>
-      <w:r>
-        <w:rPr>
-          <w:i/>
-          <w:iCs/>
-        </w:rPr>
-        <w:t xml:space="preserve">Hallazgo</w:t>
-      </w:r>
-      <w:r>
-        <w:t xml:space="preserve">. Obligado a elegir punto de vista y escala, el dibujo adopta los del cuerpo que habita, no los del narrador: la chujlla aparece como cráneo bachelardiano, bóveda que protege lo que piensa, y como archivo del manoaje familiar. Los sueños quedan fuera: el narrador admite que en el alma de los comunarios, «en su secreto, nadie podía entrar» (ibid.: 65).</w:t>
+        <w:t xml:space="preserve">. Corte a la altura del cuerpo sentado junto al brasero. El soporte se cubre de negro y siena —el hollín— y la luz se obtiene por extracción: el esgrafiado abre en la masa oscura vigas, hoces y yugo, como el comunario abre la tierra quitándole piedras; los muros van en empaste; el humo, con el dedo. El perfil de cráneo —la bóveda de paja como calota, la puerta como órbita, el fuego en el lugar del pensamiento— es una decisión de ensamblaje tomada de Bachelard, no un hallazgo. (3)</w:t>
+      </w:r>
+      <w:r>
+        <w:t xml:space="preserve"> </w:t>
+      </w:r>
+      <w:r>
+        <w:rPr>
+          <w:i/>
+          <w:iCs/>
+        </w:rPr>
+        <w:t xml:space="preserve">Contraste</w:t>
+      </w:r>
+      <w:r>
+        <w:t xml:space="preserve">. El esquema debe decidir el punto de vista, y el texto ofrece dos: el del narrador, intruso en la puerta, y el del cuerpo que habita, al que remiten el hollín, los camastros y las herramientas. El corte elige el segundo y encuentra su límite donde el narrador pone el suyo: en el alma de los comunarios, «en su secreto, nadie podía entrar» (Botelho Gosálvez, 1982 [1945]: 65).</w:t>
       </w:r>
     </w:p>
     <w:p>
@@ -1561,15 +1587,15 @@
         <w:pStyle w:val="BodyText"/>
       </w:pPr>
       <w:r>
-        <w:t xml:space="preserve">La jerarquía no viene solo de fuera. El antepasado de los Villca llega tras la sublevación de Tupaj Katari, y su hijo Pedro «empotró en el suelo del ayllu las estacas de propiedad y empezó a dominar» (Botelho Gosálvez, 1982 [1945]: 20): la primera estaca la clava una mano aymara. Los Villca inventan genealogías imperiales porque «necesitaban aquel blasón para sustentar su orgullo y su riqueza» (ibid.: 28): el mito funciona como título. La memoria misma se escalona: la de los Villca es «edificante y fantástica»; los peones «no tienen historia», salvo tres palabras: «¡hambre, persecución y muerte!» (ibid.: 22-23). El capítulo «El signo escalonado» cierra con la fórmula «Así los Villca, Huanca y Condori, son las generaciones del Signo Escalonado» (ibid.: 38), y el glosario define el término como «Signo sagrado de Tiwanaco» (ibid.: 163): el narrador convierte un signo sagrado en diagrama de clases, un caso de manual de la advertencia de Hall.</w:t>
-      </w:r>
-    </w:p>
-    <w:p>
-      <w:pPr>
-        <w:pStyle w:val="BodyText"/>
-      </w:pPr>
-      <w:r>
-        <w:t xml:space="preserve">El mismo capítulo narra el despojo de Kero-Pata, el ayllu de origen de Juan Condori, cuyos comunarios habían estado «amparados por las Cédulas Reales» hasta que, con la República, «los doctores alto-peruanos les birlaron la tierra» (ibid.: 36). El papel protegió y el papel despojó, mediante una red: una hectárea pagada al cura por unos responsos pasa a un doctor; intendente y corregidor toman posesión; tras «una gran cuestión de títulos, papel sellado y pago de impuestos», el doctor obtiene veinte hectáreas, porque «así lo declaraban los papeles del Gobierno». Frente a la iglesia levanta su hacienda: «La religión y la propiedad quedaron frente a frente, guiñándose con sus ventanucos empolvados» (ibid.: 36-37). Los edificios son cómplices.</w:t>
+        <w:t xml:space="preserve">La jerarquía no viene solo de fuera. El antepasado de los Villca llega tras la sublevación de Tupaj Katari, y su hijo Pedro «empotró en el suelo del ayllu las estacas de propiedad y empezó a dominar» (Botelho Gosálvez, 1982 [1945]: 20): la primera estaca la clava una mano aymara, y con ella entra en el ayllu la concepción señorial del suelo. Los Villca inventan genealogías imperiales porque «necesitaban aquel blasón para sustentar su orgullo y su riqueza» (ibid.: 28): el mito funciona como título. La memoria misma se escalona: la de los Villca es «edificante y fantástica»; los peones «no tienen historia», salvo tres palabras: «¡hambre, persecución y muerte!» (ibid.: 22-23). El capítulo cierra con la fórmula «Así los Villca, Huanca y Condori, son las generaciones del Signo Escalonado» (ibid.: 38), y el glosario define el término como «Signo sagrado de Tiwanaco» (ibid.: 163): el narrador convierte un signo sagrado en diagrama de clases, un caso de manual de la advertencia de Hall.</w:t>
+      </w:r>
+    </w:p>
+    <w:p>
+      <w:pPr>
+        <w:pStyle w:val="BodyText"/>
+      </w:pPr>
+      <w:r>
+        <w:t xml:space="preserve">El mismo capítulo narra el despojo de Kero-Pata, el ayllu de origen de Juan Condori, cuyos comunarios habían estado «amparados por las Cédulas Reales» hasta que, con la República, «los doctores alto-peruanos les birlaron la tierra» (ibid.: 36). El papel protegió y el papel despojó, mediante una red: una hectárea pagada al cura por unos responsos pasa a un doctor; tras «una gran cuestión de títulos, papel sellado y pago de impuestos», el doctor obtiene veinte hectáreas, porque «así lo declaraban los papeles del Gobierno». Frente a la iglesia levanta su hacienda: «La religión y la propiedad quedaron frente a frente, guiñándose con sus ventanucos empolvados» (ibid.: 36-37). Los edificios son cómplices. La novela calla el tercer uso del papel: tras la Ley de Exvinculación de 1874, las comunidades comenzaron «a desenterrar antiguos títulos de propiedad» coloniales, «una pieza clave en la lucha legal» (Rivera Cusicanqui, 2010 [1984]: 99).</w:t>
       </w:r>
     </w:p>
     <w:p>
@@ -1623,7 +1649,7 @@
         <w:t xml:space="preserve">Texto</w:t>
       </w:r>
       <w:r>
-        <w:t xml:space="preserve">. En alzado, el orden de las chujllas y de las familias (ibid.: 6, 20-23, 38), contradicho por un dato: al peón Juan Condori le dan «una chujlla que estaba abandonada cerro arriba» (ibid.: 35). En planta, el «tablero de ajedrez un poco desigual, un poco contrahecho» de los barbechos (ibid.: 9), con sus mojones, estacas y títulos. (2)</w:t>
+        <w:t xml:space="preserve">. En alzado, el orden de las chujllas y de las familias (Botelho Gosálvez, 1982 [1945]: 6, 20-23, 38), contradicho por un dato: al peón Juan Condori le dan «una chujlla que estaba abandonada cerro arriba» (ibid.: 35). En planta, el «tablero de ajedrez un poco desigual, un poco contrahecho» de los barbechos (ibid.: 9), con sus mojones, estacas y títulos. (2)</w:t>
       </w:r>
       <w:r>
         <w:t xml:space="preserve"> </w:t>
@@ -1646,10 +1672,10 @@
           <w:i/>
           <w:iCs/>
         </w:rPr>
-        <w:t xml:space="preserve">Hallazgo</w:t>
-      </w:r>
-      <w:r>
-        <w:t xml:space="preserve">. Dibujado sobre la pendiente, el signo no encaja: el peón ocupa un escalón alto, y los Villca bajarán al pesebre de la aldea; en los Yungas, los «graderíos» del cocal (Botelho Gosálvez, 1982 [1945]: 112) y, en la mina, el campamento (ibid.: 135) rehacen la escalera. El signo es un operador recursivo de dominación que cada territorio vuelve a escalonar, no una identidad fija. Mito y mapa no se oponen: ambos escalonan.</w:t>
+        <w:t xml:space="preserve">Contraste</w:t>
+      </w:r>
+      <w:r>
+        <w:t xml:space="preserve">. El dato está en el texto; el esquema no lo descubre, pero lo vuelve incompatible: en una misma hoja, el signo no encaja en la pendiente, porque el peón ocupa un escalón alto y los Villca bajarán al pesebre de la aldea. La escalera se rehace en el cocal y en la mina (Botelho Gosálvez, 1982 [1945]: 112, 135): el signo es un operador recursivo de dominación, no una identidad fija, y mito y mapa no se oponen: ambos escalonan.</w:t>
       </w:r>
     </w:p>
     <w:p>
@@ -1747,76 +1773,47 @@
         <w:pStyle w:val="BodyText"/>
       </w:pPr>
       <w:r>
-        <w:t xml:space="preserve">Allí opera el Alcalde vitalicio, el doctor Margarito Mendoza, «con el fajo de expedientes bajo el brazo», diestro en «tejer obscuras mallas de términos seudo jurídicos»; los tinterillos «urden pleitos por nada» (ibid.: 86). Una arqueología etimológica a la manera de Cárcamo Pino enlaza ese vocabulario con el resto de la novela:</w:t>
-      </w:r>
-      <w:r>
-        <w:t xml:space="preserve"> </w:t>
-      </w:r>
-      <w:r>
-        <w:rPr>
-          <w:i/>
-          <w:iCs/>
-        </w:rPr>
-        <w:t xml:space="preserve">texto</w:t>
-      </w:r>
-      <w:r>
-        <w:t xml:space="preserve"> </w:t>
-      </w:r>
-      <w:r>
-        <w:t xml:space="preserve">viene de</w:t>
-      </w:r>
-      <w:r>
-        <w:t xml:space="preserve"> </w:t>
-      </w:r>
-      <w:r>
-        <w:rPr>
-          <w:i/>
-          <w:iCs/>
-        </w:rPr>
-        <w:t xml:space="preserve">textus</w:t>
-      </w:r>
-      <w:r>
-        <w:t xml:space="preserve">, tejido, y</w:t>
-      </w:r>
-      <w:r>
-        <w:t xml:space="preserve"> </w:t>
-      </w:r>
-      <w:r>
-        <w:rPr>
-          <w:i/>
-          <w:iCs/>
-        </w:rPr>
-        <w:t xml:space="preserve">urdir</w:t>
-      </w:r>
-      <w:r>
-        <w:t xml:space="preserve"> </w:t>
-      </w:r>
-      <w:r>
-        <w:t xml:space="preserve">nombra a la vez la urdimbre del telar y la maquinación; las tejedoras Huanca pasan la lanzadera «a través de la delicada malla» y los varones hacen «bonita urdimbre de surcos» (ibid.: 29). Escribir, tejer y arar comparten el vocabulario de la mano: la novela no opone la mano a la letra, sino unos manoajes a otros. Tampoco reduce el despojo a un villano: corregidor, alcalde, intendente y cura son «cuatro patas de la bestia opresora del puneño» (ibid.: 13), y «cinco gendarmes indios» arrastran a Vicente Villca al patio donde lo azotan (ibid.: 101).</w:t>
-      </w:r>
-    </w:p>
-    <w:p>
-      <w:pPr>
-        <w:pStyle w:val="BodyText"/>
-      </w:pPr>
-      <w:r>
-        <w:t xml:space="preserve">Los Villca llegan a la aldea con treinta y cuatro ovejas, y la chola Encarnación, por cincuenta bolivianos, les cede el corral: «Tu familia puede acomodarse en el pesebre» (ibid.: 92). Entonces llega la letra: «Todos los animales de carneo que existen dentro del radio urbano serán requisados […] (Fdo.) Dr. Margarito Mendoza» (ibid.: 96). La trampa es geométrica —un radio trazado sobre el papel convierte el corral en encierro— y es manual: está firmada. Un mapa catastral, observa James C. Scott, «no se limita a describir un sistema de tenencia de la tierra; lo crea», porque da a sus categorías «la fuerza de la ley» (Scott, 2020 [1998]: 3). El radio hace lo mismo con el ganado, como los papeles de Kero-Pata con la tierra, y lee con sesgo: a los mestizos «no les alcanzaba la Ordenanza» (Botelho Gosálvez, 1982 [1945]: 102). Los animales de los indios, tasados «a ojo de buen cubero», se esfuman por el «embudo» de una finca del Alcalde (ibid.), y la fortuna de los Villca se reduce «a mil seiscientos bolivianos en papel» (ibid.: 103).</w:t>
-      </w:r>
-    </w:p>
-    <w:p>
-      <w:pPr>
-        <w:pStyle w:val="BodyText"/>
-      </w:pPr>
-      <w:r>
-        <w:t xml:space="preserve">La letra, además, pesa. En el cuartucho del tinterillo al que Vicente consulta hay «una mugrienta mesa con un tintero y un desordenado montón de papeles y libracos encima» (ibid.) —otra vez el montón—, y el letrado tasa la defensa por tonelaje: señala «un Código Penal en infolio y un manual del Procedimiento Civil», afirma que el grande «tiene más peso legal y jurídico que el chiquitito» y cobra en consecuencia: «seiscientos bolivianos, la mitad adelantados» (ibid.: 104). Una propiedad física del libro se vuelve argumento de autoridad y, enseguida, precio. Es un manuaje burocrático: el tinterillo no escribe; señala, compara y cuenta billetes. El escritorio que Cárcamo Pino sitúa en el mismo repertorio que la caja de herramientas (2025a: 12) funciona aquí como instrumento de cobro, y lo que se cobra es una lectura: la del derecho de propiedad moderno, mediado por el Estado, que según Scott solo resulta «fácilmente descifrable» para quienes tienen «la formación suficiente» y dominan sus leyes (Scott, 2020 [1998]: 35-36). Vicente no puede leer ese código, pero lee a quien lo vende —«estos tinterillos son de una sola casta y todos obran con una mala fe del demonio» (Botelho Gosálvez, 1982 [1945]: 104)— y rechaza la defensa. La consulta se cobra con una amenaza —«te encierro por conspirar contra la autoridad municipal»—: Vicente desata de su faja «un atado de pobres y traposos billetes», paga, rechaza una segunda oferta y sale «libre ya de la amenaza del letrado» (ibid.: 105). La escena no enfrenta a un indio sin juicio con la escritura: articula la materia del libro, un argumento fraudulento, el juicio del personaje y la coerción que convierte su negativa en deuda.</w:t>
-      </w:r>
-    </w:p>
-    <w:p>
-      <w:pPr>
-        <w:pStyle w:val="BodyText"/>
-      </w:pPr>
-      <w:r>
-        <w:t xml:space="preserve">La aldea ya ha hecho su obra: dos niños mueren de hambre y los entierran «allí mismo, bajo el suelo del pesebre, para evitar el pago al cura y el municipio» (ibid.: 106). Lo siniestro, dice Freud, remite «a lo que alguna vez fue bien conocido y familiar» (Freud, 2003 [1919]: 124, cit. en Martin, 2014: 64); de la casa familiar a la casa embrujada, añade Vidler, «hay un solo pasaje» (Vidler, 1992: 32, cit. en Martin, 2014: 99). Aquí, ese pasaje es un pesebre «donde el viento entraba por todas partes» (Botelho Gosálvez, 1982 [1945]: 105): refugio, jaula y tumba. Los Villca «habían sido domesticados por la aldea» (ibid.: 107), y</w:t>
+        <w:t xml:space="preserve">Allí opera el Alcalde vitalicio, el doctor Margarito Mendoza, «con el fajo de expedientes bajo el brazo», diestro en «tejer obscuras mallas de términos seudo jurídicos»; los tinterillos «urden pleitos por nada» (ibid.: 86).</w:t>
+      </w:r>
+      <w:r>
+        <w:t xml:space="preserve"> </w:t>
+      </w:r>
+      <w:r>
+        <w:rPr>
+          <w:i/>
+          <w:iCs/>
+        </w:rPr>
+        <w:t xml:space="preserve">Urdir</w:t>
+      </w:r>
+      <w:r>
+        <w:t xml:space="preserve"> </w:t>
+      </w:r>
+      <w:r>
+        <w:t xml:space="preserve">nombra a la vez la urdimbre del telar y la maquinación, y la novela enlaza ese vocabulario con el de las tejedoras Huanca, que pasan la lanzadera «a través de la delicada malla», y el de los varones, que hacen «bonita urdimbre de surcos» (ibid.: 29). Escribir, tejer y arar comparten el vocabulario de la mano: la novela no opone la mano a la letra, sino unos manoajes a otros. Tampoco reduce el despojo a un villano: corregidor, alcalde, intendente y cura son «cuatro patas de la bestia opresora del puneño» (ibid.: 13), y «cinco gendarmes indios» arrastran a Vicente Villca al patio donde lo azotan (ibid.: 101).</w:t>
+      </w:r>
+    </w:p>
+    <w:p>
+      <w:pPr>
+        <w:pStyle w:val="BodyText"/>
+      </w:pPr>
+      <w:r>
+        <w:t xml:space="preserve">Los Villca llegan a la aldea con treinta y cuatro ovejas, y la chola Encarnación, por cincuenta bolivianos, les cede el corral: «Tu familia puede acomodarse en el pesebre» (ibid.: 92). Entonces llega la letra: «Todos los animales de carneo que existen dentro del radio urbano serán requisados […] (Fdo.) Dr. Margarito Mendoza» (ibid.: 96). La trampa es geométrica —un radio trazado sobre el papel convierte el corral en encierro— y es manual: está firmada. Un mapa catastral, observa James C. Scott, «no se limita a describir un sistema de tenencia de la tierra; lo crea», porque da a sus categorías «la fuerza de la ley» (Scott, 2020 [1998]: 3). El radio hace lo mismo con el ganado, como los papeles de Kero-Pata con la tierra, y lee con sesgo: a los mestizos «no les alcanzaba la Ordenanza» (Botelho Gosálvez, 1982 [1945]: 102). En una sociedad «de dudosa cuantificación como Bolivia» (Zavaleta Mercado, 1986: 21, n. 1), los animales de los indios, tasados «a ojo de buen cubero», se esfuman por el «embudo» de una finca del Alcalde (Botelho Gosálvez, 1982 [1945]: 102), y la fortuna de los Villca se reduce «a mil seiscientos bolivianos en papel» (ibid.: 103).</w:t>
+      </w:r>
+    </w:p>
+    <w:p>
+      <w:pPr>
+        <w:pStyle w:val="BodyText"/>
+      </w:pPr>
+      <w:r>
+        <w:t xml:space="preserve">La letra, además, pesa. En el cuartucho del tinterillo al que Vicente consulta hay «un desordenado montón de papeles y libracos» (ibid.) —otra vez el montón—, y el letrado tasa la defensa por tonelaje: señala «un Código Penal en infolio y un manual del Procedimiento Civil», afirma que el grande «tiene más peso legal y jurídico que el chiquitito» y cobra en consecuencia (ibid.: 104). Es un manuaje burocrático: el tinterillo no escribe; señala, compara y cuenta billetes. Como en la escena de Cajamarca con que Cornejo Polar abre la heterogeneidad andina, el libro es «mucho más fetiche que texto y mucho más gesto de dominio que acto de lenguaje» (Cornejo Polar, 2003 [1994]: 41), y su peso se vuelve argumento de autoridad y precio. Vicente no puede leer ese código, pero lee a quien lo vende —«estos tinterillos son de una sola casta y todos obran con una mala fe del demonio» (Botelho Gosálvez, 1982 [1945]: 104)— y rechaza la defensa, aunque una amenaza lo obliga a pagar la consulta (ibid.: 105). La escena no enfrenta a un indio sin juicio con la escritura: articula la materia del libro, un argumento fraudulento, el juicio del personaje y la coerción. Y calla que, en la historia, los «abogados de pueblo (peyorativamente designados como “tinterillos”)» asesoraron la lucha legal de las comunidades y fueron «la manifestación embrionaria del indigenismo criollo» (Rivera Cusicanqui, 2010 [1984]: 101), el mismo en que se inscribe la novela.</w:t>
+      </w:r>
+    </w:p>
+    <w:p>
+      <w:pPr>
+        <w:pStyle w:val="BodyText"/>
+      </w:pPr>
+      <w:r>
+        <w:t xml:space="preserve">La aldea ya ha hecho su obra: dos niños mueren de hambre y los entierran «allí mismo, bajo el suelo del pesebre, para evitar el pago al cura y el municipio» (Botelho Gosálvez, 1982 [1945]: 106). Lo siniestro, dice Freud, remite «a lo que alguna vez fue bien conocido y familiar» (Freud, 2003 [1919]: 124, cit. en Martin, 2014: 64); aquí, un pesebre «donde el viento entraba por todas partes» (Botelho Gosálvez, 1982 [1945]: 105) pasa de refugio a jaula y a tumba. Los Villca «habían sido domesticados por la aldea» (ibid.: 107), y</w:t>
       </w:r>
       <w:r>
         <w:t xml:space="preserve"> </w:t>
@@ -1863,15 +1860,15 @@
         <w:pStyle w:val="FirstParagraph"/>
       </w:pPr>
       <w:r>
-        <w:t xml:space="preserve">El éxodo a los Yungas empieza en un umbral: «Tras de la muralla que condena el horizonte del altiplano empieza el yunga» (Botelho Gosálvez, 1982 [1945]: 108). En la apacheta, el viento sacude el poncho de Paulo Huanca «como un gallardete clavado en la ceja de la apacheta», su familia reza de rodillas y las cumbres se alzan «semejantes a fantásticas construcciones góticas» (ibid.: 109): otra proyección del narrador, que mira la cordillera con la arquitectura de Europa.</w:t>
-      </w:r>
-    </w:p>
-    <w:p>
-      <w:pPr>
-        <w:pStyle w:val="BodyText"/>
-      </w:pPr>
-      <w:r>
-        <w:t xml:space="preserve">Del otro lado, el cuerpo del puneño deriva. Su manoaje no se traslada —«Sabrás arar en la puna, pero aquí esa es otra música» (ibid.: 113)—; Paulo se consume «derritiéndose como muñeco de cera» (ibid.: 123), el mayordomo lo despide desde «el vano de la puerta» (ibid.: 126) y, en el aserradero, el contratista esgrime una amputación —«No hace dos días que uno de ustedes se ha cercenado una mano en la sierra»— y solo lo anota en la planilla cuando Paulo se ofrece como «peón, siquiera» (ibid.: 129): la mutilación se vuelve argumento contra las víctimas. La hija mayor de Paulo, a quien el narrador presenta dejando «ver sus nacientes senos» (ibid.: 125), «había sido desflorada por el patrón»; «en seguida vinieron los capataces y peones: le daban dinero», y la desesperación la «obligó a venderse» hasta que «con su propia mano se quitó la vida» (ibid.: 132). Ella no tiene nombre, y su historia cabe en un inciso —«vieja historia»— que traslada a la muchacha, como venta, la violencia que empieza en el patrón. Su padre jura que fue un crimen, pero «las pruebas eran irrefutables» (ibid.): la palabra</w:t>
+        <w:t xml:space="preserve">El éxodo a los Yungas empieza en un umbral: «Tras de la muralla que condena el horizonte del altiplano empieza el yunga» (Botelho Gosálvez, 1982 [1945]: 108). El otro piso del archipiélago andino es aquí «fábula» (ibid.: 7), y del otro lado espera la finca. En la apacheta, el viento sacude el poncho de Paulo Huanca «como un gallardete clavado en la ceja de la apacheta», su familia reza de rodillas y las cumbres se alzan «semejantes a fantásticas construcciones góticas» (ibid.: 109): otra proyección del narrador, que mira la cordillera con la arquitectura de Europa.</w:t>
+      </w:r>
+    </w:p>
+    <w:p>
+      <w:pPr>
+        <w:pStyle w:val="BodyText"/>
+      </w:pPr>
+      <w:r>
+        <w:t xml:space="preserve">Del otro lado, el cuerpo del puneño deriva. Su manoaje no se traslada —«Sabrás arar en la puna, pero aquí esa es otra música» (ibid.: 113)—; Paulo se consume «derritiéndose como muñeco de cera» (ibid.: 123), y, en el aserradero, el contratista esgrime una mano cercenada en la sierra y solo lo anota en la planilla cuando Paulo se ofrece como «peón, siquiera» (ibid.: 129): la mutilación se vuelve argumento contra las víctimas. La hija mayor de Paulo, a quien el narrador presenta dejando «ver sus nacientes senos» (ibid.: 125), «había sido desflorada por el patrón»; «en seguida vinieron los capataces y peones: le daban dinero», y la desesperación la «obligó a venderse» hasta que «con su propia mano se quitó la vida» (ibid.: 132). Ella no tiene nombre, y su historia cabe en un inciso —«vieja historia»— que traslada a la muchacha, como venta, la violencia que empieza en el patrón. Su padre jura que fue un crimen, pero «las pruebas eran irrefutables» (ibid.): la palabra</w:t>
       </w:r>
       <w:r>
         <w:t xml:space="preserve"> </w:t>
@@ -1884,7 +1881,7 @@
         <w:t xml:space="preserve">crimen</w:t>
       </w:r>
       <w:r>
-        <w:t xml:space="preserve">, que el narrador reserva para la muerte de Condori (ibid.: 154), no alcanza al patrón, y la única agencia que concede a la mano de la muchacha es el suicidio. La única travesía lograda la hacen los monos, que tienden sobre el río «una cadena cogiéndose de manos» (ibid.: 121): una arquitectura de manos, la de la braquiación que, según Cárcamo Pino, impuso a la mano primate «una gran carga sobre la capacidad de control cinestésico y de cálculo espacial» (Cárcamo Pino, 2025a: 8).</w:t>
+        <w:t xml:space="preserve">, que el narrador reserva para la muerte de Condori (ibid.: 154), no alcanza al patrón, y la única agencia que concede a la mano de la muchacha es el suicidio. La única travesía lograda la hacen los monos, que tienden sobre el río «una cadena cogiéndose de manos» (ibid.: 121): una arquitectura de manos.</w:t>
       </w:r>
     </w:p>
     <w:p>
@@ -1938,7 +1935,7 @@
         <w:t xml:space="preserve">Texto</w:t>
       </w:r>
       <w:r>
-        <w:t xml:space="preserve">. Un umbral sin piedras: el glosario define la apacheta como «abra de las cordilleras y cumbre de los caminos» (Botelho Gosálvez, 1982 [1945]: 160), un lugar y no un montón; la novela la marca con un cuerpo erguido, la familia arrodillada, la «fauce» del yunga y las cumbres «góticas» (ibid.: 109) y, más abajo, el puente de monos (ibid.: 121). (2)</w:t>
+        <w:t xml:space="preserve">. Un umbral sin piedras: el glosario define la apacheta como «abra de las cordilleras y cumbre de los caminos» (Botelho Gosálvez, 1982 [1945]: 160), un lugar y no un montón; la novela la marca con un cuerpo erguido, la familia arrodillada y la «fauce» del yunga (ibid.: 109) y, más abajo, el puente de monos (ibid.: 121). (2)</w:t>
       </w:r>
       <w:r>
         <w:t xml:space="preserve"> </w:t>
@@ -1961,10 +1958,26 @@
           <w:i/>
           <w:iCs/>
         </w:rPr>
-        <w:t xml:space="preserve">Hallazgo</w:t>
-      </w:r>
-      <w:r>
-        <w:t xml:space="preserve">. Partida la hoja, los Yungas dejan de ser otro paisaje y se vuelven un cambio de estado de la materia y de la mano: la cera se funde como Paulo, «muñeco de cera» (ibid.: 123),</w:t>
+        <w:t xml:space="preserve">Contraste</w:t>
+      </w:r>
+      <w:r>
+        <w:t xml:space="preserve">. El esquema sigue al texto y dibuja un umbral sin montón. El aymara colonial llama</w:t>
+      </w:r>
+      <w:r>
+        <w:t xml:space="preserve"> </w:t>
+      </w:r>
+      <w:r>
+        <w:rPr>
+          <w:i/>
+          <w:iCs/>
+        </w:rPr>
+        <w:t xml:space="preserve">apachita</w:t>
+      </w:r>
+      <w:r>
+        <w:t xml:space="preserve"> </w:t>
+      </w:r>
+      <w:r>
+        <w:t xml:space="preserve">al «montón de piedras, que por superstición van haciendo los caminantes y los adoran» (Bertonio, 2011 [1612]: 317), en el que se pegaba «coca mascada con las manos» (ibid.: 349): un montón que crece con cada paso y un manoaje colectivo, que la novela sustituye por una muralla y un cuerpo clavado. Hacer del montón un rasgo del paisaje, advierte Ingold, convierte la cosa que invitaba a seguir en «un objeto que bloquea nuestro camino» (Ingold, 2013: 86). Partida la hoja, los Yungas se vuelven un cambio de estado de la materia y de la mano: la cera se funde como Paulo,</w:t>
       </w:r>
       <w:r>
         <w:t xml:space="preserve"> </w:t>
@@ -1980,7 +1993,7 @@
         <w:t xml:space="preserve"> </w:t>
       </w:r>
       <w:r>
-        <w:t xml:space="preserve">fuera de su lugar. Y el puente de manos se opone al vano por el que se expulsa: lo único que cruza el abismo es colectivo y está hecho de manos.</w:t>
+        <w:t xml:space="preserve">fuera de su lugar; y lo único que cruza el abismo es colectivo y está hecho de manos, como la apacheta que falta.</w:t>
       </w:r>
     </w:p>
     <w:p>
@@ -2060,28 +2073,15 @@
         <w:pStyle w:val="BodyText"/>
       </w:pPr>
       <w:r>
-        <w:t xml:space="preserve">La mina «Pensylvania», de la compañía yanqui The Star Syndicate, se anuncia con «el encaje de acero de la torre de un andarivel» (Botelho Gosálvez, 1982 [1945]: 134-135). El campamento reproduce la escalera, de los chalets de ingenieros al «enjambre de cuchitriles de calamina» de los mineros (ibid.: 135). La empresa inscribe a Condori —«Tomaron su identidad e impresiones digitales» (ibid.: 140)— y la mano del comunario entra en el archivo como huella: es su primera firma. La mano que lee el mundo, recuerda Garrington, «también puede ser leída», y leída para establecer la identidad de su dueño (Garrington, 2013: 2): la compañía vuelve legible al peón, en el sentido de Scott, antes de bajarlo. El capataz le anuncia el retorno de la cosecha: «Aquí cosecharás miles de cargas de estaño» (Botelho Gosálvez, 1982 [1945]: 142).</w:t>
-      </w:r>
-    </w:p>
-    <w:p>
-      <w:pPr>
-        <w:pStyle w:val="BodyText"/>
-      </w:pPr>
-      <w:r>
-        <w:t xml:space="preserve">Se baja en jaula: en la entrada, los huecos de las jaulas se miran en el muro «como dos enormes nichos», y en una de ellas siete hombres van «apeñuscados contra la rejilla» (ibid.: 141-143). Martin ve a las figuras de Bacon «luchando por afirmarse dentro de estructuras semejantes a jaulas» (Martin, 2014: 84); en</w:t>
-      </w:r>
-      <w:r>
-        <w:t xml:space="preserve"> </w:t>
-      </w:r>
-      <w:r>
-        <w:rPr>
-          <w:i/>
-          <w:iCs/>
-        </w:rPr>
-        <w:t xml:space="preserve">Altiplano</w:t>
-      </w:r>
-      <w:r>
-        <w:t xml:space="preserve">, la jaula es literal. Abajo, Condori hace el trabajo del ayllu: acarrea cascotes para abrir «un boquete» hacia el plano «450» (Botelho Gosálvez, 1982 [1945]: 144). La galería invierte la chujlla: la masa se excava y un armazón de madera la contiene, pero en el «450», que «se derrumbaba en algunos pasos», «recién ponían el revestimiento de callapos» (ibid.: 145). Cuando la galería se inunda, la empresa baja «rieles, maderos, dinamita, hombres» (ibid.: 151): la materia, «especialmente la carne humana, está sometida a la maquinaria» (Martin, 2014: 25). El agua mide el cuerpo —tobillos, rodillas, cintura, ombligo (Botelho Gosálvez, 1982 [1945]: 145, 152-153)— y, cuando Condori intenta retroceder, el ingeniero Williams «le abrió un boquete en la cabeza» (ibid.: 153): el sustantivo de la roca. Luego «quebróse la viga del techo» —cede el armazón y la masa recobra su peso—, el derrumbe sepulta a todos y «nadie sospechó el crimen» (ibid.: 154). La mina es una heterotopía, capaz de «yuxtaponer en un solo lugar real varios espacios» (Foucault, 1986 [1967]: 25, cit. en Martin, 2014: 137): la cosecha, la tumba, la gruta de la Virgen (Botelho Gosálvez, 1982 [1945]: 136), las ofrendas a los dioses de la mina (ibid.: 149) y unos jardines de salitre (ibid.: 135) que compensan con su orden el desorden del mundo (Foucault, 1986 [1967]: 27, cit. en Martin, 2014: 138).</w:t>
+        <w:t xml:space="preserve">La mina «Pensylvania», de la compañía yanqui The Star Syndicate, se anuncia con «el encaje de acero de la torre de un andarivel» (Botelho Gosálvez, 1982 [1945]: 134-135). El campamento reproduce la escalera, de los chalets de ingenieros al «enjambre de cuchitriles de calamina» de los mineros (ibid.: 135). La empresa inscribe a Condori —«Tomaron su identidad e impresiones digitales» (ibid.: 140)— y la mano del comunario entra en el archivo como huella: es su primera firma, y el peón es legible antes de bajar. El capataz le anuncia el retorno de la cosecha: «Aquí cosecharás miles de cargas de estaño» (ibid.: 142).</w:t>
+      </w:r>
+    </w:p>
+    <w:p>
+      <w:pPr>
+        <w:pStyle w:val="BodyText"/>
+      </w:pPr>
+      <w:r>
+        <w:t xml:space="preserve">Se baja en jaula: en la entrada, los huecos de las jaulas se miran en el muro «como dos enormes nichos», y en una de ellas siete hombres van «apeñuscados contra la rejilla» (ibid.: 141-143). Abajo, Condori hace el trabajo del ayllu: acarrea cascotes para abrir «un boquete» hacia el plano «450» (ibid.: 144). La galería invierte la chujlla: la masa se excava y un armazón de madera la contiene, pero en el «450», que «se derrumbaba en algunos pasos», «recién ponían el revestimiento de callapos» (ibid.: 145). Cuando la galería se inunda, la empresa baja «rieles, maderos, dinamita, hombres» (ibid.: 151). El agua mide el cuerpo —tobillos, rodillas, cintura, ombligo (ibid.: 145, 152-153)— y, cuando Condori intenta retroceder, el ingeniero Williams «le abrió un boquete en la cabeza» (ibid.: 153): el sustantivo de la roca. Luego «quebróse la viga del techo» —cede el armazón y la masa recobra su peso—, el derrumbe sepulta a todos y «nadie sospechó el crimen» (ibid.: 154). La mina junta así la cosecha, la tumba, la gruta de la Virgen (ibid.: 136) y las ofrendas a sus dioses (ibid.: 149).</w:t>
       </w:r>
     </w:p>
     <w:p>
@@ -2148,17 +2148,17 @@
         <w:t xml:space="preserve">Operación</w:t>
       </w:r>
       <w:r>
-        <w:t xml:space="preserve">. Formato vertical: arriba, la torre incidida como encaje y el desmonte por el que se entra a la mina (ibid.: 140); debajo, el pique y los niveles «300», «350» y «450», pisos de un edificio invertido; los siete cuerpos de la jaula, hechos con el dedo, sin línea, y la rejilla esgrafiada encima, como el marco que, en la lectura que Martin hace de Deleuze, «ejerce una fuerza sobre la figura central, aislando un cuerpo suspendido» (Martin, 2014: 85); al fondo, pastel disuelto que sube por los cuerpos como el agua. (3)</w:t>
-      </w:r>
-      <w:r>
-        <w:t xml:space="preserve"> </w:t>
-      </w:r>
-      <w:r>
-        <w:rPr>
-          <w:i/>
-          <w:iCs/>
-        </w:rPr>
-        <w:t xml:space="preserve">Hallazgo</w:t>
+        <w:t xml:space="preserve">. Formato vertical: arriba, la torre incidida como encaje y el desmonte por el que se entra a la mina (ibid.: 140); debajo, el pique y los niveles, pisos de un edificio invertido; los siete cuerpos de la jaula, hechos con el dedo, sin línea, y la rejilla esgrafiada encima, como el marco que, en la lectura que Martin hace de Deleuze, «ejerce una fuerza sobre la figura central, aislando un cuerpo suspendido» (Martin, 2014: 85); al fondo, pastel disuelto que sube por los cuerpos como el agua. (3)</w:t>
+      </w:r>
+      <w:r>
+        <w:t xml:space="preserve"> </w:t>
+      </w:r>
+      <w:r>
+        <w:rPr>
+          <w:i/>
+          <w:iCs/>
+        </w:rPr>
+        <w:t xml:space="preserve">Contraste</w:t>
       </w:r>
       <w:r>
         <w:t xml:space="preserve">. Superpuestas, la escalera de la superficie y los niveles subterráneos muestran la mina como doble invertido del ayllu: el mismo gesto —despejar y apilar piedras— capturado por una máquina que lo vuelve mercancía y vuelve material al cuerpo. La montaña de piedras soñada más alta que el cerro (Botelho Gosálvez, 1982 [1945]: 9) crece, pero como desmonte: el cascote se iza «a la superficie» (ibid.: 144).</w:t>
@@ -2251,15 +2251,15 @@
         <w:pStyle w:val="FirstParagraph"/>
       </w:pPr>
       <w:r>
-        <w:t xml:space="preserve">La sequía se narra con vocabulario de arquitectura y de dibujo: las sementeras «se agrietan como paredes envejecidas» (Botelho Gosálvez, 1982 [1945]: 56); «Ni una pincelada enturbió el papel celeste y deslumbrador del cielo» (ibid.: 57). En la rogativa, los comunarios avanzan de rodillas y su piel sangrante deja «manchones en el cascajo» (ibid.: 60): los cuerpos dibujan sobre el suelo. Pronto, «cielo y tierra eran para ellos como una tremenda cárcel» (ibid.: 72). Martin encuentra en Bacon y en Lynch «la idea de la humanidad como un animal enjaulado en un entorno ilimitado» (Martin, 2014: 85): la llanura sin límite se vuelve jaula, y el cerco se cerrará alrededor de un hombre.</w:t>
-      </w:r>
-    </w:p>
-    <w:p>
-      <w:pPr>
-        <w:pStyle w:val="BodyText"/>
-      </w:pPr>
-      <w:r>
-        <w:t xml:space="preserve">El yatiri Basilio Quispe es acusado de la sequía; de sus ropas caen «dos muñequitos de lana» atravesados por una espina (Botelho Gosálvez, 1982 [1945]: 67). Justina Huanca lo araña «como la fiera y brava hembra del puma» y «los indios le descuartizaron» (ibid.: 68). El narrador anota «un ardor bestial» y cierra con una dispersión: «cada cual se llevó un miembro»; Justina atraviesa con espinos los genitales del muerto, «sintiendo en lo íntimo de su conciencia de hembra» la venganza, y «en muchos sitios enterraron los pedazos del cuerpo» (ibid.: 69). Tres lecturas se superponen. La de Alberti, invertida: el cuerpo, edificio de miembros «unidos y articulados», se descompone y se reparte en el territorio. La de Bacon: en</w:t>
+        <w:t xml:space="preserve">La sequía se narra con vocabulario de arquitectura y de dibujo: las sementeras «se agrietan como paredes envejecidas» (Botelho Gosálvez, 1982 [1945]: 56); «Ni una pincelada enturbió el papel celeste y deslumbrador del cielo» (ibid.: 57). En la rogativa, los comunarios avanzan de rodillas y su piel sangrante deja «manchones en el cascajo» (ibid.: 60): los cuerpos dibujan sobre el suelo. Pronto, «cielo y tierra eran para ellos como una tremenda cárcel» (ibid.: 72): la llanura sin límite se vuelve jaula, y el cerco se cerrará alrededor de un hombre.</w:t>
+      </w:r>
+    </w:p>
+    <w:p>
+      <w:pPr>
+        <w:pStyle w:val="BodyText"/>
+      </w:pPr>
+      <w:r>
+        <w:t xml:space="preserve">El yatiri Basilio Quispe es acusado de la sequía; de sus ropas caen «dos muñequitos de lana» atravesados por una espina (Botelho Gosálvez, 1982 [1945]: 67). Justina Huanca lo araña «como la fiera y brava hembra del puma» y «los indios le descuartizaron» (ibid.: 68). El narrador anota «un ardor bestial» y cierra con una dispersión: «cada cual se llevó un miembro»; Justina atraviesa con espinos los genitales del muerto, «sintiendo en lo íntimo de su conciencia de hembra» la venganza, y «en muchos sitios enterraron los pedazos del cuerpo» (ibid.: 69). Dos lecturas se superponen. La de Bacon: en</w:t>
       </w:r>
       <w:r>
         <w:t xml:space="preserve"> </w:t>
@@ -2275,7 +2275,7 @@
         <w:t xml:space="preserve"> </w:t>
       </w:r>
       <w:r>
-        <w:t xml:space="preserve">(1965), dos jueces examinan «las manipulaciones de la carne» (Martin, 2014: 85), como la comunidad y el lector ante la de Basilio, y la escena da la impresión de que «una catástrofe sobrevino al lienzo» (Deleuze, 2003 [1981]: 100, cit. en Martin, 2014: 84). Y la de la</w:t>
+        <w:t xml:space="preserve">(1965), dos jueces examinan «las manipulaciones de la carne» (Martin, 2014: 85), como la comunidad y el lector ante la de Basilio. Y la de la</w:t>
       </w:r>
       <w:r>
         <w:t xml:space="preserve"> </w:t>
@@ -2365,10 +2365,26 @@
           <w:i/>
           <w:iCs/>
         </w:rPr>
-        <w:t xml:space="preserve">Hallazgo</w:t>
-      </w:r>
-      <w:r>
-        <w:t xml:space="preserve">. Que la tierra sea femenina no es invención del narrador: en la creencia andina, la Pachamama es femenina y las montañas suelen ser masculinas (Dean, 2010: 68), como el cerro «padre del ayllu» (Botelho Gosálvez, 1982 [1945]: 8). Suyo es el registro: tierra que «abortó en plena gestación» (ibid.: 66) y, al final, «hembra paridora» (ibid.: 159); hasta el ayllu vacío es un «solar histérico, infecundo» (ibid.: 79), de</w:t>
+        <w:t xml:space="preserve">Contraste</w:t>
+      </w:r>
+      <w:r>
+        <w:t xml:space="preserve">. Que la tierra sea madre no es invención del narrador: para Bertonio,</w:t>
+      </w:r>
+      <w:r>
+        <w:t xml:space="preserve"> </w:t>
+      </w:r>
+      <w:r>
+        <w:rPr>
+          <w:i/>
+          <w:iCs/>
+        </w:rPr>
+        <w:t xml:space="preserve">Pachamama</w:t>
+      </w:r>
+      <w:r>
+        <w:t xml:space="preserve"> </w:t>
+      </w:r>
+      <w:r>
+        <w:t xml:space="preserve">era «nombre de reverencia», y se le decía «yo seré tu hijo» (Bertonio, 2011 [1612]: 420); las montañas, en cambio, suelen ser masculinas (Dean, 2010: 68), como el cerro «padre del ayllu» (Botelho Gosálvez, 1982 [1945]: 8). Suyo es el registro: tierra que «abortó en plena gestación» (ibid.: 66) y, al final, «hembra paridora» (ibid.: 159); hasta el ayllu vacío es un «solar histérico, infecundo» (ibid.: 79), de</w:t>
       </w:r>
       <w:r>
         <w:t xml:space="preserve"> </w:t>
@@ -2530,10 +2546,23 @@
           <w:i/>
           <w:iCs/>
         </w:rPr>
-        <w:t xml:space="preserve">Hallazgo</w:t>
-      </w:r>
-      <w:r>
-        <w:t xml:space="preserve">. El narrador llama a los vigías «cancerberos» y «muertos en vida» (ibid.), pero también «celadores y enfermeros» (ibid.: 79). Trazados como mojones, muestran la resistencia no como gesta —el discurso de Braulio fracasa—, sino como mantenimiento: quedarse, guardar, cuidar, un trabajo que hace el escalón más bajo del Signo en la casa del más alto. Anticipa así el final, donde otra atalaya, «la atalaya de la esperanza» (ibid.: 157), se negará a mirar hacia abajo.</w:t>
+        <w:t xml:space="preserve">Contraste</w:t>
+      </w:r>
+      <w:r>
+        <w:t xml:space="preserve">. El narrador llama a los vigías «cancerberos» y «muertos en vida» (ibid.), pero también «celadores y enfermeros» (ibid.: 79). El esquema los traza como mojones, decisión que el aymara respalda y el texto no:</w:t>
+      </w:r>
+      <w:r>
+        <w:t xml:space="preserve"> </w:t>
+      </w:r>
+      <w:r>
+        <w:rPr>
+          <w:i/>
+          <w:iCs/>
+        </w:rPr>
+        <w:t xml:space="preserve">achachi</w:t>
+      </w:r>
+      <w:r>
+        <w:t xml:space="preserve">, que el glosario traduce por «anciano» (ibid.: 160), es también «la cepa de una casa o familia» y el «término o mojón de las tierras» (Bertonio, 2011 [1612]: 307). Partidos los achachis que decidieron el éxodo, los sin tierra quedan como mojones del ayllu vacío: la resistencia no es gesta —el discurso de Braulio fracasa—, sino mantenimiento, un trabajo que hace el escalón más bajo del Signo en la casa del más alto.</w:t>
       </w:r>
     </w:p>
     <w:p>
@@ -2636,7 +2665,20 @@
         <w:t xml:space="preserve">Compuestas</w:t>
       </w:r>
       <w:r>
-        <w:t xml:space="preserve">: la composición de partes que la tratadística reservó al arquitecto reaparece como faena comunal. Y como ya no hay bueyes, «los mismos hombres eran quienes tiraban el arado» (ibid.): el cuerpo entero ocupa el lugar del animal muerto. El narrador vuelve a petrificar: trabajan «con una voluntad de siglos de piedra» (ibid.), la piedra de Worringer, no la de las</w:t>
+        <w:t xml:space="preserve">: la composición que la tratadística reservó al arquitecto reaparece como faena comunal, y recomponer la pirca es volver a amojonar,</w:t>
+      </w:r>
+      <w:r>
+        <w:t xml:space="preserve"> </w:t>
+      </w:r>
+      <w:r>
+        <w:rPr>
+          <w:i/>
+          <w:iCs/>
+        </w:rPr>
+        <w:t xml:space="preserve">saywaña</w:t>
+      </w:r>
+      <w:r>
+        <w:t xml:space="preserve">: «mojonar las chácaras con montones de piedra» (Bertonio, 2011 [1612]: 466). Y como ya no hay bueyes, «los mismos hombres eran quienes tiraban el arado» (Botelho Gosálvez, 1982 [1945]: 156): el cuerpo entero ocupa el lugar del animal muerto. El narrador vuelve a petrificar: trabajan «con una voluntad de siglos de piedra» (ibid.), la piedra de Worringer, no la de las</w:t>
       </w:r>
       <w:r>
         <w:t xml:space="preserve"> </w:t>
@@ -2681,7 +2723,7 @@
         <w:pStyle w:val="BodyText"/>
       </w:pPr>
       <w:r>
-        <w:t xml:space="preserve">Ursula K. Le Guin opuso dos ficciones. La del arma tiene la forma de la flecha, que «comienza aquí y va recta hacia allí y ¡ZAS! da en su blanco (que cae muerto)»; la del recipiente, la de la bolsa: «Una novela es un botiquín, que contiene cosas en una relación particular, poderosa, entre sí, y con nosotros» (Le Guin, 2021 [1986]: 10). La mina es la ficción del arma: jornal doblado, propina, avance, revólver, boquete. El ayllu del retorno es la del acopio: la casa, «un recipiente para personas» (ibid.: 8), vuelve a guardar la cosecha y a reunir los nombres. Pero todo recipiente selecciona —el pesebre fue tumba; el ayllu reparado deja fuera a los sin tierra—, y el narrador cierra con héroes: los derrotados vuelven a ser «los patriarcas fecundadores del suelo, los sembradores del destino» (Botelho Gosálvez, 1982 [1945]: 159). El héroe, advierte Le Guin, no cabe en la bolsa: «Necesita un escenario, o un pedestal, o una cima» (Le Guin, 2021 [1986]: 11). Aquí, la atalaya. La novela, que guarda lo que el ayllu prefiere no mirar, es el recipiente más amplio.</w:t>
+        <w:t xml:space="preserve">Ursula K. Le Guin opuso la ficción del arma, con forma de flecha, a la del recipiente: «Una novela es un botiquín, que contiene cosas en una relación particular, poderosa, entre sí, y con nosotros» (Le Guin, 2021 [1986]: 10). La mina es la ficción del arma: jornal, revólver, boquete. El ayllu del retorno es la del acopio: la casa, «un recipiente para personas» (ibid.: 8), vuelve a guardar la cosecha y a reunir los nombres. Pero todo recipiente selecciona —el pesebre fue tumba; el ayllu reparado deja fuera a los sin tierra—, y el narrador cierra con héroes: los derrotados vuelven a ser «los patriarcas fecundadores del suelo, los sembradores del destino» (Botelho Gosálvez, 1982 [1945]: 159). El héroe, advierte Le Guin, no cabe en la bolsa: «Necesita un escenario, o un pedestal, o una cima» (Le Guin, 2021 [1986]: 11). Aquí, la atalaya. La novela, que guarda lo que el ayllu prefiere no mirar, es el recipiente más amplio.</w:t>
       </w:r>
     </w:p>
     <w:bookmarkEnd w:id="35"/>
@@ -2699,7 +2741,7 @@
         <w:pStyle w:val="FirstParagraph"/>
       </w:pPr>
       <w:r>
-        <w:t xml:space="preserve">La lectura permite sostener cuatro hallazgos. Primero: el montón de piedras es la arquitectura mínima de la novela, estereotomía sin edificio, y la cosecha de estaño que promete el capataz (Botelho Gosálvez, 1982 [1945]: 142) es la captura de ese gesto por la máquina. Segundo: el Signo Escalonado es un operador recursivo que ayllu, aldea, cocal y campamento vuelven a escalonar, y el retorno rehace la escalera sin su último escalón. Tercero: el despojo opera mediante una red de personas, instituciones y soportes —expediente, papel sellado, firma, radio urbano, infolio, huella dactilar— que vuelven legibles la tierra y los cuerpos; la oposición entre la mano y el papel es el discurso de la aldea, no la evidencia del texto. Cuarto: el narrador que denuncia el despojo animaliza, sexualiza y petrifica a sus víctimas —con una piedra abstracta, ajena a la</w:t>
+        <w:t xml:space="preserve">La lectura permite sostener cuatro hallazgos. Primero: el montón de piedras es la arquitectura mínima de la novela, estereotomía sin edificio, y la cosecha de estaño que promete el capataz (Botelho Gosálvez, 1982 [1945]: 142) es la captura de ese gesto por la máquina. Segundo: el Signo Escalonado es un operador recursivo que ayllu, aldea, cocal y campamento vuelven a escalonar, y el retorno rehace la escalera sin su último escalón. Tercero: el despojo opera mediante una red de personas, instituciones y soportes —expediente, papel sellado, radio urbano, infolio, huella dactilar— que vuelven legibles la tierra y los cuerpos; la oposición entre la mano y el papel es el discurso de la aldea, y la novela la confirma al callar el uso indio de la letra: títulos coloniales, tinterillos aliados, escuela del ayllu. Cuarto: el narrador que petrifica —con una piedra abstracta, ajena a la</w:t>
       </w:r>
       <w:r>
         <w:t xml:space="preserve"> </w:t>
@@ -2712,15 +2754,15 @@
         <w:t xml:space="preserve">wank’a</w:t>
       </w:r>
       <w:r>
-        <w:t xml:space="preserve">— y culmina su asimetría de género en la muchacha sin nombre.</w:t>
-      </w:r>
-    </w:p>
-    <w:p>
-      <w:pPr>
-        <w:pStyle w:val="BodyText"/>
-      </w:pPr>
-      <w:r>
-        <w:t xml:space="preserve">¿Qué desvela el dibujo? Ante todo, posiciones. Dibujar obliga a decidir lo que el texto deja abierto —desde dónde se mira, a qué escala, qué queda dentro y qué fuera—, y cada decisión expone la del narrador: fuera de la chujlla, en la tribuna del linchamiento, frente a las cumbres góticas. Las operaciones del pastel —acumular, extraer, manchar, incidir, disolver— repiten las que la novela ejerce sobre la materia: amontonar, despejar, pintar «manchones» (ibid.: 60, 156), escribir, derretirse. Leer con la mano no es ilustrar escenas, sino repetir operaciones; eso llamamos manuaje de la lectura, háptico como la prosa que lee. La formatividad advierte, con todo, que ningún esquema agota lo que la materia decide.</w:t>
+        <w:t xml:space="preserve">— y culmina su asimetría de género en la muchacha sin nombre vuelve paisaje una posesión que la novela, a sus espaldas, inscribe en la piedra: mojones, pircas, linderos, un apellido.</w:t>
+      </w:r>
+    </w:p>
+    <w:p>
+      <w:pPr>
+        <w:pStyle w:val="BodyText"/>
+      </w:pPr>
+      <w:r>
+        <w:t xml:space="preserve">¿Qué desvela el dibujo? Ante todo, posiciones. Los esquemas obligan a decidir lo que el texto deja abierto —desde dónde se mira, a qué escala, qué queda dentro y qué fuera—, y cada decisión expone la del narrador: fuera de la chujlla, en la tribuna del linchamiento, frente a las cumbres góticas. Cuando la decisión es del dibujante, como el cráneo o los mojones, el contraste con el texto y con el léxico aymara dice si se sostiene. Las operaciones del pastel —acumular, extraer, manchar, incidir, disolver— repiten las de la novela: amontonar, despejar, pintar «manchones» (ibid.: 60, 156), escribir, derretirse. Leer con la mano no es ilustrar escenas, sino repetir operaciones: un manuaje de la lectura, háptico como la prosa que lee.</w:t>
       </w:r>
     </w:p>
     <w:p>
@@ -2741,7 +2783,7 @@
         <w:t xml:space="preserve">capriccio</w:t>
       </w:r>
       <w:r>
-        <w:t xml:space="preserve">, Bacon, la tectónica de Semper y hasta la pelvis son estructuras visuales ajenas al mundo narrado; los dibujos hablan de la novela, no del ayllu ni de la espacialidad aymara, que exigirían otras fuentes y otros interlocutores. El segundo es ético: la inmersión seduce, y un pastel puede estetizar la miseria o fabricar efigies; de ahí la decisión de no dibujar el linchamiento ni los sueños que el narrador declara inaccesibles. El tercero es de método: el dibujo depende de las coordenadas del texto y hereda sus silencios; puede volverlos visibles, no suplirlos.</w:t>
+        <w:t xml:space="preserve">, Bacon, la tectónica de Semper y hasta la pelvis son estructuras visuales ajenas al mundo narrado; los dibujos hablan de la novela, no del ayllu ni de la espacialidad aymara, que exigirían otras fuentes y otra autoría: la de la historia que los aymaras, escribía Roberto Choque Canqui, «hace tiempo, hemos añorado por escribir» (Choque Canqui, 1978 [1974]: s. p.). El segundo es ético: la inmersión seduce, y un pastel puede estetizar la miseria o fabricar efigies; de ahí la decisión de no dibujar el linchamiento ni los sueños que el narrador declara inaccesibles. El tercero es de método: el dibujo depende de las coordenadas del texto y hereda sus silencios; puede volverlos visibles, no suplirlos.</w:t>
       </w:r>
     </w:p>
     <w:p>
@@ -2793,7 +2835,7 @@
         <w:t xml:space="preserve"> </w:t>
       </w:r>
       <w:r>
-        <w:t xml:space="preserve">El autor ⟦o la autora⟧ declara no tener conflictos de intereses.</w:t>
+        <w:t xml:space="preserve">El autor declara no tener conflictos de intereses.</w:t>
       </w:r>
     </w:p>
     <w:p>
@@ -2824,7 +2866,7 @@
         <w:t xml:space="preserve">Herramientas</w:t>
       </w:r>
       <w:r>
-        <w:t xml:space="preserve">: ChatGPT (OpenAI), ⟦versión⟧, y Claude (Anthropic), ⟦versión⟧, asistentes de inteligencia artificial generativa. b)</w:t>
+        <w:t xml:space="preserve">: Claude (Anthropic) y ChatGPT (OpenAI), asistentes de inteligencia artificial generativa. b)</w:t>
       </w:r>
       <w:r>
         <w:t xml:space="preserve"> </w:t>
@@ -2837,7 +2879,7 @@
         <w:t xml:space="preserve">Alcance</w:t>
       </w:r>
       <w:r>
-        <w:t xml:space="preserve">: ChatGPT se empleó en la revisión conceptual del proyecto, el contraste de pasajes, la organización del argumento y el apoyo a la redacción ⟦ajustar⟧; Claude, en la lectura asistida de las fuentes, la localización y verificación de citas con su página, la redacción de borradores, el diseño del protocolo de dibujo y la elaboración de los esquemas de encaje reproducidos en las figuras 1 a 6 ⟦ajustar⟧. c)</w:t>
+        <w:t xml:space="preserve">: se emplearon en la exploración bibliográfica, la transcripción y paginación de fuentes digitalizadas, la localización y el cotejo de citas con su página, el contraste de pasajes de la novela, la revisión conceptual y la redacción de borradores, y la codificación vectorial de los esquemas de encaje de las figuras 1 a 6. c)</w:t>
       </w:r>
       <w:r>
         <w:t xml:space="preserve"> </w:t>
@@ -2850,7 +2892,7 @@
         <w:t xml:space="preserve">Rol</w:t>
       </w:r>
       <w:r>
-        <w:t xml:space="preserve">: el autor ⟦o la autora⟧ formuló el problema, el esquema del artículo y las cautelas críticas; decidió las interpretaciones; es autor ⟦o autora⟧ de los pasteles al óleo; revisó y reescribió los borradores, verificó las citas contra los originales y responde por la versión final.</w:t>
+        <w:t xml:space="preserve">: el autor concibió la hipótesis original, diseñó la metodología de lectura tectónica, seleccionó las fuentes, decidió las interpretaciones, dirigió y revisó la redacción y es autor exclusivo de los pasteles al óleo que sustentan la investigación; asume la plena responsabilidad intelectual por la versión final del manuscrito.</w:t>
       </w:r>
     </w:p>
     <w:bookmarkEnd w:id="37"/>
@@ -2910,6 +2952,48 @@
         <w:pStyle w:val="BodyText"/>
       </w:pPr>
       <w:r>
+        <w:t xml:space="preserve">Barnadas, Josep M. (1978 [1975]).</w:t>
+      </w:r>
+      <w:r>
+        <w:t xml:space="preserve"> </w:t>
+      </w:r>
+      <w:r>
+        <w:rPr>
+          <w:i/>
+          <w:iCs/>
+        </w:rPr>
+        <w:t xml:space="preserve">Apuntes para una historia aymara</w:t>
+      </w:r>
+      <w:r>
+        <w:t xml:space="preserve">. 2.ª ed. La Paz: CIPCA (Cuadernos de Investigación, 6).</w:t>
+      </w:r>
+    </w:p>
+    <w:p>
+      <w:pPr>
+        <w:pStyle w:val="BodyText"/>
+      </w:pPr>
+      <w:r>
+        <w:t xml:space="preserve">Bertonio, Ludovico (2011 [1612]).</w:t>
+      </w:r>
+      <w:r>
+        <w:t xml:space="preserve"> </w:t>
+      </w:r>
+      <w:r>
+        <w:rPr>
+          <w:i/>
+          <w:iCs/>
+        </w:rPr>
+        <w:t xml:space="preserve">Transcripción del vocabulario de la lengua aymara</w:t>
+      </w:r>
+      <w:r>
+        <w:t xml:space="preserve">. La Paz: Radio San Gabriel (1993) e ILLA-A (ed. digital).</w:t>
+      </w:r>
+    </w:p>
+    <w:p>
+      <w:pPr>
+        <w:pStyle w:val="BodyText"/>
+      </w:pPr>
+      <w:r>
         <w:t xml:space="preserve">Botelho Gosálvez, Raúl (1982 [1945]).</w:t>
       </w:r>
       <w:r>
@@ -3021,6 +3105,36 @@
         <w:pStyle w:val="BodyText"/>
       </w:pPr>
       <w:r>
+        <w:t xml:space="preserve">Choque Canqui, Roberto (1978 [1974]).</w:t>
+      </w:r>
+      <w:r>
+        <w:t xml:space="preserve"> </w:t>
+      </w:r>
+      <w:r>
+        <w:t xml:space="preserve">“Prólogo”</w:t>
+      </w:r>
+      <w:r>
+        <w:t xml:space="preserve">. En Josep M. Barnadas,</w:t>
+      </w:r>
+      <w:r>
+        <w:t xml:space="preserve"> </w:t>
+      </w:r>
+      <w:r>
+        <w:rPr>
+          <w:i/>
+          <w:iCs/>
+        </w:rPr>
+        <w:t xml:space="preserve">Apuntes para una historia aymara</w:t>
+      </w:r>
+      <w:r>
+        <w:t xml:space="preserve">. 2.ª ed. La Paz: CIPCA: s. p.</w:t>
+      </w:r>
+    </w:p>
+    <w:p>
+      <w:pPr>
+        <w:pStyle w:val="BodyText"/>
+      </w:pPr>
+      <w:r>
         <w:t xml:space="preserve">Colomina, Beatriz (1992).</w:t>
       </w:r>
       <w:r>
@@ -3051,41 +3165,20 @@
         <w:pStyle w:val="BodyText"/>
       </w:pPr>
       <w:r>
-        <w:t xml:space="preserve">Colomina, Beatriz (1994).</w:t>
-      </w:r>
-      <w:r>
-        <w:t xml:space="preserve"> </w:t>
-      </w:r>
-      <w:r>
-        <w:rPr>
-          <w:i/>
-          <w:iCs/>
-        </w:rPr>
-        <w:t xml:space="preserve">Privacy and Publicity: Modern Architecture as Mass Media</w:t>
-      </w:r>
-      <w:r>
-        <w:t xml:space="preserve">. Cambridge, MA: MIT Press.</w:t>
-      </w:r>
-    </w:p>
-    <w:p>
-      <w:pPr>
-        <w:pStyle w:val="BodyText"/>
-      </w:pPr>
-      <w:r>
-        <w:t xml:space="preserve">Corona Martínez, Alfonso (2009 [1990]).</w:t>
-      </w:r>
-      <w:r>
-        <w:t xml:space="preserve"> </w:t>
-      </w:r>
-      <w:r>
-        <w:rPr>
-          <w:i/>
-          <w:iCs/>
-        </w:rPr>
-        <w:t xml:space="preserve">Ensayo sobre el proyecto</w:t>
-      </w:r>
-      <w:r>
-        <w:t xml:space="preserve">. Buenos Aires: Nobuko.</w:t>
+        <w:t xml:space="preserve">Cornejo Polar, Antonio (2003 [1994]).</w:t>
+      </w:r>
+      <w:r>
+        <w:t xml:space="preserve"> </w:t>
+      </w:r>
+      <w:r>
+        <w:rPr>
+          <w:i/>
+          <w:iCs/>
+        </w:rPr>
+        <w:t xml:space="preserve">Escribir en el aire. Ensayo sobre la heterogeneidad socio-cultural en las literaturas andinas</w:t>
+      </w:r>
+      <w:r>
+        <w:t xml:space="preserve">. 2.ª ed. Lima y Berkeley: CELACP y Latinoamericana Editores.</w:t>
       </w:r>
     </w:p>
     <w:p>
@@ -3114,50 +3207,29 @@
         <w:pStyle w:val="BodyText"/>
       </w:pPr>
       <w:r>
-        <w:t xml:space="preserve">Deleuze, Gilles (2003 [1981]).</w:t>
-      </w:r>
-      <w:r>
-        <w:t xml:space="preserve"> </w:t>
-      </w:r>
-      <w:r>
-        <w:rPr>
-          <w:i/>
-          <w:iCs/>
-        </w:rPr>
-        <w:t xml:space="preserve">Francis Bacon: The Logic of Sensation</w:t>
-      </w:r>
-      <w:r>
-        <w:t xml:space="preserve">. Trad. Daniel W. Smith. Londres: Continuum.</w:t>
-      </w:r>
-    </w:p>
-    <w:p>
-      <w:pPr>
-        <w:pStyle w:val="BodyText"/>
-      </w:pPr>
-      <w:r>
-        <w:t xml:space="preserve">Foucault, Michel (1986 [1967]).</w:t>
-      </w:r>
-      <w:r>
-        <w:t xml:space="preserve"> </w:t>
-      </w:r>
-      <w:r>
-        <w:t xml:space="preserve">“Of Other Spaces”</w:t>
-      </w:r>
-      <w:r>
-        <w:t xml:space="preserve">. Trad. Jay Miskowiec.</w:t>
-      </w:r>
-      <w:r>
-        <w:t xml:space="preserve"> </w:t>
-      </w:r>
-      <w:r>
-        <w:rPr>
-          <w:i/>
-          <w:iCs/>
-        </w:rPr>
-        <w:t xml:space="preserve">Diacritics</w:t>
-      </w:r>
-      <w:r>
-        <w:t xml:space="preserve">, 16(1): 22-27.</w:t>
+        <w:t xml:space="preserve">Duviols, Pierre (1979).</w:t>
+      </w:r>
+      <w:r>
+        <w:t xml:space="preserve"> </w:t>
+      </w:r>
+      <w:r>
+        <w:t xml:space="preserve">“Un symbolisme de l’occupation, de l’aménagement et de l’exploitation de l’espace: le monolithe «huanca» et sa fonction dans les Andes préhispaniques”</w:t>
+      </w:r>
+      <w:r>
+        <w:t xml:space="preserve">.</w:t>
+      </w:r>
+      <w:r>
+        <w:t xml:space="preserve"> </w:t>
+      </w:r>
+      <w:r>
+        <w:rPr>
+          <w:i/>
+          <w:iCs/>
+        </w:rPr>
+        <w:t xml:space="preserve">L’Homme</w:t>
+      </w:r>
+      <w:r>
+        <w:t xml:space="preserve">, 19(2): 7-31.</w:t>
       </w:r>
     </w:p>
     <w:p>
@@ -3249,6 +3321,27 @@
         <w:pStyle w:val="BodyText"/>
       </w:pPr>
       <w:r>
+        <w:t xml:space="preserve">Ingold, Tim (2013).</w:t>
+      </w:r>
+      <w:r>
+        <w:t xml:space="preserve"> </w:t>
+      </w:r>
+      <w:r>
+        <w:rPr>
+          <w:i/>
+          <w:iCs/>
+        </w:rPr>
+        <w:t xml:space="preserve">Making: Anthropology, Archaeology, Art and Architecture</w:t>
+      </w:r>
+      <w:r>
+        <w:t xml:space="preserve">. Londres y Nueva York: Routledge.</w:t>
+      </w:r>
+    </w:p>
+    <w:p>
+      <w:pPr>
+        <w:pStyle w:val="BodyText"/>
+      </w:pPr>
+      <w:r>
         <w:t xml:space="preserve">Lefebvre, Henri (1991 [1974]).</w:t>
       </w:r>
       <w:r>
@@ -3380,25 +3473,76 @@
         <w:pStyle w:val="BodyText"/>
       </w:pPr>
       <w:r>
-        <w:t xml:space="preserve">Salazar Sánchez, Cristian Gonzalo y Cárcamo Pino, Mauricio Arnoldo (2021).</w:t>
-      </w:r>
-      <w:r>
-        <w:t xml:space="preserve"> </w:t>
-      </w:r>
-      <w:r>
-        <w:t xml:space="preserve">“Acerca del</w:t>
-      </w:r>
-      <w:r>
-        <w:t xml:space="preserve"> </w:t>
-      </w:r>
-      <w:r>
-        <w:t xml:space="preserve">‘lenguaje’</w:t>
-      </w:r>
-      <w:r>
-        <w:t xml:space="preserve"> </w:t>
-      </w:r>
-      <w:r>
-        <w:t xml:space="preserve">de las manos (manuaje). Una conversación con Mauricio Cárcamo”</w:t>
+        <w:t xml:space="preserve">Rivera Cusicanqui, Silvia (2010 [1984]).</w:t>
+      </w:r>
+      <w:r>
+        <w:t xml:space="preserve"> </w:t>
+      </w:r>
+      <w:r>
+        <w:rPr>
+          <w:i/>
+          <w:iCs/>
+        </w:rPr>
+        <w:t xml:space="preserve">«Oprimidos pero no vencidos». Luchas del campesinado aymara y qhechwa 1900-1980</w:t>
+      </w:r>
+      <w:r>
+        <w:t xml:space="preserve">. 4.ª ed. La Paz: WA-GUI.</w:t>
+      </w:r>
+    </w:p>
+    <w:p>
+      <w:pPr>
+        <w:pStyle w:val="BodyText"/>
+      </w:pPr>
+      <w:r>
+        <w:t xml:space="preserve">Scott, James C. (2020 [1998]).</w:t>
+      </w:r>
+      <w:r>
+        <w:t xml:space="preserve"> </w:t>
+      </w:r>
+      <w:r>
+        <w:rPr>
+          <w:i/>
+          <w:iCs/>
+        </w:rPr>
+        <w:t xml:space="preserve">Seeing Like a State: How Certain Schemes to Improve the Human Condition Have Failed</w:t>
+      </w:r>
+      <w:r>
+        <w:t xml:space="preserve">. New Haven y Londres: Yale University Press.</w:t>
+      </w:r>
+    </w:p>
+    <w:p>
+      <w:pPr>
+        <w:pStyle w:val="BodyText"/>
+      </w:pPr>
+      <w:r>
+        <w:t xml:space="preserve">Seguí de la Riva, Javier (2010).</w:t>
+      </w:r>
+      <w:r>
+        <w:t xml:space="preserve"> </w:t>
+      </w:r>
+      <w:r>
+        <w:rPr>
+          <w:i/>
+          <w:iCs/>
+        </w:rPr>
+        <w:t xml:space="preserve">Ser dibujo</w:t>
+      </w:r>
+      <w:r>
+        <w:t xml:space="preserve">. Madrid: Mairea Libros y Escuela Técnica Superior de Arquitectura de Madrid.</w:t>
+      </w:r>
+    </w:p>
+    <w:p>
+      <w:pPr>
+        <w:pStyle w:val="BodyText"/>
+      </w:pPr>
+      <w:r>
+        <w:t xml:space="preserve">Vázquez Ramos, Fernando Guillermo; Dias Ribeiro, Carlos Eduardo; Quedas Campoy, Carlos y Ferreira de Paula, Franklin Roberto (2023).</w:t>
+      </w:r>
+      <w:r>
+        <w:t xml:space="preserve"> </w:t>
+      </w:r>
+      <w:r>
+        <w:t xml:space="preserve">“Reflexões sobre a construção histórica do conceito de espaço: uma aproximação”</w:t>
       </w:r>
       <w:r>
         <w:t xml:space="preserve">.</w:t>
@@ -3411,108 +3555,6 @@
           <w:i/>
           <w:iCs/>
         </w:rPr>
-        <w:t xml:space="preserve">Arte, Individuo y Sociedad</w:t>
-      </w:r>
-      <w:r>
-        <w:t xml:space="preserve">, 33(4): 1481-1487.</w:t>
-      </w:r>
-    </w:p>
-    <w:p>
-      <w:pPr>
-        <w:pStyle w:val="BodyText"/>
-      </w:pPr>
-      <w:r>
-        <w:t xml:space="preserve">Schmarsow, August (1994 [1893]).</w:t>
-      </w:r>
-      <w:r>
-        <w:t xml:space="preserve"> </w:t>
-      </w:r>
-      <w:r>
-        <w:t xml:space="preserve">“The Essence of Architectural Creation”</w:t>
-      </w:r>
-      <w:r>
-        <w:t xml:space="preserve">. En Harry Francis Mallgrave y Eleftherios Ikonomou (eds.),</w:t>
-      </w:r>
-      <w:r>
-        <w:t xml:space="preserve"> </w:t>
-      </w:r>
-      <w:r>
-        <w:rPr>
-          <w:i/>
-          <w:iCs/>
-        </w:rPr>
-        <w:t xml:space="preserve">Empathy, Form, and Space: Problems in German Aesthetics, 1873-1893</w:t>
-      </w:r>
-      <w:r>
-        <w:t xml:space="preserve">. Los Ángeles: Getty Center for the History of Art and the Humanities: 281-297.</w:t>
-      </w:r>
-    </w:p>
-    <w:p>
-      <w:pPr>
-        <w:pStyle w:val="BodyText"/>
-      </w:pPr>
-      <w:r>
-        <w:t xml:space="preserve">Scott, James C. (2020 [1998]).</w:t>
-      </w:r>
-      <w:r>
-        <w:t xml:space="preserve"> </w:t>
-      </w:r>
-      <w:r>
-        <w:rPr>
-          <w:i/>
-          <w:iCs/>
-        </w:rPr>
-        <w:t xml:space="preserve">Seeing Like a State: How Certain Schemes to Improve the Human Condition Have Failed</w:t>
-      </w:r>
-      <w:r>
-        <w:t xml:space="preserve">. New Haven y Londres: Yale University Press.</w:t>
-      </w:r>
-    </w:p>
-    <w:p>
-      <w:pPr>
-        <w:pStyle w:val="BodyText"/>
-      </w:pPr>
-      <w:r>
-        <w:t xml:space="preserve">Shonfield, Katherine (2000).</w:t>
-      </w:r>
-      <w:r>
-        <w:t xml:space="preserve"> </w:t>
-      </w:r>
-      <w:r>
-        <w:rPr>
-          <w:i/>
-          <w:iCs/>
-        </w:rPr>
-        <w:t xml:space="preserve">Walls Have Feelings: Architecture, Film and the City</w:t>
-      </w:r>
-      <w:r>
-        <w:t xml:space="preserve">. Londres: Routledge.</w:t>
-      </w:r>
-    </w:p>
-    <w:p>
-      <w:pPr>
-        <w:pStyle w:val="BodyText"/>
-      </w:pPr>
-      <w:r>
-        <w:t xml:space="preserve">Vázquez Ramos, Fernando Guillermo; Dias Ribeiro, Carlos Eduardo; Quedas Campoy, Carlos y Ferreira de Paula, Franklin Roberto (2023).</w:t>
-      </w:r>
-      <w:r>
-        <w:t xml:space="preserve"> </w:t>
-      </w:r>
-      <w:r>
-        <w:t xml:space="preserve">“Reflexões sobre a construção histórica do conceito de espaço: uma aproximação”</w:t>
-      </w:r>
-      <w:r>
-        <w:t xml:space="preserve">.</w:t>
-      </w:r>
-      <w:r>
-        <w:t xml:space="preserve"> </w:t>
-      </w:r>
-      <w:r>
-        <w:rPr>
-          <w:i/>
-          <w:iCs/>
-        </w:rPr>
         <w:t xml:space="preserve">Risco. Revista de Pesquisa em Arquitetura e Urbanismo</w:t>
       </w:r>
       <w:r>
@@ -3524,27 +3566,6 @@
         <w:pStyle w:val="BodyText"/>
       </w:pPr>
       <w:r>
-        <w:t xml:space="preserve">Vidler, Anthony (1992).</w:t>
-      </w:r>
-      <w:r>
-        <w:t xml:space="preserve"> </w:t>
-      </w:r>
-      <w:r>
-        <w:rPr>
-          <w:i/>
-          <w:iCs/>
-        </w:rPr>
-        <w:t xml:space="preserve">The Architectural Uncanny: Essays in the Modern Unhomely</w:t>
-      </w:r>
-      <w:r>
-        <w:t xml:space="preserve">. Cambridge, MA: MIT Press.</w:t>
-      </w:r>
-    </w:p>
-    <w:p>
-      <w:pPr>
-        <w:pStyle w:val="BodyText"/>
-      </w:pPr>
-      <w:r>
         <w:t xml:space="preserve">Worringer, Wilhelm (1953 [1908]).</w:t>
       </w:r>
       <w:r>
@@ -3559,6 +3580,27 @@
       </w:r>
       <w:r>
         <w:t xml:space="preserve">. México: Fondo de Cultura Económica.</w:t>
+      </w:r>
+    </w:p>
+    <w:p>
+      <w:pPr>
+        <w:pStyle w:val="BodyText"/>
+      </w:pPr>
+      <w:r>
+        <w:t xml:space="preserve">Zavaleta Mercado, René (1986).</w:t>
+      </w:r>
+      <w:r>
+        <w:t xml:space="preserve"> </w:t>
+      </w:r>
+      <w:r>
+        <w:rPr>
+          <w:i/>
+          <w:iCs/>
+        </w:rPr>
+        <w:t xml:space="preserve">Lo nacional-popular en Bolivia</w:t>
+      </w:r>
+      <w:r>
+        <w:t xml:space="preserve">. México: Siglo XXI.</w:t>
       </w:r>
     </w:p>
     <w:bookmarkEnd w:id="38"/>
@@ -3609,7 +3651,7 @@
         <w:t xml:space="preserve"> </w:t>
       </w:r>
       <w:r>
-        <w:t xml:space="preserve">⟦Formación y grado académico⟧. ⟦Adscripción institucional⟧. ⟦Principales publicaciones⟧. Correo electrónico: ⟦correo⟧. ⟦Ciudad⟧, ⟦país⟧. (Máximo 100 palabras).</w:t>
+        <w:t xml:space="preserve">Joaquin Max Cuevas Ventura es licenciado en Arquitectura por la Universidad Mayor de San Andrés (UMSA) y técnico superior en Diseño Gráfico por el Instituto Técnico Atenea. Ha cursado estudios de postgrado en Gestión BIM en la Universidad Católica Boliviana «San Pablo» y fue coordinador de Arquicinema (FAADU-UMSA). Actualmente se desempeña como diseñador de comunicación visual. Sus áreas de trabajo articulan la espacialidad arquitectónica, la cultura material y la investigación a través del dibujo. Correo electrónico: JoACKo333@gmail.com. La Paz, Bolivia.</w:t>
       </w:r>
     </w:p>
   </w:footnote>
@@ -3628,7 +3670,7 @@
         <w:t xml:space="preserve"> </w:t>
       </w:r>
       <w:r>
-        <w:t xml:space="preserve">Las traducciones de las citas en inglés y en portugués son nuestras.</w:t>
+        <w:t xml:space="preserve">Las traducciones de las citas en inglés, francés y portugués son nuestras.</w:t>
       </w:r>
     </w:p>
   </w:footnote>

</xml_diff>

<commit_message>
Cita Landscape Narratives de Potteiger y Purinton
- §1: las narraciones «residen en los materiales y procesos del paisaje»
  (1998: 5) y la escala del espacio como «el alcance de una epopeya o
  los límites de un drama personal» (1998: 6), para las tres razones y
  el recorrido por escalas. Traducción propia.
- Páginas reconstruidas con el sumario, los encabezados que quedan en
  el OCR y el índice analítico del libro.
- La frase que citaba Aljohani está en la p. 64 y dice «created and
  controlled by», no «shaped by».
- Recortes de frases repetidas para seguir en rango: 49.384
  caracteres; 145 citas de la novela verificadas; 25 entradas.
- analisis/10 (§10.6), README, 01, 04, 06 y 08 al día; Word de cambios.

Co-Authored-By: Claude Opus 5.5 <noreply@anthropic.com>
Claude-Session: https://claude.ai/code/session_01QWC9b4jcZbzQ8czhYUvPYd
</commit_message>
<xml_diff>
--- a/articulo/articulo_cosecha_de_piedras.docx
+++ b/articulo/articulo_cosecha_de_piedras.docx
@@ -357,7 +357,7 @@
         <w:t xml:space="preserve"> </w:t>
       </w:r>
       <w:r>
-        <w:t xml:space="preserve">Nuestra respuesta es que la novela registra, a espaldas de su narrador, la mecánica material del despojo: cómo se pierde la tierra, con qué objetos y con qué gestos. El argumento cabe en tres materiales. El ayllu marca su tierra con piedras: despeja, amontona, cerca y amojona. La aldea la reescribe con papeles: títulos, expedientes, ordenanzas. La mina convierte el mismo gesto en mercancía con máquinas. Entre la piedra y el papel el intercambio no es parejo: ante la ley, un mojón no vale lo que un título. El dibujo, al repetir las operaciones de la novela con otra materia, obliga a decidir lo que el texto deja abierto y deja ver lo que el narrador impone.</w:t>
+        <w:t xml:space="preserve">Nuestra respuesta es que la novela registra, a espaldas de su narrador, la mecánica material del despojo: cómo se pierde la tierra, con qué objetos y con qué gestos. El argumento cabe en tres materiales. El ayllu marca su tierra con piedras: despeja, amontona, cerca y amojona. La aldea la reescribe con papeles: títulos, expedientes, ordenanzas. La mina convierte el mismo gesto en mercancía con máquinas. El dibujo, al repetir las operaciones de la novela con otra materia, obliga a decidir lo que el texto deja abierto y deja ver lo que el narrador impone.</w:t>
       </w:r>
     </w:p>
     <w:p>
@@ -389,7 +389,7 @@
         <w:pStyle w:val="BodyText"/>
       </w:pPr>
       <w:r>
-        <w:t xml:space="preserve">La lectura se hace desde la arquitectura y el dibujo, con las herramientas de ese oficio: la planta, el corte, el peso de los materiales, la mano que dibuja. Hay tres razones para hacerlo así. Primero, en</w:t>
+        <w:t xml:space="preserve">La lectura se hace desde la arquitectura y el dibujo, con las herramientas de ese oficio: la planta, el corte, el peso de los materiales, la mano que dibuja. Hay tres razones para hacerlo así. Primero, las narraciones también están en los paisajes: «se acumulan como capas de historia, organizan secuencias y residen en los materiales y procesos del paisaje» (Potteiger y Purinton, 1998: 5). En</w:t>
       </w:r>
       <w:r>
         <w:t xml:space="preserve"> </w:t>
@@ -402,10 +402,7 @@
         <w:t xml:space="preserve">Altiplano</w:t>
       </w:r>
       <w:r>
-        <w:t xml:space="preserve"> </w:t>
-      </w:r>
-      <w:r>
-        <w:t xml:space="preserve">el saber sobre el espacio es material: piedra, adobe, paja y papel. Segundo, el dibujo, que obliga a decidir punto de vista, escala y límite, deja a la vista las categorías que el lector proyecta. Tercero, si dibujar es, como propone Mauricio Cárcamo Pino, un</w:t>
+        <w:t xml:space="preserve">, esos materiales son piedra, adobe, paja y papel. Segundo, el dibujo, que obliga a decidir punto de vista, escala y límite, deja a la vista las categorías que el lector proyecta. Tercero, si dibujar es, como propone Mauricio Cárcamo Pino, un</w:t>
       </w:r>
       <w:r>
         <w:t xml:space="preserve"> </w:t>
@@ -418,7 +415,7 @@
         <w:t xml:space="preserve">manuaje</w:t>
       </w:r>
       <w:r>
-        <w:t xml:space="preserve">, una manera de pensar y de decir con las manos (Cárcamo Pino, 2025b: 244), dibujar una novela es leerla con otro órgano. El recorrido cambia de escala: la casa y el ayllu (sección 3), la aldea (4), el éxodo (5), el cuerpo (6) y el retorno (7). Allí se sitúan los seis pasteles de la serie, de los que se reproduce el esquema de encaje, el trazado que fija la composición (figuras 1-6). Se trata de una investigación en desarrollo.</w:t>
+        <w:t xml:space="preserve">, una manera de pensar y de decir con las manos (Cárcamo Pino, 2025b: 244), dibujar una novela es leerla con otro órgano. Como la escala del espacio puede volverse «el alcance de una epopeya o los límites de un drama personal» (Potteiger y Purinton, 1998: 6), el recorrido cambia de escala: la casa y el ayllu (sección 3), la aldea (4), el éxodo (5), el cuerpo (6) y el retorno (7). Allí se sitúan los seis pasteles de la serie, de los que se reproduce el esquema de encaje, el trazado que fija la composición (figuras 1-6). Se trata de una investigación en desarrollo.</w:t>
       </w:r>
     </w:p>
     <w:bookmarkEnd w:id="12"/>
@@ -712,7 +709,7 @@
         <w:t xml:space="preserve"> </w:t>
       </w:r>
       <w:r>
-        <w:t xml:space="preserve">de Canaletto, que reunía edificios de ciudades distintas en una ciudad «completamente imaginaria» (ibid.: 3); sus decisiones, un perfil o una analogía, son del dibujante y no cuentan como hallazgos. La</w:t>
+        <w:t xml:space="preserve">de Canaletto junta edificios de ciudades distintas en una ciudad «completamente imaginaria» (ibid.: 3); sus decisiones, un perfil o una analogía, son del dibujante y no cuentan como hallazgos. La</w:t>
       </w:r>
       <w:r>
         <w:t xml:space="preserve"> </w:t>
@@ -1431,17 +1428,17 @@
         <w:pStyle w:val="FirstParagraph"/>
       </w:pPr>
       <w:r>
-        <w:t xml:space="preserve">El narrador presenta el ayllu desde lo alto, como en un plano de situación: en la falda del cerro, «las chujllas de las familias más antiguas han trepado en los riscos del cerro y desde allí parecen ocupar un sitio de preeminencia sobre el resto de chozas» (Botelho Gosálvez, 1982 [1945]: 6). La palabra clave es</w:t>
-      </w:r>
-      <w:r>
-        <w:t xml:space="preserve"> </w:t>
-      </w:r>
-      <w:r>
-        <w:rPr>
-          <w:i/>
-          <w:iCs/>
-        </w:rPr>
-        <w:t xml:space="preserve">parecen</w:t>
+        <w:t xml:space="preserve">El narrador presenta el ayllu desde lo alto, como en un plano de situación: en la falda del cerro, «las chujllas de las familias más antiguas han trepado en los riscos del cerro y desde allí parecen ocupar un sitio de preeminencia sobre el resto de chozas» (Botelho Gosálvez, 1982 [1945]: 6).</w:t>
+      </w:r>
+      <w:r>
+        <w:t xml:space="preserve"> </w:t>
+      </w:r>
+      <w:r>
+        <w:rPr>
+          <w:i/>
+          <w:iCs/>
+        </w:rPr>
+        <w:t xml:space="preserve">Parecen</w:t>
       </w:r>
       <w:r>
         <w:t xml:space="preserve">: la jerarquía es una lectura del narrador sobre la pendiente, no un dato de la pendiente.</w:t>
@@ -1700,7 +1697,7 @@
         <w:t xml:space="preserve">Contraste</w:t>
       </w:r>
       <w:r>
-        <w:t xml:space="preserve">. El dato está en el texto; el esquema no lo descubre, pero lo vuelve imposible de ignorar: dibujado en la misma hoja, el signo no encaja en la pendiente, porque el peón vive en un escalón alto y los Villca terminarán en el pesebre de la aldea. La escalera se rehace en el cocal y en la mina (Botelho Gosálvez, 1982 [1945]: 112, 135). El signo no es una jerarquía fija, sino un mecanismo que vuelve a escalonar a la gente en cada lugar; y el mito y el mapa no se oponen, porque los dos escalonan.</w:t>
+        <w:t xml:space="preserve">. El dato está en el texto; el esquema no lo descubre, pero lo vuelve imposible de ignorar: dibujado en la misma hoja, el signo no encaja en la pendiente, porque el peón vive en un escalón alto y los Villca terminarán en el pesebre de la aldea. La escalera se rehace en el cocal y en la mina (Botelho Gosálvez, 1982 [1945]: 112, 135). El mito y el mapa no se oponen: los dos escalonan.</w:t>
       </w:r>
     </w:p>
     <w:p>
@@ -2186,7 +2183,7 @@
         <w:t xml:space="preserve">Contraste</w:t>
       </w:r>
       <w:r>
-        <w:t xml:space="preserve">. Puestos uno sobre otro, la escalera de la superficie y los niveles de abajo muestran la mina como un doble invertido del ayllu: el mismo gesto, despejar y amontonar piedras, capturado por una máquina que lo convierte en mercancía y convierte el cuerpo en material. La montaña de piedras que los comunarios soñaban más alta que el cerro (Botelho Gosálvez, 1982 [1945]: 9) crece, pero como desmonte: el cascote se sube «a la superficie» (ibid.: 144).</w:t>
+        <w:t xml:space="preserve">. Puestos uno sobre otro, la escalera de la superficie y los niveles de abajo muestran la mina como un doble invertido del ayllu: el mismo gesto, despejar y amontonar piedras, capturado por una máquina que lo convierte en mercancía y convierte el cuerpo en material.</w:t>
       </w:r>
     </w:p>
     <w:p>
@@ -2276,7 +2273,7 @@
         <w:pStyle w:val="FirstParagraph"/>
       </w:pPr>
       <w:r>
-        <w:t xml:space="preserve">La sequía se cuenta con palabras de arquitecto y de dibujante: las sementeras «se agrietan como paredes envejecidas» (Botelho Gosálvez, 1982 [1945]: 56); «Ni una pincelada enturbió el papel celeste y deslumbrador del cielo» (ibid.: 57). En la rogativa, los comunarios avanzan de rodillas y su piel sangrante deja «manchones en el cascajo» (ibid.: 60): los cuerpos dibujan sobre el suelo. Pronto, «cielo y tierra eran para ellos como una tremenda cárcel» (ibid.: 72). La llanura sin límites se vuelve una jaula, y el cerco se cerrará sobre un hombre.</w:t>
+        <w:t xml:space="preserve">La sequía se cuenta con palabras de arquitecto y de dibujante: las sementeras «se agrietan como paredes envejecidas» (Botelho Gosálvez, 1982 [1945]: 56); «Ni una pincelada enturbió el papel celeste y deslumbrador del cielo» (ibid.: 57). En la rogativa, los comunarios avanzan de rodillas y su piel sangrante deja «manchones en el cascajo» (ibid.: 60): los cuerpos dibujan sobre el suelo. Pronto, «cielo y tierra eran para ellos como una tremenda cárcel» (ibid.: 72).</w:t>
       </w:r>
     </w:p>
     <w:p>
@@ -2716,7 +2713,7 @@
         <w:t xml:space="preserve">saywaña</w:t>
       </w:r>
       <w:r>
-        <w:t xml:space="preserve">: «mojonar las chácaras con montones de piedra» (Bertonio, 2011 [1612]: 466). Falta, además, la fuerza animal. En Umacachi, la ordenanza se llevó los bueyes de los Villca, que se lamentaban: «Y ni siquiera tenemos una yunta» (Botelho Gosálvez, 1982 [1945]: 105). Al volver, sin yuntas, «los mismos hombres eran quienes tiraban el arado» (ibid.: 156). El cuerpo ocupa el lugar del buey. Y el narrador vuelve a convertirlos en piedra: trabajan «con una voluntad de siglos de piedra» (ibid.), una piedra fuera de la historia, no la</w:t>
+        <w:t xml:space="preserve">: «mojonar las chácaras con montones de piedra» (Bertonio, 2011 [1612]: 466). En Umacachi, la ordenanza se llevó los bueyes de los Villca, que se lamentaban: «Y ni siquiera tenemos una yunta» (Botelho Gosálvez, 1982 [1945]: 105). Al volver, sin yuntas, «los mismos hombres eran quienes tiraban el arado» (ibid.: 156). El cuerpo ocupa el lugar del buey. Y el narrador vuelve a convertirlos en piedra: trabajan «con una voluntad de siglos de piedra» (ibid.), una piedra fuera de la historia, no la</w:t>
       </w:r>
       <w:r>
         <w:t xml:space="preserve"> </w:t>
@@ -3371,6 +3368,27 @@
       </w:r>
       <w:r>
         <w:t xml:space="preserve">. Trad. Carles Muro. Barcelona: Gustavo Gili.</w:t>
+      </w:r>
+    </w:p>
+    <w:p>
+      <w:pPr>
+        <w:pStyle w:val="BodyText"/>
+      </w:pPr>
+      <w:r>
+        <w:t xml:space="preserve">Potteiger, Matthew y Purinton, Jamie (1998).</w:t>
+      </w:r>
+      <w:r>
+        <w:t xml:space="preserve"> </w:t>
+      </w:r>
+      <w:r>
+        <w:rPr>
+          <w:i/>
+          <w:iCs/>
+        </w:rPr>
+        <w:t xml:space="preserve">Landscape Narratives: Design Practices for Telling Stories</w:t>
+      </w:r>
+      <w:r>
+        <w:t xml:space="preserve">. Nueva York: John Wiley &amp; Sons.</w:t>
       </w:r>
     </w:p>
     <w:p>

</xml_diff>

<commit_message>
Retira Potteiger y Purinton y vuelve a la versión con Pallasmaa
Revierte 28707a8 a pedido del autor: el artículo vuelve a la versión
con la casa como cuerpo de Pallasmaa (49.479 caracteres; 146 citas de
la novela; 24 entradas). El análisis del libro queda registrado en
analisis/10 (§10.6).

Co-Authored-By: Claude Opus 5.5 <noreply@anthropic.com>
Claude-Session: https://claude.ai/code/session_01QWC9b4jcZbzQ8czhYUvPYd
</commit_message>
<xml_diff>
--- a/articulo/articulo_cosecha_de_piedras.docx
+++ b/articulo/articulo_cosecha_de_piedras.docx
@@ -357,7 +357,7 @@
         <w:t xml:space="preserve"> </w:t>
       </w:r>
       <w:r>
-        <w:t xml:space="preserve">Nuestra respuesta es que la novela registra, a espaldas de su narrador, la mecánica material del despojo: cómo se pierde la tierra, con qué objetos y con qué gestos. El argumento cabe en tres materiales. El ayllu marca su tierra con piedras: despeja, amontona, cerca y amojona. La aldea la reescribe con papeles: títulos, expedientes, ordenanzas. La mina convierte el mismo gesto en mercancía con máquinas. El dibujo, al repetir las operaciones de la novela con otra materia, obliga a decidir lo que el texto deja abierto y deja ver lo que el narrador impone.</w:t>
+        <w:t xml:space="preserve">Nuestra respuesta es que la novela registra, a espaldas de su narrador, la mecánica material del despojo: cómo se pierde la tierra, con qué objetos y con qué gestos. El argumento cabe en tres materiales. El ayllu marca su tierra con piedras: despeja, amontona, cerca y amojona. La aldea la reescribe con papeles: títulos, expedientes, ordenanzas. La mina convierte el mismo gesto en mercancía con máquinas. Entre la piedra y el papel el intercambio no es parejo: ante la ley, un mojón no vale lo que un título. El dibujo, al repetir las operaciones de la novela con otra materia, obliga a decidir lo que el texto deja abierto y deja ver lo que el narrador impone.</w:t>
       </w:r>
     </w:p>
     <w:p>
@@ -389,7 +389,7 @@
         <w:pStyle w:val="BodyText"/>
       </w:pPr>
       <w:r>
-        <w:t xml:space="preserve">La lectura se hace desde la arquitectura y el dibujo, con las herramientas de ese oficio: la planta, el corte, el peso de los materiales, la mano que dibuja. Hay tres razones para hacerlo así. Primero, las narraciones también están en los paisajes: «se acumulan como capas de historia, organizan secuencias y residen en los materiales y procesos del paisaje» (Potteiger y Purinton, 1998: 5). En</w:t>
+        <w:t xml:space="preserve">La lectura se hace desde la arquitectura y el dibujo, con las herramientas de ese oficio: la planta, el corte, el peso de los materiales, la mano que dibuja. Hay tres razones para hacerlo así. Primero, en</w:t>
       </w:r>
       <w:r>
         <w:t xml:space="preserve"> </w:t>
@@ -402,7 +402,10 @@
         <w:t xml:space="preserve">Altiplano</w:t>
       </w:r>
       <w:r>
-        <w:t xml:space="preserve">, esos materiales son piedra, adobe, paja y papel. Segundo, el dibujo, que obliga a decidir punto de vista, escala y límite, deja a la vista las categorías que el lector proyecta. Tercero, si dibujar es, como propone Mauricio Cárcamo Pino, un</w:t>
+        <w:t xml:space="preserve"> </w:t>
+      </w:r>
+      <w:r>
+        <w:t xml:space="preserve">el saber sobre el espacio es material: piedra, adobe, paja y papel. Segundo, el dibujo, que obliga a decidir punto de vista, escala y límite, deja a la vista las categorías que el lector proyecta. Tercero, si dibujar es, como propone Mauricio Cárcamo Pino, un</w:t>
       </w:r>
       <w:r>
         <w:t xml:space="preserve"> </w:t>
@@ -415,7 +418,7 @@
         <w:t xml:space="preserve">manuaje</w:t>
       </w:r>
       <w:r>
-        <w:t xml:space="preserve">, una manera de pensar y de decir con las manos (Cárcamo Pino, 2025b: 244), dibujar una novela es leerla con otro órgano. Como la escala del espacio puede volverse «el alcance de una epopeya o los límites de un drama personal» (Potteiger y Purinton, 1998: 6), el recorrido cambia de escala: la casa y el ayllu (sección 3), la aldea (4), el éxodo (5), el cuerpo (6) y el retorno (7). Allí se sitúan los seis pasteles de la serie, de los que se reproduce el esquema de encaje, el trazado que fija la composición (figuras 1-6). Se trata de una investigación en desarrollo.</w:t>
+        <w:t xml:space="preserve">, una manera de pensar y de decir con las manos (Cárcamo Pino, 2025b: 244), dibujar una novela es leerla con otro órgano. El recorrido cambia de escala: la casa y el ayllu (sección 3), la aldea (4), el éxodo (5), el cuerpo (6) y el retorno (7). Allí se sitúan los seis pasteles de la serie, de los que se reproduce el esquema de encaje, el trazado que fija la composición (figuras 1-6). Se trata de una investigación en desarrollo.</w:t>
       </w:r>
     </w:p>
     <w:bookmarkEnd w:id="12"/>
@@ -709,7 +712,7 @@
         <w:t xml:space="preserve"> </w:t>
       </w:r>
       <w:r>
-        <w:t xml:space="preserve">de Canaletto junta edificios de ciudades distintas en una ciudad «completamente imaginaria» (ibid.: 3); sus decisiones, un perfil o una analogía, son del dibujante y no cuentan como hallazgos. La</w:t>
+        <w:t xml:space="preserve">de Canaletto, que reunía edificios de ciudades distintas en una ciudad «completamente imaginaria» (ibid.: 3); sus decisiones, un perfil o una analogía, son del dibujante y no cuentan como hallazgos. La</w:t>
       </w:r>
       <w:r>
         <w:t xml:space="preserve"> </w:t>
@@ -1428,17 +1431,17 @@
         <w:pStyle w:val="FirstParagraph"/>
       </w:pPr>
       <w:r>
-        <w:t xml:space="preserve">El narrador presenta el ayllu desde lo alto, como en un plano de situación: en la falda del cerro, «las chujllas de las familias más antiguas han trepado en los riscos del cerro y desde allí parecen ocupar un sitio de preeminencia sobre el resto de chozas» (Botelho Gosálvez, 1982 [1945]: 6).</w:t>
-      </w:r>
-      <w:r>
-        <w:t xml:space="preserve"> </w:t>
-      </w:r>
-      <w:r>
-        <w:rPr>
-          <w:i/>
-          <w:iCs/>
-        </w:rPr>
-        <w:t xml:space="preserve">Parecen</w:t>
+        <w:t xml:space="preserve">El narrador presenta el ayllu desde lo alto, como en un plano de situación: en la falda del cerro, «las chujllas de las familias más antiguas han trepado en los riscos del cerro y desde allí parecen ocupar un sitio de preeminencia sobre el resto de chozas» (Botelho Gosálvez, 1982 [1945]: 6). La palabra clave es</w:t>
+      </w:r>
+      <w:r>
+        <w:t xml:space="preserve"> </w:t>
+      </w:r>
+      <w:r>
+        <w:rPr>
+          <w:i/>
+          <w:iCs/>
+        </w:rPr>
+        <w:t xml:space="preserve">parecen</w:t>
       </w:r>
       <w:r>
         <w:t xml:space="preserve">: la jerarquía es una lectura del narrador sobre la pendiente, no un dato de la pendiente.</w:t>
@@ -1697,7 +1700,7 @@
         <w:t xml:space="preserve">Contraste</w:t>
       </w:r>
       <w:r>
-        <w:t xml:space="preserve">. El dato está en el texto; el esquema no lo descubre, pero lo vuelve imposible de ignorar: dibujado en la misma hoja, el signo no encaja en la pendiente, porque el peón vive en un escalón alto y los Villca terminarán en el pesebre de la aldea. La escalera se rehace en el cocal y en la mina (Botelho Gosálvez, 1982 [1945]: 112, 135). El mito y el mapa no se oponen: los dos escalonan.</w:t>
+        <w:t xml:space="preserve">. El dato está en el texto; el esquema no lo descubre, pero lo vuelve imposible de ignorar: dibujado en la misma hoja, el signo no encaja en la pendiente, porque el peón vive en un escalón alto y los Villca terminarán en el pesebre de la aldea. La escalera se rehace en el cocal y en la mina (Botelho Gosálvez, 1982 [1945]: 112, 135). El signo no es una jerarquía fija, sino un mecanismo que vuelve a escalonar a la gente en cada lugar; y el mito y el mapa no se oponen, porque los dos escalonan.</w:t>
       </w:r>
     </w:p>
     <w:p>
@@ -2183,7 +2186,7 @@
         <w:t xml:space="preserve">Contraste</w:t>
       </w:r>
       <w:r>
-        <w:t xml:space="preserve">. Puestos uno sobre otro, la escalera de la superficie y los niveles de abajo muestran la mina como un doble invertido del ayllu: el mismo gesto, despejar y amontonar piedras, capturado por una máquina que lo convierte en mercancía y convierte el cuerpo en material.</w:t>
+        <w:t xml:space="preserve">. Puestos uno sobre otro, la escalera de la superficie y los niveles de abajo muestran la mina como un doble invertido del ayllu: el mismo gesto, despejar y amontonar piedras, capturado por una máquina que lo convierte en mercancía y convierte el cuerpo en material. La montaña de piedras que los comunarios soñaban más alta que el cerro (Botelho Gosálvez, 1982 [1945]: 9) crece, pero como desmonte: el cascote se sube «a la superficie» (ibid.: 144).</w:t>
       </w:r>
     </w:p>
     <w:p>
@@ -2273,7 +2276,7 @@
         <w:pStyle w:val="FirstParagraph"/>
       </w:pPr>
       <w:r>
-        <w:t xml:space="preserve">La sequía se cuenta con palabras de arquitecto y de dibujante: las sementeras «se agrietan como paredes envejecidas» (Botelho Gosálvez, 1982 [1945]: 56); «Ni una pincelada enturbió el papel celeste y deslumbrador del cielo» (ibid.: 57). En la rogativa, los comunarios avanzan de rodillas y su piel sangrante deja «manchones en el cascajo» (ibid.: 60): los cuerpos dibujan sobre el suelo. Pronto, «cielo y tierra eran para ellos como una tremenda cárcel» (ibid.: 72).</w:t>
+        <w:t xml:space="preserve">La sequía se cuenta con palabras de arquitecto y de dibujante: las sementeras «se agrietan como paredes envejecidas» (Botelho Gosálvez, 1982 [1945]: 56); «Ni una pincelada enturbió el papel celeste y deslumbrador del cielo» (ibid.: 57). En la rogativa, los comunarios avanzan de rodillas y su piel sangrante deja «manchones en el cascajo» (ibid.: 60): los cuerpos dibujan sobre el suelo. Pronto, «cielo y tierra eran para ellos como una tremenda cárcel» (ibid.: 72). La llanura sin límites se vuelve una jaula, y el cerco se cerrará sobre un hombre.</w:t>
       </w:r>
     </w:p>
     <w:p>
@@ -2713,7 +2716,7 @@
         <w:t xml:space="preserve">saywaña</w:t>
       </w:r>
       <w:r>
-        <w:t xml:space="preserve">: «mojonar las chácaras con montones de piedra» (Bertonio, 2011 [1612]: 466). En Umacachi, la ordenanza se llevó los bueyes de los Villca, que se lamentaban: «Y ni siquiera tenemos una yunta» (Botelho Gosálvez, 1982 [1945]: 105). Al volver, sin yuntas, «los mismos hombres eran quienes tiraban el arado» (ibid.: 156). El cuerpo ocupa el lugar del buey. Y el narrador vuelve a convertirlos en piedra: trabajan «con una voluntad de siglos de piedra» (ibid.), una piedra fuera de la historia, no la</w:t>
+        <w:t xml:space="preserve">: «mojonar las chácaras con montones de piedra» (Bertonio, 2011 [1612]: 466). Falta, además, la fuerza animal. En Umacachi, la ordenanza se llevó los bueyes de los Villca, que se lamentaban: «Y ni siquiera tenemos una yunta» (Botelho Gosálvez, 1982 [1945]: 105). Al volver, sin yuntas, «los mismos hombres eran quienes tiraban el arado» (ibid.: 156). El cuerpo ocupa el lugar del buey. Y el narrador vuelve a convertirlos en piedra: trabajan «con una voluntad de siglos de piedra» (ibid.), una piedra fuera de la historia, no la</w:t>
       </w:r>
       <w:r>
         <w:t xml:space="preserve"> </w:t>
@@ -3368,27 +3371,6 @@
       </w:r>
       <w:r>
         <w:t xml:space="preserve">. Trad. Carles Muro. Barcelona: Gustavo Gili.</w:t>
-      </w:r>
-    </w:p>
-    <w:p>
-      <w:pPr>
-        <w:pStyle w:val="BodyText"/>
-      </w:pPr>
-      <w:r>
-        <w:t xml:space="preserve">Potteiger, Matthew y Purinton, Jamie (1998).</w:t>
-      </w:r>
-      <w:r>
-        <w:t xml:space="preserve"> </w:t>
-      </w:r>
-      <w:r>
-        <w:rPr>
-          <w:i/>
-          <w:iCs/>
-        </w:rPr>
-        <w:t xml:space="preserve">Landscape Narratives: Design Practices for Telling Stories</w:t>
-      </w:r>
-      <w:r>
-        <w:t xml:space="preserve">. Nueva York: John Wiley &amp; Sons.</w:t>
       </w:r>
     </w:p>
     <w:p>

</xml_diff>

<commit_message>
Añade dos analogías físicas: el esgrafiado y la pirca de doble cara
- §1: la lectura a espaldas del narrador se explica con el esgrafiado
  del pastel al óleo (raspar la capa de encima para ver la de abajo).
- §7: la memoria del retorno se compara con una pirca de doble cara,
  cuyo relleno de piedra menuda la sostiene; los sin tierra fueron ese
  relleno. El narrador llama «legión» a la piedrecilla que baja a las
  pircas (p. 8) y a los sin tierra (p. 22).
- Recortes en §3, figuras 2 y 4, §6 y §7 para mantener la extensión
  (49.477 caracteres; 147 citas de la novela verificadas).
- analisis/11: criterios, evaluación de los cuatro borradores (pirca y
  ripio, válvula, bomba de pistón, cántaro y arco) y fuentes técnicas.
- Word con los 13 cambios marcados y cifras de estado actualizadas.

Co-Authored-By: Claude Opus 5.5 <noreply@anthropic.com>
Claude-Session: https://claude.ai/code/session_01QWC9b4jcZbzQ8czhYUvPYd
</commit_message>
<xml_diff>
--- a/articulo/articulo_cosecha_de_piedras.docx
+++ b/articulo/articulo_cosecha_de_piedras.docx
@@ -357,7 +357,7 @@
         <w:t xml:space="preserve"> </w:t>
       </w:r>
       <w:r>
-        <w:t xml:space="preserve">Nuestra respuesta es que la novela registra, a espaldas de su narrador, la mecánica material del despojo: cómo se pierde la tierra, con qué objetos y con qué gestos. El argumento cabe en tres materiales. El ayllu marca su tierra con piedras: despeja, amontona, cerca y amojona. La aldea la reescribe con papeles: títulos, expedientes, ordenanzas. La mina convierte el mismo gesto en mercancía con máquinas. Entre la piedra y el papel el intercambio no es parejo: ante la ley, un mojón no vale lo que un título. El dibujo, al repetir las operaciones de la novela con otra materia, obliga a decidir lo que el texto deja abierto y deja ver lo que el narrador impone.</w:t>
+        <w:t xml:space="preserve">Nuestra respuesta es que la novela registra, a espaldas de su narrador, la mecánica material del despojo: cómo se pierde la tierra, con qué objetos y con qué gestos. Leer así se parece al esgrafiado: se raspa la capa del narrador para que aparezca la de abajo. El argumento cabe en tres materiales. El ayllu marca su tierra con piedras: despeja, amontona, cerca y amojona. La aldea la reescribe con papeles: títulos, expedientes, ordenanzas. La mina convierte el mismo gesto en mercancía con máquinas. Entre la piedra y el papel el intercambio no es parejo: ante la ley, un mojón no vale lo que un título. El dibujo, al repetir las operaciones de la novela con otra materia, obliga a decidir lo que el texto deja abierto y deja ver lo que el narrador impone.</w:t>
       </w:r>
     </w:p>
     <w:p>
@@ -1452,7 +1452,7 @@
         <w:pStyle w:val="BodyText"/>
       </w:pPr>
       <w:r>
-        <w:t xml:space="preserve">La chujlla de los Huanca permite medir la casa. Tiene dos metros de alto, paredes «renegridas por el hollín» y camastros de «apenas la altura de un adobe»; de las vigas, «mal unidas con lazos de paja trenzada», cuelgan «las hoces, el arado, el yugo de madera» (ibid.: 30-31). Junta las dos maneras de construir de Frampton: muros de piedra y adobe que pesan, y un armazón atado como una cestería (Frampton, 1995: 5). Se mide con el cuerpo y guarda las herramientas de las manos. Es una caja de herramientas, y para Cárcamo Pino una caja de herramientas es a las manos lo que un idioma es a la lengua (Cárcamo Pino, 2025a: 12). El narrador, en cambio, entra como un intruso que no habita, sino que escribe: los camastros son «morada de piojos y pulgas» (Botelho Gosálvez, 1982 [1945]: 31). Pallasmaa recuerda que «la casa es una metáfora del cuerpo y el cuerpo una metáfora de la casa» (Pallasmaa, 2014: 159); el narrador hace de la chujlla una madriguera. Su umbral es el «portal de su chujlla» desde el que Paulo Huanca ve partir a los hijos que la escasez expulsa (Botelho Gosálvez, 1982 [1945]: 34).</w:t>
+        <w:t xml:space="preserve">La chujlla de los Huanca permite medir la casa. Tiene dos metros de alto, paredes «renegridas por el hollín» y camastros de «apenas la altura de un adobe»; de las vigas, «mal unidas con lazos de paja trenzada», cuelgan «las hoces, el arado, el yugo de madera» (ibid.: 30-31). Junta las dos maneras de construir de Frampton: muros de piedra y adobe que pesan, y un armazón atado como una cestería (Frampton, 1995: 5). Se mide con el cuerpo y guarda las herramientas de las manos. Es una caja de herramientas, que para Cárcamo Pino es a las manos lo que un idioma a la lengua (Cárcamo Pino, 2025a: 12). El narrador, en cambio, entra como un intruso que no habita, sino que escribe: los camastros son «morada de piojos y pulgas» (Botelho Gosálvez, 1982 [1945]: 31). Pallasmaa recuerda que «la casa es una metáfora del cuerpo y el cuerpo una metáfora de la casa» (Pallasmaa, 2014: 159); el narrador hace de la chujlla una madriguera. Su umbral es el «portal de su chujlla» desde el que Paulo Huanca ve partir a los hijos que la escasez expulsa (Botelho Gosálvez, 1982 [1945]: 34).</w:t>
       </w:r>
     </w:p>
     <w:p>
@@ -1700,7 +1700,7 @@
         <w:t xml:space="preserve">Contraste</w:t>
       </w:r>
       <w:r>
-        <w:t xml:space="preserve">. El dato está en el texto; el esquema no lo descubre, pero lo vuelve imposible de ignorar: dibujado en la misma hoja, el signo no encaja en la pendiente, porque el peón vive en un escalón alto y los Villca terminarán en el pesebre de la aldea. La escalera se rehace en el cocal y en la mina (Botelho Gosálvez, 1982 [1945]: 112, 135). El signo no es una jerarquía fija, sino un mecanismo que vuelve a escalonar a la gente en cada lugar; y el mito y el mapa no se oponen, porque los dos escalonan.</w:t>
+        <w:t xml:space="preserve">. El dato está en el texto; el esquema no lo descubre, pero lo vuelve imposible de ignorar: dibujado en la misma hoja, el signo no encaja en la pendiente, porque el peón vive en un escalón alto y los Villca terminarán en el pesebre de la aldea. La escalera se rehace en el cocal y en la mina (Botelho Gosálvez, 1982 [1945]: 112, 135). El mito y el mapa no se oponen: los dos escalonan.</w:t>
       </w:r>
     </w:p>
     <w:p>
@@ -2186,7 +2186,7 @@
         <w:t xml:space="preserve">Contraste</w:t>
       </w:r>
       <w:r>
-        <w:t xml:space="preserve">. Puestos uno sobre otro, la escalera de la superficie y los niveles de abajo muestran la mina como un doble invertido del ayllu: el mismo gesto, despejar y amontonar piedras, capturado por una máquina que lo convierte en mercancía y convierte el cuerpo en material. La montaña de piedras que los comunarios soñaban más alta que el cerro (Botelho Gosálvez, 1982 [1945]: 9) crece, pero como desmonte: el cascote se sube «a la superficie» (ibid.: 144).</w:t>
+        <w:t xml:space="preserve">. Puestos uno sobre otro, la escalera de la superficie y los niveles de abajo muestran la mina como un doble invertido del ayllu: el mismo gesto, despejar y amontonar piedras, capturado por una máquina que lo convierte en mercancía y convierte el cuerpo en material.</w:t>
       </w:r>
     </w:p>
     <w:p>
@@ -2276,7 +2276,7 @@
         <w:pStyle w:val="FirstParagraph"/>
       </w:pPr>
       <w:r>
-        <w:t xml:space="preserve">La sequía se cuenta con palabras de arquitecto y de dibujante: las sementeras «se agrietan como paredes envejecidas» (Botelho Gosálvez, 1982 [1945]: 56); «Ni una pincelada enturbió el papel celeste y deslumbrador del cielo» (ibid.: 57). En la rogativa, los comunarios avanzan de rodillas y su piel sangrante deja «manchones en el cascajo» (ibid.: 60): los cuerpos dibujan sobre el suelo. Pronto, «cielo y tierra eran para ellos como una tremenda cárcel» (ibid.: 72). La llanura sin límites se vuelve una jaula, y el cerco se cerrará sobre un hombre.</w:t>
+        <w:t xml:space="preserve">La sequía se cuenta con palabras de arquitecto y de dibujante: las sementeras «se agrietan como paredes envejecidas» (Botelho Gosálvez, 1982 [1945]: 56); «Ni una pincelada enturbió el papel celeste y deslumbrador del cielo» (ibid.: 57). En la rogativa, los comunarios avanzan de rodillas y su piel sangrante deja «manchones en el cascajo» (ibid.: 60): los cuerpos dibujan sobre el suelo. Pronto, «cielo y tierra eran para ellos como una tremenda cárcel» (ibid.: 72).</w:t>
       </w:r>
     </w:p>
     <w:p>
@@ -2716,7 +2716,7 @@
         <w:t xml:space="preserve">saywaña</w:t>
       </w:r>
       <w:r>
-        <w:t xml:space="preserve">: «mojonar las chácaras con montones de piedra» (Bertonio, 2011 [1612]: 466). Falta, además, la fuerza animal. En Umacachi, la ordenanza se llevó los bueyes de los Villca, que se lamentaban: «Y ni siquiera tenemos una yunta» (Botelho Gosálvez, 1982 [1945]: 105). Al volver, sin yuntas, «los mismos hombres eran quienes tiraban el arado» (ibid.: 156). El cuerpo ocupa el lugar del buey. Y el narrador vuelve a convertirlos en piedra: trabajan «con una voluntad de siglos de piedra» (ibid.), una piedra fuera de la historia, no la</w:t>
+        <w:t xml:space="preserve">: «mojonar las chácaras con montones de piedra» (Bertonio, 2011 [1612]: 466). En Umacachi, la ordenanza se llevó los bueyes de los Villca, que se lamentaban: «Y ni siquiera tenemos una yunta» (Botelho Gosálvez, 1982 [1945]: 105). Al volver, sin yuntas, «los mismos hombres eran quienes tiraban el arado» (ibid.: 156). El cuerpo ocupa el lugar del buey. Y el narrador vuelve a convertirlos en piedra: trabajan «con una voluntad de siglos de piedra» (ibid.), una piedra fuera de la historia, no la</w:t>
       </w:r>
       <w:r>
         <w:t xml:space="preserve"> </w:t>
@@ -2756,15 +2756,15 @@
         <w:pStyle w:val="FirstParagraph"/>
       </w:pPr>
       <w:r>
-        <w:t xml:space="preserve">Muralla, foso, atalaya: recordar es construir, y olvidar también. Es lo contrario del lema que abre este artículo: los comunarios de la novela no caminan mirando al pasado; lo esconden en un foso. La selección tiene nombres: «Llegaron los Villca, los Huanca, los Huallpa, los Yupanqui, los Ticona, los Choque, los Chuquihuanca» (ibid.: 156). Faltan los Condori, los Mamani y los Quispe, la «legión» sin tierra que cerraba la escalera del narrador (ibid.: 22). Juan Condori está enterrado en el cementerio de los mineros; los miembros de Basilio Quispe, «en muchos sitios» (ibid.: 69). El Signo Escalonado se rehace sin su último escalón. Con la cosecha, los derrotados «olvidaron la pesadilla pasada», y la Pachamama recuperó «su prestigio de hembra paridora y múltiple» (ibid.: 159). La paz se paga con ese olvido.</w:t>
-      </w:r>
-    </w:p>
-    <w:p>
-      <w:pPr>
-        <w:pStyle w:val="BodyText"/>
-      </w:pPr>
-      <w:r>
-        <w:t xml:space="preserve">Ursula K. Le Guin opuso dos formas de contar: la del arma, con forma de flecha, y la del recipiente. «Una novela es un botiquín», escribió, «que contiene cosas en una relación particular, poderosa, entre sí, y con nosotros» (Le Guin, 2021 [1986]: 10). La mina pertenece a la historia del arma: jornal, revólver, boquete. El ayllu del retorno, a la del recipiente: la casa, «un recipiente para personas» (ibid.: 8), vuelve a guardar la cosecha y a reunir los nombres. Pero todo recipiente elige qué guarda. El pesebre fue tumba, y el ayllu reparado deja fuera a los sin tierra. El narrador cierra con héroes: los derrotados vuelven a ser «los patriarcas fecundadores del suelo, los sembradores del destino» (Botelho Gosálvez, 1982 [1945]: 159). El héroe, advierte Le Guin, no cabe en la bolsa: «Necesita un escenario, o un pedestal, o una cima» (Le Guin, 2021 [1986]: 11). Aquí, la atalaya. La novela, que guarda lo que el ayllu prefiere no mirar, es el recipiente más grande.</w:t>
+        <w:t xml:space="preserve">Muralla, foso, atalaya: recordar es construir, y olvidar también. Es lo contrario del lema que abre este artículo: los comunarios de la novela no caminan mirando al pasado; lo esconden en un foso. La selección tiene nombres: «Llegaron los Villca, los Huanca, los Huallpa, los Yupanqui, los Ticona, los Choque, los Chuquihuanca» (ibid.: 156). Faltan los Condori, los Mamani y los Quispe, la «legión» sin tierra que cerraba la escalera del narrador (ibid.: 22). Juan Condori está enterrado en el cementerio de los mineros; los miembros de Basilio Quispe, «en muchos sitios» (ibid.: 69). El Signo Escalonado se rehace sin su último escalón. Una pirca de doble cara enseña lo que esa memoria olvida: las piedras grandes dan la cara, pero adentro, apretadas entre las dos caras, van las menudas, y sin ese relleno el muro se cae. El narrador también llama «legión» a la «piedrecilla menuda» que baja del cerro hasta las pircas (ibid.: 8). Los sin tierra fueron ese relleno: tres de ellos, sin nombre, cuidaron el ayllu vacío, y el retorno no los cuenta. Con la cosecha, los derrotados «olvidaron la pesadilla pasada», y la Pachamama recuperó «su prestigio de hembra paridora y múltiple» (ibid.: 159). La paz se paga con ese olvido.</w:t>
+      </w:r>
+    </w:p>
+    <w:p>
+      <w:pPr>
+        <w:pStyle w:val="BodyText"/>
+      </w:pPr>
+      <w:r>
+        <w:t xml:space="preserve">Ursula K. Le Guin opuso dos formas de contar: la del arma, con forma de flecha, y la del recipiente. «Una novela es un botiquín», escribió, «que contiene cosas en una relación particular, poderosa, entre sí, y con nosotros» (Le Guin, 2021 [1986]: 10). La mina pertenece a la historia del arma: jornal, revólver, boquete. El ayllu del retorno, a la del recipiente: la casa, «un recipiente para personas» (ibid.: 8), vuelve a guardar la cosecha y a reunir los nombres. Pero todo recipiente elige qué guarda. El narrador cierra con héroes: los derrotados vuelven a ser «los patriarcas fecundadores del suelo, los sembradores del destino» (Botelho Gosálvez, 1982 [1945]: 159). El héroe, advierte Le Guin, no cabe en la bolsa: «Necesita un escenario, o un pedestal, o una cima» (Le Guin, 2021 [1986]: 11). Aquí, la atalaya. La novela, que guarda lo que el ayllu prefiere no mirar, es el recipiente más grande.</w:t>
       </w:r>
     </w:p>
     <w:bookmarkEnd w:id="36"/>

</xml_diff>

<commit_message>
Analiza el taller de cine experimental y ajusta la Figura 1
- analisis/12: qué del taller de Byron Davies ya está en el artículo,
  qué no entra y por qué (autores sin texto a la vista; la plata de
  Potosí y el litio de Uyuni), y lecturas en reserva, entre ellas tres
  textos publicados de Davies.
- Figura 1: el esquema se detiene ante el alma de los comunarios para
  no hablar por ellos; el narrador la declara cerrada y los ve «como
  estatuas» de «hierático aspecto» (p. 65).
- Conclusiones: el segundo límite dice «el alma», no «los sueños», que
  el narrador nunca declara inaccesibles.
- Recortes menores; 49.488 caracteres y 148 citas de la novela
  verificadas. Word con los 14 cambios marcados y estado actualizado.

Co-Authored-By: Claude Opus 5.5 <noreply@anthropic.com>
Claude-Session: https://claude.ai/code/session_01QWC9b4jcZbzQ8czhYUvPYd
</commit_message>
<xml_diff>
--- a/articulo/articulo_cosecha_de_piedras.docx
+++ b/articulo/articulo_cosecha_de_piedras.docx
@@ -381,7 +381,7 @@
         <w:t xml:space="preserve"> </w:t>
       </w:r>
       <w:r>
-        <w:t xml:space="preserve">no es la excepción. Denuncia el despojo, pero trata a los comunarios como animales, como cuerpos sexuales o como piedras: las chozas son «verrugas en la piel sarmentosa del altiplano» (Botelho Gosálvez, 1982 [1945]: 10), y un minero muestra sus «pobres costillas zafadas como surcos» (ibid.: 145). No se trata de repetir esa crítica, sino de buscar la historia que el texto guarda en sus cosas mientras el narrador la convierte en paisaje.</w:t>
+        <w:t xml:space="preserve">denuncia el despojo, pero trata a los comunarios como animales, como cuerpos sexuales o como piedras: las chozas son «verrugas en la piel sarmentosa del altiplano» (Botelho Gosálvez, 1982 [1945]: 10), y un minero muestra sus «pobres costillas zafadas como surcos» (ibid.: 145). No se trata de repetir esa crítica, sino de buscar la historia que el texto guarda en sus cosas mientras el narrador la convierte en paisaje.</w:t>
       </w:r>
     </w:p>
     <w:p>
@@ -1532,7 +1532,7 @@
         <w:t xml:space="preserve">Contraste</w:t>
       </w:r>
       <w:r>
-        <w:t xml:space="preserve">. El esquema tiene que decidir desde dónde se mira, y el texto ofrece dos lugares: el del narrador, intruso en la puerta, y el del cuerpo que habita, al que remiten el hollín, los camastros y las herramientas. El corte elige el segundo y se detiene donde se detiene el narrador: en el alma de los comunarios, porque «en su secreto, nadie podía entrar» (Botelho Gosálvez, 1982 [1945]: 65).</w:t>
+        <w:t xml:space="preserve">. El esquema tiene que decidir desde dónde se mira, y el texto ofrece dos lugares: el del narrador, intruso en la puerta, y el del cuerpo que habita, al que remiten el hollín, los camastros y las herramientas. El corte elige el segundo y se detiene ante el alma de los comunarios, para no hablar por ellos. El narrador, en cambio, la declara cerrada, «nadie podía entrar», y los ve como estatuas de «hierático aspecto» (Botelho Gosálvez, 1982 [1945]: 65).</w:t>
       </w:r>
     </w:p>
     <w:p>
@@ -2173,7 +2173,7 @@
         <w:t xml:space="preserve">Operación</w:t>
       </w:r>
       <w:r>
-        <w:t xml:space="preserve">. Formato vertical. Arriba, la torre rayada en la cera como un encaje y el desmonte por el que se entra a la mina (ibid.: 140); debajo, el pique y los niveles, como los pisos de un edificio al revés. Los siete cuerpos de la jaula se hacen con el dedo, sin línea, y la rejilla se raya encima. Al fondo, pastel disuelto sube por los cuerpos como el agua. (3)</w:t>
+        <w:t xml:space="preserve">. Arriba, la torre rayada en la cera como un encaje y el desmonte por el que se entra a la mina (ibid.: 140); debajo, el pique y los niveles, como los pisos de un edificio al revés. Los siete cuerpos de la jaula se hacen con el dedo, sin línea, y la rejilla se raya encima. Al fondo, pastel disuelto sube por los cuerpos como el agua. (3)</w:t>
       </w:r>
       <w:r>
         <w:t xml:space="preserve"> </w:t>
@@ -2756,7 +2756,7 @@
         <w:pStyle w:val="FirstParagraph"/>
       </w:pPr>
       <w:r>
-        <w:t xml:space="preserve">Muralla, foso, atalaya: recordar es construir, y olvidar también. Es lo contrario del lema que abre este artículo: los comunarios de la novela no caminan mirando al pasado; lo esconden en un foso. La selección tiene nombres: «Llegaron los Villca, los Huanca, los Huallpa, los Yupanqui, los Ticona, los Choque, los Chuquihuanca» (ibid.: 156). Faltan los Condori, los Mamani y los Quispe, la «legión» sin tierra que cerraba la escalera del narrador (ibid.: 22). Juan Condori está enterrado en el cementerio de los mineros; los miembros de Basilio Quispe, «en muchos sitios» (ibid.: 69). El Signo Escalonado se rehace sin su último escalón. Una pirca de doble cara enseña lo que esa memoria olvida: las piedras grandes dan la cara, pero adentro, apretadas entre las dos caras, van las menudas, y sin ese relleno el muro se cae. El narrador también llama «legión» a la «piedrecilla menuda» que baja del cerro hasta las pircas (ibid.: 8). Los sin tierra fueron ese relleno: tres de ellos, sin nombre, cuidaron el ayllu vacío, y el retorno no los cuenta. Con la cosecha, los derrotados «olvidaron la pesadilla pasada», y la Pachamama recuperó «su prestigio de hembra paridora y múltiple» (ibid.: 159). La paz se paga con ese olvido.</w:t>
+        <w:t xml:space="preserve">Muralla, foso, atalaya: recordar es construir, y olvidar también. Es lo contrario del lema del epígrafe: los comunarios de la novela no caminan mirando al pasado; lo esconden en un foso. La selección tiene nombres: «Llegaron los Villca, los Huanca, los Huallpa, los Yupanqui, los Ticona, los Choque, los Chuquihuanca» (ibid.: 156). Faltan los Condori, los Mamani y los Quispe, la «legión» sin tierra que cerraba la escalera del narrador (ibid.: 22). Juan Condori está enterrado en el cementerio de los mineros; los miembros de Basilio Quispe, «en muchos sitios» (ibid.: 69). El Signo Escalonado se rehace sin su último escalón. Una pirca de doble cara enseña lo que esa memoria olvida: las piedras grandes dan la cara, pero adentro, apretadas entre las dos caras, van las menudas, y sin ese relleno el muro se cae. El narrador también llama «legión» a la «piedrecilla menuda» que baja del cerro hasta las pircas (ibid.: 8). Los sin tierra fueron ese relleno: tres de ellos, sin nombre, cuidaron el ayllu vacío, y el retorno no los cuenta. Con la cosecha, los derrotados «olvidaron la pesadilla pasada», y la Pachamama recuperó «su prestigio de hembra paridora y múltiple» (ibid.: 159). La paz se paga con ese olvido.</w:t>
       </w:r>
     </w:p>
     <w:p>
@@ -2811,7 +2811,7 @@
         <w:t xml:space="preserve">capriccio</w:t>
       </w:r>
       <w:r>
-        <w:t xml:space="preserve">, Bacon, la tectónica y hasta la pelvis son maneras de ver ajenas al mundo narrado. Los dibujos hablan de la novela, no del ayllu ni de la manera aymara de entender el espacio, que pedirían otras fuentes y otros autores: los de la historia que los aymaras, escribía Roberto Choque Canqui, «hace tiempo, hemos añorado por escribir» (Choque Canqui, 1978 [1974]: s. p.). El segundo es ético: la inmersión seduce, y un pastel puede embellecer la miseria o fabricar efigies; por eso la serie no dibuja el linchamiento ni los sueños que el narrador declara inaccesibles. El tercero es de método: el dibujo depende de los datos del texto y hereda sus silencios. Puede hacerlos visibles, pero no llenarlos.</w:t>
+        <w:t xml:space="preserve">, Bacon, la tectónica y hasta la pelvis son maneras de ver ajenas al mundo narrado. Los dibujos hablan de la novela, no del ayllu ni de la manera aymara de entender el espacio, que pedirían otras fuentes y otros autores: los de la historia que los aymaras, escribía Roberto Choque Canqui, «hace tiempo, hemos añorado por escribir» (Choque Canqui, 1978 [1974]: s. p.). El segundo es ético: la inmersión seduce, y un pastel puede embellecer la miseria o fabricar efigies; por eso la serie no dibuja el linchamiento ni el alma que el narrador declara cerrada. El tercero es de método: el dibujo depende de los datos del texto y hereda sus silencios. Puede hacerlos visibles, pero no llenarlos.</w:t>
       </w:r>
     </w:p>
     <w:p>

</xml_diff>

<commit_message>
Cambia el subtítulo y suma dos metáforas populares
- Título: «La cosecha de piedras: piedra, papel y máquina en Altiplano»
  (The Harvest of Stones: Stone, Paper and Machine in Altiplano).
- §1: como en el juego de piedra, papel o tijera, el papel le gana a la
  piedra por regla, no por peso.
- §6: al salir del ayllu, las casas ajenas se cierran; a los vecinos la
  sequía «les endureció el alma» y los reciben «dándoles con las
  puertas» y a pedradas (p. 80).
- Recortes menores en §1, §2, §3 y §4. 49.482 caracteres; 150 citas de
  la novela verificadas. Word con los 14 cambios marcados, correo de
  envío y estado actualizados.

Co-Authored-By: Claude Opus 5.5 <noreply@anthropic.com>
Claude-Session: https://claude.ai/code/session_01QWC9b4jcZbzQ8czhYUvPYd
</commit_message>
<xml_diff>
--- a/articulo/articulo_cosecha_de_piedras.docx
+++ b/articulo/articulo_cosecha_de_piedras.docx
@@ -2,13 +2,13 @@
 <file path=word/document.xml><?xml version="1.0" encoding="utf-8"?>
 <w:document xmlns:w="http://schemas.openxmlformats.org/wordprocessingml/2006/main" xmlns:m="http://schemas.openxmlformats.org/officeDocument/2006/math" xmlns:r="http://schemas.openxmlformats.org/officeDocument/2006/relationships" xmlns:o="urn:schemas-microsoft-com:office:office" xmlns:v="urn:schemas-microsoft-com:vml" xmlns:w10="urn:schemas-microsoft-com:office:word" xmlns:a="http://schemas.openxmlformats.org/drawingml/2006/main" xmlns:pic="http://schemas.openxmlformats.org/drawingml/2006/picture" xmlns:wp="http://schemas.openxmlformats.org/drawingml/2006/wordprocessingDrawing">
   <w:body>
-    <w:bookmarkStart w:id="40" w:name="Xb77f2b31b346d0baf66ecb196d493a47741f34c"/>
+    <w:bookmarkStart w:id="40" w:name="Xfdf5c4b111121f61c3e47682ce38e3b1cc2db9c"/>
     <w:p>
       <w:pPr>
         <w:pStyle w:val="Heading1"/>
       </w:pPr>
       <w:r>
-        <w:t xml:space="preserve">La cosecha de piedras: dibujar el habitar en</w:t>
+        <w:t xml:space="preserve">La cosecha de piedras: piedra, papel y máquina en</w:t>
       </w:r>
       <w:r>
         <w:t xml:space="preserve"> </w:t>
@@ -19,12 +19,6 @@
           <w:iCs/>
         </w:rPr>
         <w:t xml:space="preserve">Altiplano</w:t>
-      </w:r>
-      <w:r>
-        <w:t xml:space="preserve"> </w:t>
-      </w:r>
-      <w:r>
-        <w:t xml:space="preserve">de Botelho Gosálvez</w:t>
       </w:r>
     </w:p>
     <w:p>
@@ -36,7 +30,7 @@
           <w:b/>
           <w:bCs/>
         </w:rPr>
-        <w:t xml:space="preserve">The Harvest of Stones: Drawing Dwelling in Botelho Gosálvez’s</w:t>
+        <w:t xml:space="preserve">The Harvest of Stones: Stone, Paper and Machine in</w:t>
       </w:r>
       <w:r>
         <w:rPr>
@@ -305,7 +299,7 @@
         <w:t xml:space="preserve">chhaxwa</w:t>
       </w:r>
       <w:r>
-        <w:t xml:space="preserve">, para las piedras «que amontonan limpiando las chácaras» y para la piedra «hincada en la pared para atar en ella los palos del techo» (ibid.: 330). La misma palabra nombra la piedra que se saca del campo y la que sujeta el techo. Que la faena tenga verbo importa: para Juhani Pallasmaa, «las experiencias arquitectónicas básicas tienen carácter de verbos más que de sustantivos» (Pallasmaa, 2014: 158). Un arquitecto reconoce aquí dos maneras de construir. Kenneth Frampton distingue la masa formada por «apilamiento repetitivo de elementos pesados», «ya sea piedra o adobe», del armazón que ensambla «componentes ligeros y lineales» (Frampton, 1995: 5): la estereotomía y la tectónica. El montón es masa sin edificio, y</w:t>
+        <w:t xml:space="preserve">, para las piedras «que amontonan limpiando las chácaras» y para la piedra «hincada en la pared para atar en ella los palos del techo» (ibid.: 330). Que la faena tenga verbo importa: para Juhani Pallasmaa, «las experiencias arquitectónicas básicas tienen carácter de verbos más que de sustantivos» (Pallasmaa, 2014: 158). Un arquitecto reconoce aquí dos maneras de construir. Kenneth Frampton distingue la masa formada por «apilamiento repetitivo de elementos pesados», «ya sea piedra o adobe», del armazón que ensambla «componentes ligeros y lineales» (Frampton, 1995: 5): la estereotomía y la tectónica. El montón es masa sin edificio, y</w:t>
       </w:r>
       <w:r>
         <w:t xml:space="preserve"> </w:t>
@@ -357,7 +351,7 @@
         <w:t xml:space="preserve"> </w:t>
       </w:r>
       <w:r>
-        <w:t xml:space="preserve">Nuestra respuesta es que la novela registra, a espaldas de su narrador, la mecánica material del despojo: cómo se pierde la tierra, con qué objetos y con qué gestos. Leer así se parece al esgrafiado: se raspa la capa del narrador para que aparezca la de abajo. El argumento cabe en tres materiales. El ayllu marca su tierra con piedras: despeja, amontona, cerca y amojona. La aldea la reescribe con papeles: títulos, expedientes, ordenanzas. La mina convierte el mismo gesto en mercancía con máquinas. Entre la piedra y el papel el intercambio no es parejo: ante la ley, un mojón no vale lo que un título. El dibujo, al repetir las operaciones de la novela con otra materia, obliga a decidir lo que el texto deja abierto y deja ver lo que el narrador impone.</w:t>
+        <w:t xml:space="preserve">Nuestra respuesta es que la novela registra, a espaldas de su narrador, la mecánica material del despojo: cómo se pierde la tierra, con qué objetos y con qué gestos. Leer así se parece al esgrafiado: se raspa la capa del narrador para que aparezca la de abajo. El argumento cabe en tres materiales. El ayllu marca su tierra con piedras: despeja, amontona, cerca y amojona. La aldea la reescribe con papeles: títulos, expedientes, ordenanzas. La mina convierte el mismo gesto en mercancía con máquinas. Como en el juego de piedra, papel o tijera, el papel le gana a la piedra por regla, no por peso: ante la ley, un mojón no vale lo que un título. El dibujo, al repetir las operaciones de la novela con otra materia, obliga a decidir lo que el texto deja abierto y deja ver lo que el narrador impone.</w:t>
       </w:r>
     </w:p>
     <w:p>
@@ -592,23 +586,7 @@
         <w:t xml:space="preserve">manoaje</w:t>
       </w:r>
       <w:r>
-        <w:t xml:space="preserve">, «un subgrupo contextual de acciones manuales» (Cárcamo Pino, 2025b: 259). Cárcamo Pino recuerda además que la misma mano hace dos agarres: el de fuerza, como al tomar un martillo, y el de precisión, como al «sujetar un papel con dos yemas dactilares» (Cárcamo Pino, 2025a: 10).</w:t>
-      </w:r>
-      <w:r>
-        <w:t xml:space="preserve"> </w:t>
-      </w:r>
-      <w:r>
-        <w:rPr>
-          <w:i/>
-          <w:iCs/>
-        </w:rPr>
-        <w:t xml:space="preserve">Altiplano</w:t>
-      </w:r>
-      <w:r>
-        <w:t xml:space="preserve"> </w:t>
-      </w:r>
-      <w:r>
-        <w:t xml:space="preserve">pone los dos a la vista. Paulo Huanca sale de su chujlla «con la madera del arado en un hombro y las correas del yugo en las manos» (Botelho Gosálvez, 1982 [1945]: 34); el doctor Mendoza firma la ordenanza que dejará sin ganado a los Villca (ibid.: 96). No es una mano frente a un papel, sino dos manos con dos agarres.</w:t>
+        <w:t xml:space="preserve">, «un subgrupo contextual de acciones manuales» (Cárcamo Pino, 2025b: 259). Cárcamo Pino recuerda además que la misma mano hace dos agarres: el de fuerza, como al tomar un martillo, y el de precisión, como al «sujetar un papel con dos yemas dactilares» (Cárcamo Pino, 2025a: 10). Paulo Huanca sale de su chujlla «con la madera del arado en un hombro y las correas del yugo en las manos» (Botelho Gosálvez, 1982 [1945]: 34); el doctor Mendoza firma la ordenanza que dejará sin ganado a los Villca (ibid.: 96). No es una mano frente a un papel, sino dos manos con dos agarres.</w:t>
       </w:r>
     </w:p>
     <w:p>
@@ -1452,7 +1430,7 @@
         <w:pStyle w:val="BodyText"/>
       </w:pPr>
       <w:r>
-        <w:t xml:space="preserve">La chujlla de los Huanca permite medir la casa. Tiene dos metros de alto, paredes «renegridas por el hollín» y camastros de «apenas la altura de un adobe»; de las vigas, «mal unidas con lazos de paja trenzada», cuelgan «las hoces, el arado, el yugo de madera» (ibid.: 30-31). Junta las dos maneras de construir de Frampton: muros de piedra y adobe que pesan, y un armazón atado como una cestería (Frampton, 1995: 5). Se mide con el cuerpo y guarda las herramientas de las manos. Es una caja de herramientas, que para Cárcamo Pino es a las manos lo que un idioma a la lengua (Cárcamo Pino, 2025a: 12). El narrador, en cambio, entra como un intruso que no habita, sino que escribe: los camastros son «morada de piojos y pulgas» (Botelho Gosálvez, 1982 [1945]: 31). Pallasmaa recuerda que «la casa es una metáfora del cuerpo y el cuerpo una metáfora de la casa» (Pallasmaa, 2014: 159); el narrador hace de la chujlla una madriguera. Su umbral es el «portal de su chujlla» desde el que Paulo Huanca ve partir a los hijos que la escasez expulsa (Botelho Gosálvez, 1982 [1945]: 34).</w:t>
+        <w:t xml:space="preserve">La chujlla de los Huanca tiene dos metros de alto, paredes «renegridas por el hollín» y camastros de «apenas la altura de un adobe»; de las vigas, «mal unidas con lazos de paja trenzada», cuelgan «las hoces, el arado, el yugo de madera» (ibid.: 30-31). Junta las dos maneras de construir de Frampton: muros de piedra y adobe que pesan, y un armazón atado como una cestería (Frampton, 1995: 5). Se mide con el cuerpo y guarda las herramientas de las manos. Es una caja de herramientas, que para Cárcamo Pino es a las manos lo que un idioma a la lengua (Cárcamo Pino, 2025a: 12). El narrador, en cambio, entra como un intruso que no habita, sino que escribe: los camastros son «morada de piojos y pulgas» (Botelho Gosálvez, 1982 [1945]: 31). Pallasmaa recuerda que «la casa es una metáfora del cuerpo y el cuerpo una metáfora de la casa» (Pallasmaa, 2014: 159); el narrador hace de la chujlla una madriguera. Su umbral es el «portal de su chujlla» desde el que Paulo Huanca ve partir a los hijos que la escasez expulsa (Botelho Gosálvez, 1982 [1945]: 34).</w:t>
       </w:r>
     </w:p>
     <w:p>
@@ -1830,7 +1808,7 @@
         <w:pStyle w:val="BodyText"/>
       </w:pPr>
       <w:r>
-        <w:t xml:space="preserve">La letra, además, pesa. En el cuartucho del tinterillo al que Vicente acude hay «un desordenado montón de papeles y libracos» (ibid.): otra vez un montón. El letrado cobra la defensa por peso: señala «un Código Penal en infolio y un manual del Procedimiento Civil» y asegura que el grande «tiene más peso legal y jurídico que el chiquitito» (ibid.: 104). El tinterillo no escribe: señala, compara y, al final, «recontó los billetes»; Vicente, para pagar, tiene que «desanudar la punta de la faja» donde guarda «un atado de pobres y traposos billetes» (ibid.: 105). Como en la escena de Cajamarca que abre el libro de Cornejo Polar, el libro es «mucho más fetiche que texto y mucho más gesto de dominio que acto de lenguaje» (Cornejo Polar, 2003 [1994]: 41). Vicente no puede leer el código, pero sabe leer a quien lo vende: «estos tinterillos son de una sola casta y todos obran con una mala fe del demonio» (Botelho Gosálvez, 1982 [1945]: 104). Rechaza la defensa, aunque una amenaza lo obliga a pagar la consulta (ibid.: 105). La escena no enfrenta a un indio ignorante con la escritura. Y calla que, en la historia real, los «abogados de pueblo (peyorativamente designados como “tinterillos”)» asesoraron la lucha legal de las comunidades y fueron «la manifestación embrionaria del indigenismo criollo» (Rivera Cusicanqui, 2010 [1984]: 101), el mismo indigenismo al que pertenece la novela.</w:t>
+        <w:t xml:space="preserve">La letra, además, pesa. En el cuartucho del tinterillo al que Vicente acude hay «un desordenado montón de papeles y libracos» (ibid.): otra vez un montón. El letrado cobra la defensa por peso: señala «un Código Penal en infolio y un manual del Procedimiento Civil» y asegura que el grande «tiene más peso legal y jurídico que el chiquitito» (ibid.: 104). El tinterillo no escribe: señala, compara y, al final, «recontó los billetes»; Vicente, para pagar, tiene que «desanudar la punta de la faja» donde guarda «un atado de pobres y traposos billetes» (ibid.: 105). Como en la escena de Cajamarca que abre el libro de Cornejo Polar, el libro es «mucho más fetiche que texto y mucho más gesto de dominio que acto de lenguaje» (Cornejo Polar, 2003 [1994]: 41). Vicente no puede leer el código, pero sabe leer a quien lo vende: «estos tinterillos son de una sola casta y todos obran con una mala fe del demonio» (Botelho Gosálvez, 1982 [1945]: 104). La escena no enfrenta a un indio ignorante con la escritura. Y calla que, en la historia real, los «abogados de pueblo (peyorativamente designados como “tinterillos”)» asesoraron la lucha legal de las comunidades y fueron «la manifestación embrionaria del indigenismo criollo» (Rivera Cusicanqui, 2010 [1984]: 101), el mismo indigenismo al que pertenece la novela.</w:t>
       </w:r>
     </w:p>
     <w:p>
@@ -2276,7 +2254,7 @@
         <w:pStyle w:val="FirstParagraph"/>
       </w:pPr>
       <w:r>
-        <w:t xml:space="preserve">La sequía se cuenta con palabras de arquitecto y de dibujante: las sementeras «se agrietan como paredes envejecidas» (Botelho Gosálvez, 1982 [1945]: 56); «Ni una pincelada enturbió el papel celeste y deslumbrador del cielo» (ibid.: 57). En la rogativa, los comunarios avanzan de rodillas y su piel sangrante deja «manchones en el cascajo» (ibid.: 60): los cuerpos dibujan sobre el suelo. Pronto, «cielo y tierra eran para ellos como una tremenda cárcel» (ibid.: 72).</w:t>
+        <w:t xml:space="preserve">La sequía se cuenta con palabras de arquitecto y de dibujante: las sementeras «se agrietan como paredes envejecidas» (Botelho Gosálvez, 1982 [1945]: 56); «Ni una pincelada enturbió el papel celeste y deslumbrador del cielo» (ibid.: 57). En la rogativa, los comunarios avanzan de rodillas y su piel sangrante deja «manchones en el cascajo» (ibid.: 60): los cuerpos dibujan sobre el suelo. Pronto, «cielo y tierra eran para ellos como una tremenda cárcel» (ibid.: 72). Al salir del ayllu, las casas ajenas se les cierran: a los vecinos, la sequía «les endureció el alma como había endurecido la tierra», y los reciben «dándoles con las puertas» y a pedradas (ibid.: 80).</w:t>
       </w:r>
     </w:p>
     <w:p>

</xml_diff>

<commit_message>
Suma el qalachuyma de Spedding y documenta la fuente
- §7: «Endurecerse para no sufrir la pérdida tiene nombre en aymara:
  qalachuyma, "corazón de piedra"; para volverse así, "hay que lamer
  el batán de moler"» (Spedding, 2025: XV). Cita verificada en el
  escaneo de «Piedras en el camino», en Susto al susto (A ediciones).
- Bibliografía: 25 entradas, con Spedding.
- Recortes menores en §1, §2, §5, figura 3 y §7. 49.473 caracteres;
  150 citas de la novela verificadas. Word con los 12 cambios marcados.
- analisis/15: la fuente, correcciones al análisis de otra IA (páginas
  XV y XXII, no 36 y 40; el batán es khuna en Bertonio, p. 245) y lo
  que queda en reserva (las piedras awicha de los cimientos, p. XVIII).

Co-Authored-By: Claude Opus 5.5 <noreply@anthropic.com>
Claude-Session: https://claude.ai/code/session_01QWC9b4jcZbzQ8czhYUvPYd
</commit_message>
<xml_diff>
--- a/articulo/articulo_cosecha_de_piedras.docx
+++ b/articulo/articulo_cosecha_de_piedras.docx
@@ -299,7 +299,7 @@
         <w:t xml:space="preserve">chhaxwa</w:t>
       </w:r>
       <w:r>
-        <w:t xml:space="preserve">, para las piedras «que amontonan limpiando las chácaras» y para la piedra «hincada en la pared para atar en ella los palos del techo» (ibid.: 330). Que la faena tenga verbo importa: para Juhani Pallasmaa, «las experiencias arquitectónicas básicas tienen carácter de verbos más que de sustantivos» (Pallasmaa, 2014: 158). Un arquitecto reconoce aquí dos maneras de construir. Kenneth Frampton distingue la masa formada por «apilamiento repetitivo de elementos pesados», «ya sea piedra o adobe», del armazón que ensambla «componentes ligeros y lineales» (Frampton, 1995: 5): la estereotomía y la tectónica. El montón es masa sin edificio, y</w:t>
+        <w:t xml:space="preserve">, para las piedras «que amontonan limpiando las chácaras» y para la piedra «hincada en la pared para atar en ella los palos del techo» (ibid.: 330). Que la faena tenga verbo importa: para Juhani Pallasmaa, «las experiencias arquitectónicas básicas tienen carácter de verbos más que de sustantivos» (Pallasmaa, 2014: 158). Kenneth Frampton distingue la masa formada por «apilamiento repetitivo de elementos pesados», «ya sea piedra o adobe», del armazón que ensambla «componentes ligeros y lineales» (Frampton, 1995: 5): la estereotomía y la tectónica. El montón es masa sin edificio, y</w:t>
       </w:r>
       <w:r>
         <w:t xml:space="preserve"> </w:t>
@@ -383,7 +383,7 @@
         <w:pStyle w:val="BodyText"/>
       </w:pPr>
       <w:r>
-        <w:t xml:space="preserve">La lectura se hace desde la arquitectura y el dibujo, con las herramientas de ese oficio: la planta, el corte, el peso de los materiales, la mano que dibuja. Hay tres razones para hacerlo así. Primero, en</w:t>
+        <w:t xml:space="preserve">La lectura se hace desde la arquitectura y el dibujo, con las herramientas de ese oficio: la planta, el corte, el peso de los materiales, la mano que dibuja. Primero, en</w:t>
       </w:r>
       <w:r>
         <w:t xml:space="preserve"> </w:t>
@@ -438,7 +438,7 @@
         <w:pStyle w:val="BodyText"/>
       </w:pPr>
       <w:r>
-        <w:t xml:space="preserve">En Bolivia, René Zavaleta Mercado opuso «dos concepciones que son ambas espacialistas»: la andina, un «archipiélago» en el que «este espacio no puede concebirse sin otro espacio», y la señorial, que concibe «el dominio final del suelo como atribución ligada a una estirpe» (Zavaleta Mercado, 1986: 29-30). Dicho de manera simple: para la primera, la tierra es un conjunto de lugares a distintas alturas que se trabajan juntos, como la puna y el valle; para la segunda, un terreno cercado que se hereda por apellido.</w:t>
+        <w:t xml:space="preserve">En Bolivia, René Zavaleta Mercado opuso «dos concepciones que son ambas espacialistas»: la andina, un «archipiélago» en el que «este espacio no puede concebirse sin otro espacio», y la señorial, que concibe «el dominio final del suelo como atribución ligada a una estirpe» (Zavaleta Mercado, 1986: 29-30). Es decir: para la primera, la tierra es un conjunto de lugares a distintas alturas que se trabajan juntos, como la puna y el valle; para la segunda, un terreno cercado que se hereda por apellido.</w:t>
       </w:r>
       <w:r>
         <w:t xml:space="preserve"> </w:t>
@@ -706,7 +706,7 @@
         <w:t xml:space="preserve"> </w:t>
       </w:r>
       <w:r>
-        <w:t xml:space="preserve">da atmósfera, sin confundirse «con el realismo visual» (ibid.: 21). Los dos primeros pasos se hacen sobre el texto; los dos últimos, en el pastel.</w:t>
+        <w:t xml:space="preserve">da atmósfera, sin confundirse «con el realismo visual» (ibid.: 21).</w:t>
       </w:r>
     </w:p>
     <w:p>
@@ -1863,7 +1863,7 @@
         <w:pStyle w:val="FirstParagraph"/>
       </w:pPr>
       <w:r>
-        <w:t xml:space="preserve">El éxodo a los Yungas empieza en un umbral: «Tras de la muralla que condena el horizonte del altiplano empieza el yunga» (Botelho Gosálvez, 1982 [1945]: 108). El valle, que en el archipiélago de Zavaleta sería otro piso de la misma tierra, es para los jóvenes del ayllu una «fábula» (ibid.: 7), y del otro lado espera la finca. En la apacheta, el viento sacude el poncho de Paulo Huanca «como un gallardete clavado en la ceja de la apacheta», su familia reza de rodillas y las cumbres se alzan «semejantes a fantásticas construcciones góticas» (ibid.: 109). El narrador vuelve a proyectar: mira la cordillera con la arquitectura de Europa.</w:t>
+        <w:t xml:space="preserve">El éxodo a los Yungas empieza en un umbral: «Tras de la muralla que condena el horizonte del altiplano empieza el yunga» (Botelho Gosálvez, 1982 [1945]: 108). El valle, que en el archipiélago de Zavaleta sería otro piso de la misma tierra, es para los jóvenes del ayllu una «fábula» (ibid.: 7), y del otro lado espera la finca. En la apacheta, el viento sacude el poncho de Paulo Huanca «como un gallardete clavado en la ceja de la apacheta», su familia reza de rodillas y las cumbres se alzan «semejantes a fantásticas construcciones góticas» (ibid.: 109). El narrador ve en la cordillera la arquitectura de Europa.</w:t>
       </w:r>
     </w:p>
     <w:p>
@@ -1884,7 +1884,7 @@
         <w:t xml:space="preserve">crimen</w:t>
       </w:r>
       <w:r>
-        <w:t xml:space="preserve">, que el narrador reserva para la muerte de Condori (ibid.: 154), no alcanza al patrón, y lo único que la novela deja hacer a la mano de la muchacha es quitarse la vida. El único cruce logrado lo hacen los monos: forman sobre el río «una cadena cogiéndose de manos» (ibid.: 121). Es una arquitectura de manos.</w:t>
+        <w:t xml:space="preserve">, que el narrador reserva para la muerte de Condori (ibid.: 154), no alcanza al patrón, y lo único que la novela deja hacer a la mano de la muchacha es quitarse la vida. El único cruce logrado lo hacen los monos: forman sobre el río «una cadena cogiéndose de manos» (ibid.: 121).</w:t>
       </w:r>
     </w:p>
     <w:p>
@@ -1938,7 +1938,7 @@
         <w:t xml:space="preserve">Texto</w:t>
       </w:r>
       <w:r>
-        <w:t xml:space="preserve">. Un umbral sin piedras. El glosario define la apacheta como «abra de las cordilleras y cumbre de los caminos» (Botelho Gosálvez, 1982 [1945]: 160): un lugar, no un montón. La novela la marca con un cuerpo erguido, la familia arrodillada y la «fauce» del yunga (ibid.: 109) y, más abajo, el puente de monos (ibid.: 121). (2)</w:t>
+        <w:t xml:space="preserve">. El glosario define la apacheta como «abra de las cordilleras y cumbre de los caminos» (Botelho Gosálvez, 1982 [1945]: 160): un lugar, no un montón. La novela la marca con un cuerpo erguido, la familia arrodillada y la «fauce» del yunga (ibid.: 109) y, más abajo, el puente de monos (ibid.: 121). (2)</w:t>
       </w:r>
       <w:r>
         <w:t xml:space="preserve"> </w:t>
@@ -2734,15 +2734,28 @@
         <w:pStyle w:val="FirstParagraph"/>
       </w:pPr>
       <w:r>
-        <w:t xml:space="preserve">Muralla, foso, atalaya: recordar es construir, y olvidar también. Es lo contrario del lema del epígrafe: los comunarios de la novela no caminan mirando al pasado; lo esconden en un foso. La selección tiene nombres: «Llegaron los Villca, los Huanca, los Huallpa, los Yupanqui, los Ticona, los Choque, los Chuquihuanca» (ibid.: 156). Faltan los Condori, los Mamani y los Quispe, la «legión» sin tierra que cerraba la escalera del narrador (ibid.: 22). Juan Condori está enterrado en el cementerio de los mineros; los miembros de Basilio Quispe, «en muchos sitios» (ibid.: 69). El Signo Escalonado se rehace sin su último escalón. Una pirca de doble cara enseña lo que esa memoria olvida: las piedras grandes dan la cara, pero adentro, apretadas entre las dos caras, van las menudas, y sin ese relleno el muro se cae. El narrador también llama «legión» a la «piedrecilla menuda» que baja del cerro hasta las pircas (ibid.: 8). Los sin tierra fueron ese relleno: tres de ellos, sin nombre, cuidaron el ayllu vacío, y el retorno no los cuenta. Con la cosecha, los derrotados «olvidaron la pesadilla pasada», y la Pachamama recuperó «su prestigio de hembra paridora y múltiple» (ibid.: 159). La paz se paga con ese olvido.</w:t>
-      </w:r>
-    </w:p>
-    <w:p>
-      <w:pPr>
-        <w:pStyle w:val="BodyText"/>
-      </w:pPr>
-      <w:r>
-        <w:t xml:space="preserve">Ursula K. Le Guin opuso dos formas de contar: la del arma, con forma de flecha, y la del recipiente. «Una novela es un botiquín», escribió, «que contiene cosas en una relación particular, poderosa, entre sí, y con nosotros» (Le Guin, 2021 [1986]: 10). La mina pertenece a la historia del arma: jornal, revólver, boquete. El ayllu del retorno, a la del recipiente: la casa, «un recipiente para personas» (ibid.: 8), vuelve a guardar la cosecha y a reunir los nombres. Pero todo recipiente elige qué guarda. El narrador cierra con héroes: los derrotados vuelven a ser «los patriarcas fecundadores del suelo, los sembradores del destino» (Botelho Gosálvez, 1982 [1945]: 159). El héroe, advierte Le Guin, no cabe en la bolsa: «Necesita un escenario, o un pedestal, o una cima» (Le Guin, 2021 [1986]: 11). Aquí, la atalaya. La novela, que guarda lo que el ayllu prefiere no mirar, es el recipiente más grande.</w:t>
+        <w:t xml:space="preserve">Muralla, foso, atalaya: recordar es construir, y olvidar también. Es lo contrario del lema del epígrafe: los comunarios de la novela no caminan mirando al pasado; lo esconden en un foso. La selección tiene nombres: «Llegaron los Villca, los Huanca, los Huallpa, los Yupanqui, los Ticona, los Choque, los Chuquihuanca» (ibid.: 156). Faltan los Condori, los Mamani y los Quispe, la «legión» sin tierra que cerraba la escalera del narrador (ibid.: 22). Juan Condori está enterrado en el cementerio de los mineros; los miembros de Basilio Quispe, «en muchos sitios» (ibid.: 69). El Signo Escalonado se rehace sin su último escalón. Una pirca de doble cara enseña lo que esa memoria olvida: las piedras grandes dan la cara, pero adentro, apretadas entre las dos caras, van las menudas, y sin ese relleno el muro se cae. El narrador también llama «legión» a la «piedrecilla menuda» que baja del cerro hasta las pircas (ibid.: 8). Los sin tierra fueron ese relleno: tres de ellos, sin nombre, cuidaron el ayllu vacío, y el retorno no los cuenta. Con la cosecha, los derrotados «olvidaron la pesadilla pasada», y la Pachamama recuperó «su prestigio de hembra paridora y múltiple» (ibid.: 159). Endurecerse para no sufrir la pérdida tiene nombre en aymara:</w:t>
+      </w:r>
+      <w:r>
+        <w:t xml:space="preserve"> </w:t>
+      </w:r>
+      <w:r>
+        <w:rPr>
+          <w:i/>
+          <w:iCs/>
+        </w:rPr>
+        <w:t xml:space="preserve">qalachuyma</w:t>
+      </w:r>
+      <w:r>
+        <w:t xml:space="preserve">, «corazón de piedra»; para volverse así, «hay que lamer el batán de moler» (Spedding, 2025: XV). La paz se paga con ese olvido.</w:t>
+      </w:r>
+    </w:p>
+    <w:p>
+      <w:pPr>
+        <w:pStyle w:val="BodyText"/>
+      </w:pPr>
+      <w:r>
+        <w:t xml:space="preserve">Ursula K. Le Guin opuso dos formas de contar: la del arma y la del recipiente. «Una novela es un botiquín», escribió, «que contiene cosas en una relación particular, poderosa, entre sí, y con nosotros» (Le Guin, 2021 [1986]: 10). La mina pertenece a la historia del arma: jornal, revólver, boquete. El ayllu del retorno, a la del recipiente: la casa, «un recipiente para personas» (ibid.: 8), vuelve a guardar la cosecha y a reunir los nombres. Pero todo recipiente elige qué guarda. El narrador cierra con héroes: los derrotados vuelven a ser «los patriarcas fecundadores del suelo, los sembradores del destino» (Botelho Gosálvez, 1982 [1945]: 159). El héroe, advierte Le Guin, no cabe en la bolsa: «Necesita un escenario, o un pedestal, o una cima» (Le Guin, 2021 [1986]: 11). Aquí, la atalaya. La novela, que guarda lo que el ayllu prefiere no mirar, es el recipiente más grande.</w:t>
       </w:r>
     </w:p>
     <w:bookmarkEnd w:id="36"/>
@@ -3412,6 +3425,36 @@
       </w:r>
       <w:r>
         <w:t xml:space="preserve">. Madrid: Mairea Libros y Escuela Técnica Superior de Arquitectura de Madrid.</w:t>
+      </w:r>
+    </w:p>
+    <w:p>
+      <w:pPr>
+        <w:pStyle w:val="BodyText"/>
+      </w:pPr>
+      <w:r>
+        <w:t xml:space="preserve">Spedding, Alison (2025).</w:t>
+      </w:r>
+      <w:r>
+        <w:t xml:space="preserve"> </w:t>
+      </w:r>
+      <w:r>
+        <w:t xml:space="preserve">“Piedras en el camino”</w:t>
+      </w:r>
+      <w:r>
+        <w:t xml:space="preserve">. En</w:t>
+      </w:r>
+      <w:r>
+        <w:t xml:space="preserve"> </w:t>
+      </w:r>
+      <w:r>
+        <w:rPr>
+          <w:i/>
+          <w:iCs/>
+        </w:rPr>
+        <w:t xml:space="preserve">Susto al susto</w:t>
+      </w:r>
+      <w:r>
+        <w:t xml:space="preserve">. La Paz: A ediciones: XIII-XXIII.</w:t>
       </w:r>
     </w:p>
     <w:p>

</xml_diff>

<commit_message>
Suma la piedra bezoar y el susto a partir del libro completo
La novela registra que el yatiri linchado vendía «piedra bezoar» (p. 66),
la jayintilla de Bertonio (p. 361). El artículo la siembra en §6 y, en
§7, lee el retorno con la cura andina del susto: volver «al territorio y
a la memoria» (Rodríguez y Rodríguez, 2025: 55). El qalachuyma se
presenta como parte de un relato de Spedding, porque el libro dice que
su texto es ficción. Diez recortes mantienen la extensión en 49.472.
Documenta el análisis del libro completo en analisis/16 y actualiza el
estado, el fichero de citas y la bibliografía (26 entradas).

Co-Authored-By: Claude Opus 5.5 <noreply@anthropic.com>
Claude-Session: https://claude.ai/code/session_01QWC9b4jcZbzQ8czhYUvPYd
</commit_message>
<xml_diff>
--- a/articulo/articulo_cosecha_de_piedras.docx
+++ b/articulo/articulo_cosecha_de_piedras.docx
@@ -359,7 +359,7 @@
         <w:pStyle w:val="BodyText"/>
       </w:pPr>
       <w:r>
-        <w:t xml:space="preserve">El narrador, además, no es inocente. La novela se publicó en Buenos Aires en 1945 y se cita aquí por una reedición paceña de 1982, cuya nota editorial asegura que el autor «ama al indio», que enseñó en la Escuela Indigenal de Warisata y que Jatun-Kolla «es, en realidad, Warisata» (Botelho Gosálvez, 1982 [1945]: 5). Aquí no se lee la novela ni como documento ni como redención. Antonio Cornejo Polar mostró que el narrador indigenista, «ajeno al mundo indio aunque se solidarice con él», imagina esa vida «más en términos de naturaleza que de historia» (Cornejo Polar, 2003 [1994]: 180). El de</w:t>
+        <w:t xml:space="preserve">El narrador, además, no es inocente. La novela se publicó en Buenos Aires en 1945 y se cita aquí por una reedición paceña de 1982, cuya nota editorial asegura que el autor «ama al indio», que enseñó en la Escuela Indigenal de Warisata y que Jatun-Kolla «es, en realidad, Warisata» (Botelho Gosálvez, 1982 [1945]: 5). Antonio Cornejo Polar mostró que el narrador indigenista, «ajeno al mundo indio aunque se solidarice con él», imagina esa vida «más en términos de naturaleza que de historia» (Cornejo Polar, 2003 [1994]: 180). El de</w:t>
       </w:r>
       <w:r>
         <w:t xml:space="preserve"> </w:t>
@@ -573,20 +573,7 @@
         <w:t xml:space="preserve"> </w:t>
       </w:r>
       <w:r>
-        <w:t xml:space="preserve">a lo que hacen las manos cuando piensan, expresan o comunican: un «neologismo homólogo al lenguaje, pero con las manos» (Cárcamo Pino, 2019: 1412, cit. en Cárcamo Pino, 2025b: 244). Escribir es una de esas acciones, y cada oficio tiene su</w:t>
-      </w:r>
-      <w:r>
-        <w:t xml:space="preserve"> </w:t>
-      </w:r>
-      <w:r>
-        <w:rPr>
-          <w:i/>
-          <w:iCs/>
-        </w:rPr>
-        <w:t xml:space="preserve">manoaje</w:t>
-      </w:r>
-      <w:r>
-        <w:t xml:space="preserve">, «un subgrupo contextual de acciones manuales» (Cárcamo Pino, 2025b: 259). Cárcamo Pino recuerda además que la misma mano hace dos agarres: el de fuerza, como al tomar un martillo, y el de precisión, como al «sujetar un papel con dos yemas dactilares» (Cárcamo Pino, 2025a: 10). Paulo Huanca sale de su chujlla «con la madera del arado en un hombro y las correas del yugo en las manos» (Botelho Gosálvez, 1982 [1945]: 34); el doctor Mendoza firma la ordenanza que dejará sin ganado a los Villca (ibid.: 96). No es una mano frente a un papel, sino dos manos con dos agarres.</w:t>
+        <w:t xml:space="preserve">a lo que hacen las manos cuando piensan, expresan o comunican: un «neologismo homólogo al lenguaje, pero con las manos» (Cárcamo Pino, 2019: 1412, cit. en Cárcamo Pino, 2025b: 244). Escribir es una de esas acciones. Cárcamo Pino recuerda además que la misma mano hace dos agarres: el de fuerza, como al tomar un martillo, y el de precisión, como al «sujetar un papel con dos yemas dactilares» (Cárcamo Pino, 2025a: 10). Paulo Huanca sale de su chujlla «con la madera del arado en un hombro y las correas del yugo en las manos» (Botelho Gosálvez, 1982 [1945]: 34); el doctor Mendoza firma la ordenanza que dejará sin ganado a los Villca (ibid.: 96). No es una mano frente a un papel, sino dos manos con dos agarres.</w:t>
       </w:r>
     </w:p>
     <w:p>
@@ -1430,7 +1417,7 @@
         <w:pStyle w:val="BodyText"/>
       </w:pPr>
       <w:r>
-        <w:t xml:space="preserve">La chujlla de los Huanca tiene dos metros de alto, paredes «renegridas por el hollín» y camastros de «apenas la altura de un adobe»; de las vigas, «mal unidas con lazos de paja trenzada», cuelgan «las hoces, el arado, el yugo de madera» (ibid.: 30-31). Junta las dos maneras de construir de Frampton: muros de piedra y adobe que pesan, y un armazón atado como una cestería (Frampton, 1995: 5). Se mide con el cuerpo y guarda las herramientas de las manos. Es una caja de herramientas, que para Cárcamo Pino es a las manos lo que un idioma a la lengua (Cárcamo Pino, 2025a: 12). El narrador, en cambio, entra como un intruso que no habita, sino que escribe: los camastros son «morada de piojos y pulgas» (Botelho Gosálvez, 1982 [1945]: 31). Pallasmaa recuerda que «la casa es una metáfora del cuerpo y el cuerpo una metáfora de la casa» (Pallasmaa, 2014: 159); el narrador hace de la chujlla una madriguera. Su umbral es el «portal de su chujlla» desde el que Paulo Huanca ve partir a los hijos que la escasez expulsa (Botelho Gosálvez, 1982 [1945]: 34).</w:t>
+        <w:t xml:space="preserve">La chujlla de los Huanca tiene dos metros de alto, paredes «renegridas por el hollín» y camastros de «apenas la altura de un adobe»; de las vigas, «mal unidas con lazos de paja trenzada», cuelgan «las hoces, el arado, el yugo de madera» (ibid.: 30-31). Junta las dos maneras de construir de Frampton: muros de piedra y adobe que pesan, y un armazón atado como una cestería (Frampton, 1995: 5). Se mide con el cuerpo y es una caja de herramientas, que para Cárcamo Pino es a las manos lo que un idioma a la lengua (Cárcamo Pino, 2025a: 12). El narrador, en cambio, entra como un intruso que no habita, sino que escribe: los camastros son «morada de piojos y pulgas» (Botelho Gosálvez, 1982 [1945]: 31). Pallasmaa recuerda que «la casa es una metáfora del cuerpo y el cuerpo una metáfora de la casa» (Pallasmaa, 2014: 159); el narrador hace de la chujlla una madriguera.</w:t>
       </w:r>
     </w:p>
     <w:p>
@@ -1484,7 +1471,7 @@
         <w:t xml:space="preserve">Texto</w:t>
       </w:r>
       <w:r>
-        <w:t xml:space="preserve">. Muros de piedra de dos metros de alto, fuego al centro, herramientas colgadas de las vigas (ibid.: 8, 30-31) y, en el techo, un crucifijo con «una pequeña huaca de barro cocido» (ibid.: 10). (2)</w:t>
+        <w:t xml:space="preserve">. Muros de piedra de dos metros de alto, fuego al centro, herramientas colgadas de las vigas (Botelho Gosálvez, 1982 [1945]: 8, 30-31) y, en el techo, un crucifijo con «una pequeña huaca de barro cocido» (ibid.: 10). (2)</w:t>
       </w:r>
       <w:r>
         <w:t xml:space="preserve"> </w:t>
@@ -1863,7 +1850,7 @@
         <w:pStyle w:val="FirstParagraph"/>
       </w:pPr>
       <w:r>
-        <w:t xml:space="preserve">El éxodo a los Yungas empieza en un umbral: «Tras de la muralla que condena el horizonte del altiplano empieza el yunga» (Botelho Gosálvez, 1982 [1945]: 108). El valle, que en el archipiélago de Zavaleta sería otro piso de la misma tierra, es para los jóvenes del ayllu una «fábula» (ibid.: 7), y del otro lado espera la finca. En la apacheta, el viento sacude el poncho de Paulo Huanca «como un gallardete clavado en la ceja de la apacheta», su familia reza de rodillas y las cumbres se alzan «semejantes a fantásticas construcciones góticas» (ibid.: 109). El narrador ve en la cordillera la arquitectura de Europa.</w:t>
+        <w:t xml:space="preserve">El éxodo a los Yungas empieza en un umbral: «Tras de la muralla que condena el horizonte del altiplano empieza el yunga» (Botelho Gosálvez, 1982 [1945]: 108). El valle, que en el archipiélago de Zavaleta sería otro piso de la misma tierra, es para los jóvenes del ayllu una «fábula» (ibid.: 7), y del otro lado espera la finca. En la apacheta, el viento sacude el poncho de Paulo Huanca «como un gallardete clavado en la ceja de la apacheta», su familia reza de rodillas y las cumbres se alzan «semejantes a fantásticas construcciones góticas» (ibid.: 109).</w:t>
       </w:r>
     </w:p>
     <w:p>
@@ -1980,7 +1967,7 @@
         <w:t xml:space="preserve"> </w:t>
       </w:r>
       <w:r>
-        <w:t xml:space="preserve">al «montón de piedras, que por superstición van haciendo los caminantes y los adoran» (Bertonio, 2011 [1612]: 317), en el que se pegaba «coca mascada con las manos» (ibid.: 349): un montón que crece con cada viajero, obra de muchas manos. La novela lo cambia por una muralla y un cuerpo clavado. En la hoja partida, los Yungas son un cambio de estado de la materia y de la mano: la cera se funde como Paulo,</w:t>
+        <w:t xml:space="preserve">al «montón de piedras, que por superstición van haciendo los caminantes y los adoran» (Bertonio, 2011 [1612]: 317), en el que se pegaba «coca mascada con las manos» (ibid.: 349): un montón que crece con cada viajero. La novela lo cambia por una muralla y un cuerpo clavado. En la hoja partida, los Yungas son un cambio de estado de la materia y de la mano: la cera se funde como Paulo,</w:t>
       </w:r>
       <w:r>
         <w:t xml:space="preserve"> </w:t>
@@ -2262,7 +2249,7 @@
         <w:pStyle w:val="BodyText"/>
       </w:pPr>
       <w:r>
-        <w:t xml:space="preserve">El yatiri Basilio Quispe es acusado de causar la sequía: de sus ropas caen «dos muñequitos de lana» atravesados por una espina (Botelho Gosálvez, 1982 [1945]: 67). Justina Huanca lo araña «como la fiera y brava hembra del puma» y «los indios le descuartizaron» (ibid.: 68). El narrador anota «un ardor bestial» y cierra con una dispersión: «cada cual se llevó un miembro»; Justina atraviesa con espinos los genitales del muerto, «sintiendo en lo íntimo de su conciencia de hembra» la venganza, y «en muchos sitios enterraron los pedazos del cuerpo» (ibid.: 69). La escena admite dos lecturas. Una pasa por Francis Bacon: en</w:t>
+        <w:t xml:space="preserve">El yatiri Basilio Quispe, que vendía «piedra bezoar» (Botelho Gosálvez, 1982 [1945]: 66), es acusado de causar la sequía: de sus ropas caen «dos muñequitos de lana» atravesados por una espina (ibid.: 67). Justina Huanca lo araña «como la fiera y brava hembra del puma» y «los indios le descuartizaron» (ibid.: 68). El narrador anota «un ardor bestial» y cierra con una dispersión: «cada cual se llevó un miembro»; Justina atraviesa con espinos los genitales del muerto, «sintiendo en lo íntimo de su conciencia de hembra» la venganza, y «en muchos sitios enterraron los pedazos del cuerpo» (ibid.: 69). La escena admite dos lecturas. Una pasa por Francis Bacon: en</w:t>
       </w:r>
       <w:r>
         <w:t xml:space="preserve"> </w:t>
@@ -2387,7 +2374,7 @@
         <w:t xml:space="preserve"> </w:t>
       </w:r>
       <w:r>
-        <w:t xml:space="preserve">era «nombre de reverencia», y se le decía «yo seré tu hijo» (Bertonio, 2011 [1612]: 420); las montañas, en cambio, suelen ser masculinas (Dean, 2010: 68), como el cerro «padre del ayllu» (Botelho Gosálvez, 1982 [1945]: 8). Lo que sí es del narrador es el tono: una tierra que «abortó en plena gestación» (ibid.: 66) y, al final, «hembra paridora» (ibid.: 159); hasta el ayllu vacío es un «solar histérico, infecundo» (ibid.: 79), de</w:t>
+        <w:t xml:space="preserve">era «nombre de reverencia», y se le decía «yo seré tu hijo» (Bertonio, 2011 [1612]: 420). Lo que sí es del narrador es el tono: una tierra que «abortó en plena gestación» (Botelho Gosálvez, 1982 [1945]: 66) y, al final, «hembra paridora» (ibid.: 159); hasta el ayllu vacío es un «solar histérico, infecundo» (ibid.: 79), de</w:t>
       </w:r>
       <w:r>
         <w:t xml:space="preserve"> </w:t>
@@ -2668,7 +2655,7 @@
         <w:pStyle w:val="FirstParagraph"/>
       </w:pPr>
       <w:r>
-        <w:t xml:space="preserve">Con las heladas vuelven los sobrevivientes: «en el dintel de Jatun-Kolla se detenían para ponerse de rodillas y besar el suelo» (Botelho Gosálvez, 1982 [1945]: 155). El ayllu tiene dintel: es una casa. Han muerto más de ciento cincuenta comunarios (ibid.: 156). Reparar es un trabajo de manos y de piedra: «Las chujllas fueron reparadas del estrago, las pircas de piedra que separan las parcelas fueron compuestas» (ibid.).</w:t>
+        <w:t xml:space="preserve">Con las heladas vuelven los sobrevivientes: «en el dintel de Jatun-Kolla se detenían para ponerse de rodillas y besar el suelo que habían abandonado en el terror» (Botelho Gosálvez, 1982 [1945]: 155). El ayllu tiene dintel: es una casa. Han muerto más de ciento cincuenta comunarios (ibid.: 156). Reparar es un trabajo de manos y de piedra: «Las chujllas fueron reparadas del estrago, las pircas de piedra que separan las parcelas fueron compuestas» (ibid.).</w:t>
       </w:r>
       <w:r>
         <w:t xml:space="preserve"> </w:t>
@@ -2734,7 +2721,7 @@
         <w:pStyle w:val="FirstParagraph"/>
       </w:pPr>
       <w:r>
-        <w:t xml:space="preserve">Muralla, foso, atalaya: recordar es construir, y olvidar también. Es lo contrario del lema del epígrafe: los comunarios de la novela no caminan mirando al pasado; lo esconden en un foso. La selección tiene nombres: «Llegaron los Villca, los Huanca, los Huallpa, los Yupanqui, los Ticona, los Choque, los Chuquihuanca» (ibid.: 156). Faltan los Condori, los Mamani y los Quispe, la «legión» sin tierra que cerraba la escalera del narrador (ibid.: 22). Juan Condori está enterrado en el cementerio de los mineros; los miembros de Basilio Quispe, «en muchos sitios» (ibid.: 69). El Signo Escalonado se rehace sin su último escalón. Una pirca de doble cara enseña lo que esa memoria olvida: las piedras grandes dan la cara, pero adentro, apretadas entre las dos caras, van las menudas, y sin ese relleno el muro se cae. El narrador también llama «legión» a la «piedrecilla menuda» que baja del cerro hasta las pircas (ibid.: 8). Los sin tierra fueron ese relleno: tres de ellos, sin nombre, cuidaron el ayllu vacío, y el retorno no los cuenta. Con la cosecha, los derrotados «olvidaron la pesadilla pasada», y la Pachamama recuperó «su prestigio de hembra paridora y múltiple» (ibid.: 159). Endurecerse para no sufrir la pérdida tiene nombre en aymara:</w:t>
+        <w:t xml:space="preserve">Muralla, foso, atalaya: recordar es construir, y olvidar también. Es lo contrario del lema del epígrafe: los comunarios de la novela no caminan mirando al pasado; lo esconden en un foso. La selección tiene nombres: «Llegaron los Villca, los Huanca, los Huallpa, los Yupanqui, los Ticona, los Choque, los Chuquihuanca» (ibid.: 156). Faltan los Condori, los Mamani y los Quispe, la «legión» sin tierra que cerraba la escalera del narrador (ibid.: 22). Juan Condori está enterrado en el cementerio de los mineros; los miembros de Basilio Quispe, «en muchos sitios» (ibid.: 69). El Signo Escalonado se rehace sin su último escalón. Una pirca de doble cara enseña lo que esa memoria olvida: las piedras grandes dan la cara, pero adentro, apretadas entre las dos caras, van las menudas, y sin ese relleno el muro se cae. El narrador también llama «legión» a la «piedrecilla menuda» que baja del cerro hasta las pircas (ibid.: 8). Los sin tierra fueron ese relleno: tres de ellos, sin nombre, cuidaron el ayllu vacío, y el retorno no los cuenta. Con la cosecha, los derrotados «olvidaron la pesadilla pasada» (ibid.: 159). Endurecerse para no sufrir la pérdida tiene nombre en aymara:</w:t>
       </w:r>
       <w:r>
         <w:t xml:space="preserve"> </w:t>
@@ -2747,7 +2734,23 @@
         <w:t xml:space="preserve">qalachuyma</w:t>
       </w:r>
       <w:r>
-        <w:t xml:space="preserve">, «corazón de piedra»; para volverse así, «hay que lamer el batán de moler» (Spedding, 2025: XV). La paz se paga con ese olvido.</w:t>
+        <w:t xml:space="preserve">, «corazón de piedra»; en un relato de Spedding, para volverse así «hay que lamer el batán de moler» (Spedding, 2025: XV). Contra el susto, la piedra se usa al revés: se come el bezoar del yatiri, en aymara</w:t>
+      </w:r>
+      <w:r>
+        <w:t xml:space="preserve"> </w:t>
+      </w:r>
+      <w:r>
+        <w:rPr>
+          <w:i/>
+          <w:iCs/>
+        </w:rPr>
+        <w:t xml:space="preserve">jayintilla</w:t>
+      </w:r>
+      <w:r>
+        <w:t xml:space="preserve"> </w:t>
+      </w:r>
+      <w:r>
+        <w:t xml:space="preserve">(Bertonio, 2011 [1612]: 361), o la tierra del lugar del miedo, para «retornar al territorio y a la memoria» (Rodríguez y Rodríguez, 2025: 55). Los comunarios besan el suelo, pero no vuelven a la memoria. La paz se paga con ese olvido.</w:t>
       </w:r>
     </w:p>
     <w:p>
@@ -3390,6 +3393,36 @@
         <w:pStyle w:val="BodyText"/>
       </w:pPr>
       <w:r>
+        <w:t xml:space="preserve">Rodríguez, Malena y Rodríguez, Gabriel (2025).</w:t>
+      </w:r>
+      <w:r>
+        <w:t xml:space="preserve"> </w:t>
+      </w:r>
+      <w:r>
+        <w:t xml:space="preserve">“Susto andino y violencia política”</w:t>
+      </w:r>
+      <w:r>
+        <w:t xml:space="preserve">. En Eloísa Paz y alfonso borragán (dirs.),</w:t>
+      </w:r>
+      <w:r>
+        <w:t xml:space="preserve"> </w:t>
+      </w:r>
+      <w:r>
+        <w:rPr>
+          <w:i/>
+          <w:iCs/>
+        </w:rPr>
+        <w:t xml:space="preserve">Susto al susto</w:t>
+      </w:r>
+      <w:r>
+        <w:t xml:space="preserve">. La Paz: A ediciones: 43-61.</w:t>
+      </w:r>
+    </w:p>
+    <w:p>
+      <w:pPr>
+        <w:pStyle w:val="BodyText"/>
+      </w:pPr>
+      <w:r>
         <w:t xml:space="preserve">Scott, James C. (2020 [1998]).</w:t>
       </w:r>
       <w:r>
@@ -3441,7 +3474,7 @@
         <w:t xml:space="preserve">“Piedras en el camino”</w:t>
       </w:r>
       <w:r>
-        <w:t xml:space="preserve">. En</w:t>
+        <w:t xml:space="preserve">. En Eloísa Paz y alfonso borragán (dirs.),</w:t>
       </w:r>
       <w:r>
         <w:t xml:space="preserve"> </w:t>
@@ -3594,7 +3627,7 @@
         <w:t xml:space="preserve"> </w:t>
       </w:r>
       <w:r>
-        <w:t xml:space="preserve">El pastel al óleo es pigmento unido con cera y aceite. A diferencia de la tinta, que fija la línea al secar, no llega a secar del todo: se puede empastar, arrastrar con el dedo, raspar con una punta hasta descubrir la capa de abajo (esgrafiado) o disolver con solvente. Por eso se trabaja sumando y quitando materia, como se modela un barro o se limpia un campo, más que trazando líneas.</w:t>
+        <w:t xml:space="preserve">El pastel al óleo es pigmento unido con cera y aceite. A diferencia de la tinta, que fija la línea al secar, no llega a secar del todo: se puede empastar, arrastrar con el dedo, raspar con una punta hasta descubrir la capa de abajo (esgrafiado) o disolver con solvente. Por eso se trabaja sumando y quitando materia, como se limpia un campo, más que trazando líneas.</w:t>
       </w:r>
     </w:p>
   </w:footnote>

</xml_diff>

<commit_message>
Suma dos diagramas de boceto y ajusta los prompts al estilo
- Figura 7 (§7): la memoria del retorno en sección, con atalaya, muralla
  de doble cara, foso y horizonte.
- Figura 8 (conclusiones): tres montones, piedra, papel y máquina, con lo
  que entra, lo que sale y quién queda debajo en cada lugar.
- Generador con rough.js y la letra Caveat (licencias incluidas) y
  generar_figuras.py ampliado para los diagramas.
- Declaración de IA al día y cinco recortes: 49.485 caracteres.
- analisis/18 (evaluación del estilo) y 19 (esquemas a mano y diagramas);
  prompts de 17 ajustados; README, 01, 04 y LEEME al día.

Co-Authored-By: Claude Opus 5.5 <noreply@anthropic.com>
Claude-Session: https://claude.ai/code/session_01QWC9b4jcZbzQ8czhYUvPYd
</commit_message>
<xml_diff>
--- a/articulo/articulo_cosecha_de_piedras.docx
+++ b/articulo/articulo_cosecha_de_piedras.docx
@@ -2,7 +2,7 @@
 <file path=word/document.xml><?xml version="1.0" encoding="utf-8"?>
 <w:document xmlns:w="http://schemas.openxmlformats.org/wordprocessingml/2006/main" xmlns:m="http://schemas.openxmlformats.org/officeDocument/2006/math" xmlns:r="http://schemas.openxmlformats.org/officeDocument/2006/relationships" xmlns:o="urn:schemas-microsoft-com:office:office" xmlns:v="urn:schemas-microsoft-com:vml" xmlns:w10="urn:schemas-microsoft-com:office:word" xmlns:a="http://schemas.openxmlformats.org/drawingml/2006/main" xmlns:pic="http://schemas.openxmlformats.org/drawingml/2006/picture" xmlns:wp="http://schemas.openxmlformats.org/drawingml/2006/wordprocessingDrawing">
   <w:body>
-    <w:bookmarkStart w:id="40" w:name="Xfdf5c4b111121f61c3e47682ce38e3b1cc2db9c"/>
+    <w:bookmarkStart w:id="46" w:name="Xfdf5c4b111121f61c3e47682ce38e3b1cc2db9c"/>
     <w:p>
       <w:pPr>
         <w:pStyle w:val="Heading1"/>
@@ -243,7 +243,7 @@
         <w:t xml:space="preserve"> </w:t>
       </w:r>
       <w:r>
-        <w:t xml:space="preserve">justamente lo que impide sembrar. Esas piedras cambian de oficio. Con ellas se hicieron «los cimientos y paredes de las chujllas» (ibid.: 8), las chozas del ayllu. Con ellas cubre Juan Condori a su compañera muerta: «amontonó piedras sobre el cadáver» (ibid.: 35). Y a Condori, asesinado en la mina, lo sepulta «un informe montón de rocas, lodo y maderos astillados» (ibid.: 154). Pirca, casa, tumba, escombro: el montón de piedras es la arquitectura mínima de</w:t>
+        <w:t xml:space="preserve">lo que impide sembrar. Esas piedras cambian de oficio. Con ellas se hicieron «los cimientos y paredes de las chujllas» (ibid.: 8), las chozas del ayllu. Con ellas cubre Juan Condori a su compañera muerta: «amontonó piedras sobre el cadáver» (ibid.: 35). Y a Condori, asesinado en la mina, lo sepulta «un informe montón de rocas, lodo y maderos astillados» (ibid.: 154). Pirca, casa, tumba, escombro: el montón de piedras es la arquitectura mínima de</w:t>
       </w:r>
       <w:r>
         <w:t xml:space="preserve"> </w:t>
@@ -438,7 +438,7 @@
         <w:pStyle w:val="BodyText"/>
       </w:pPr>
       <w:r>
-        <w:t xml:space="preserve">En Bolivia, René Zavaleta Mercado opuso «dos concepciones que son ambas espacialistas»: la andina, un «archipiélago» en el que «este espacio no puede concebirse sin otro espacio», y la señorial, que concibe «el dominio final del suelo como atribución ligada a una estirpe» (Zavaleta Mercado, 1986: 29-30). Es decir: para la primera, la tierra es un conjunto de lugares a distintas alturas que se trabajan juntos, como la puna y el valle; para la segunda, un terreno cercado que se hereda por apellido.</w:t>
+        <w:t xml:space="preserve">En Bolivia, René Zavaleta Mercado opuso «dos concepciones que son ambas espacialistas»: la andina, un «archipiélago» en el que «este espacio no puede concebirse sin otro espacio», y la señorial, que concibe «el dominio final del suelo como atribución ligada a una estirpe» (Zavaleta Mercado, 1986: 29-30). Es decir: para la primera, la tierra reúne lugares a distintas alturas que se trabajan juntos, como la puna y el valle; para la segunda, un terreno cercado que se hereda por apellido.</w:t>
       </w:r>
       <w:r>
         <w:t xml:space="preserve"> </w:t>
@@ -1471,7 +1471,7 @@
         <w:t xml:space="preserve">Texto</w:t>
       </w:r>
       <w:r>
-        <w:t xml:space="preserve">. Muros de piedra de dos metros de alto, fuego al centro, herramientas colgadas de las vigas (Botelho Gosálvez, 1982 [1945]: 8, 30-31) y, en el techo, un crucifijo con «una pequeña huaca de barro cocido» (ibid.: 10). (2)</w:t>
+        <w:t xml:space="preserve">. Muros de piedra, fuego al centro, herramientas colgadas (Botelho Gosálvez, 1982 [1945]: 8, 30-31) y, en el techo, un crucifijo con «una pequeña huaca de barro cocido» (ibid.: 10). (2)</w:t>
       </w:r>
       <w:r>
         <w:t xml:space="preserve"> </w:t>
@@ -2641,7 +2641,7 @@
       </w:r>
     </w:p>
     <w:bookmarkEnd w:id="35"/>
-    <w:bookmarkStart w:id="36" w:name="Xd33dadc6dc41c4f190a3160c8a87a45b956b4eb"/>
+    <w:bookmarkStart w:id="39" w:name="Xd33dadc6dc41c4f190a3160c8a87a45b956b4eb"/>
     <w:p>
       <w:pPr>
         <w:pStyle w:val="Heading2"/>
@@ -2721,7 +2721,7 @@
         <w:pStyle w:val="FirstParagraph"/>
       </w:pPr>
       <w:r>
-        <w:t xml:space="preserve">Muralla, foso, atalaya: recordar es construir, y olvidar también. Es lo contrario del lema del epígrafe: los comunarios de la novela no caminan mirando al pasado; lo esconden en un foso. La selección tiene nombres: «Llegaron los Villca, los Huanca, los Huallpa, los Yupanqui, los Ticona, los Choque, los Chuquihuanca» (ibid.: 156). Faltan los Condori, los Mamani y los Quispe, la «legión» sin tierra que cerraba la escalera del narrador (ibid.: 22). Juan Condori está enterrado en el cementerio de los mineros; los miembros de Basilio Quispe, «en muchos sitios» (ibid.: 69). El Signo Escalonado se rehace sin su último escalón. Una pirca de doble cara enseña lo que esa memoria olvida: las piedras grandes dan la cara, pero adentro, apretadas entre las dos caras, van las menudas, y sin ese relleno el muro se cae. El narrador también llama «legión» a la «piedrecilla menuda» que baja del cerro hasta las pircas (ibid.: 8). Los sin tierra fueron ese relleno: tres de ellos, sin nombre, cuidaron el ayllu vacío, y el retorno no los cuenta. Con la cosecha, los derrotados «olvidaron la pesadilla pasada» (ibid.: 159). Endurecerse para no sufrir la pérdida tiene nombre en aymara:</w:t>
+        <w:t xml:space="preserve">Muralla, foso, atalaya: recordar es construir, y olvidar también (Figura 7). Es lo contrario del lema del epígrafe: los comunarios de la novela no caminan mirando al pasado; lo esconden en un foso. La selección tiene nombres: «Llegaron los Villca, los Huanca, los Huallpa, los Yupanqui, los Ticona, los Choque, los Chuquihuanca» (ibid.: 156). Faltan los Condori, los Mamani y los Quispe, la «legión» sin tierra que cerraba la escalera del narrador (ibid.: 22). El Signo Escalonado se rehace sin su último escalón. Una pirca de doble cara enseña lo que esa memoria olvida: las piedras grandes dan la cara, pero adentro van las menudas, y sin ese relleno el muro se cae. El narrador también llama «legión» a la «piedrecilla menuda» que baja del cerro hasta las pircas (ibid.: 8). Los sin tierra fueron ese relleno: tres de ellos, sin nombre, cuidaron el ayllu vacío, y el retorno no los cuenta. Con la cosecha, los derrotados «olvidaron la pesadilla pasada» (ibid.: 159). Endurecerse para no sufrir la pérdida tiene nombre en aymara:</w:t>
       </w:r>
       <w:r>
         <w:t xml:space="preserve"> </w:t>
@@ -2755,120 +2755,264 @@
     </w:p>
     <w:p>
       <w:pPr>
-        <w:pStyle w:val="BodyText"/>
-      </w:pPr>
-      <w:r>
-        <w:t xml:space="preserve">Ursula K. Le Guin opuso dos formas de contar: la del arma y la del recipiente. «Una novela es un botiquín», escribió, «que contiene cosas en una relación particular, poderosa, entre sí, y con nosotros» (Le Guin, 2021 [1986]: 10). La mina pertenece a la historia del arma: jornal, revólver, boquete. El ayllu del retorno, a la del recipiente: la casa, «un recipiente para personas» (ibid.: 8), vuelve a guardar la cosecha y a reunir los nombres. Pero todo recipiente elige qué guarda. El narrador cierra con héroes: los derrotados vuelven a ser «los patriarcas fecundadores del suelo, los sembradores del destino» (Botelho Gosálvez, 1982 [1945]: 159). El héroe, advierte Le Guin, no cabe en la bolsa: «Necesita un escenario, o un pedestal, o una cima» (Le Guin, 2021 [1986]: 11). Aquí, la atalaya. La novela, que guarda lo que el ayllu prefiere no mirar, es el recipiente más grande.</w:t>
-      </w:r>
-    </w:p>
-    <w:bookmarkEnd w:id="36"/>
-    <w:bookmarkStart w:id="37" w:name="X6513926464102a35f22aafc801b0596a5c3805e"/>
-    <w:p>
-      <w:pPr>
-        <w:pStyle w:val="Heading2"/>
-      </w:pPr>
-      <w:r>
-        <w:t xml:space="preserve">8. Conclusiones: lo que muestra el dibujo y sus límites</w:t>
-      </w:r>
-    </w:p>
-    <w:p>
-      <w:pPr>
-        <w:pStyle w:val="FirstParagraph"/>
-      </w:pPr>
-      <w:r>
-        <w:t xml:space="preserve">La lectura permite sostener cuatro hallazgos. Primero: el montón de piedras es la arquitectura mínima de la novela, masa sin edificio, y la cosecha de estaño que promete el capataz (Botelho Gosálvez, 1982 [1945]: 142) es la captura de ese gesto por la máquina. Segundo: el Signo Escalonado vuelve a escalonar a la gente en el ayllu, la aldea, el cocal y el campamento, y el retorno lo rehace sin su último escalón. Tercero: el despojo funciona con una cadena de personas, instituciones y soportes (expediente, papel sellado, radio urbano, infolio, huella dactilar) que vuelven legibles la tierra y los cuerpos. La oposición entre la mano y el papel es el discurso de la aldea, y la novela la confirma al callar lo que los aymaras hicieron con la escritura: títulos coloniales, tinterillos aliados, escuelas propias. Cuarto: el narrador, que convierte a los comunarios en piedra fuera de la historia y culmina su desigualdad de género en la muchacha sin nombre, vuelve paisaje una posesión que la novela, a sus espaldas, deja escrita en la piedra: mojones, pircas, linderos, un apellido.</w:t>
-      </w:r>
-    </w:p>
-    <w:p>
-      <w:pPr>
-        <w:pStyle w:val="BodyText"/>
-      </w:pPr>
-      <w:r>
-        <w:t xml:space="preserve">¿Qué muestra el dibujo? Ante todo, posiciones. Los esquemas obligan a decidir lo que el texto deja abierto (desde dónde se mira, a qué escala, qué queda dentro y qué fuera), y cada decisión deja ver la del narrador: fuera de la chujlla, en la tribuna del linchamiento, frente a las cumbres góticas. Cuando la decisión es del dibujante, como el cráneo o los mojones, la comparación con el texto y con el vocabulario aymara dice si se sostiene. Además, las operaciones del pastel (sumar, quitar, manchar, rayar, disolver) repiten las de la novela: amontonar, despejar, dejar «manchones» (ibid.: 60, 156), escribir, derretirse. Leer con la mano no es solo ilustrar escenas, sino repetir operaciones: un manuaje de la lectura, táctil como la prosa que lee.</w:t>
-      </w:r>
-    </w:p>
-    <w:p>
-      <w:pPr>
-        <w:pStyle w:val="BodyText"/>
-      </w:pPr>
-      <w:r>
-        <w:t xml:space="preserve">El trabajo tiene tres límites. El primero es el que advertía Hall: el corte, el</w:t>
-      </w:r>
-      <w:r>
-        <w:t xml:space="preserve"> </w:t>
-      </w:r>
-      <w:r>
-        <w:rPr>
-          <w:i/>
-          <w:iCs/>
-        </w:rPr>
-        <w:t xml:space="preserve">capriccio</w:t>
-      </w:r>
-      <w:r>
-        <w:t xml:space="preserve">, Bacon, la tectónica y hasta la pelvis son maneras de ver ajenas al mundo narrado. Los dibujos hablan de la novela, no del ayllu ni de la manera aymara de entender el espacio, que pedirían otras fuentes y otros autores: los de la historia que los aymaras, escribía Roberto Choque Canqui, «hace tiempo, hemos añorado por escribir» (Choque Canqui, 1978 [1974]: s. p.). El segundo es ético: la inmersión seduce, y un pastel puede embellecer la miseria o fabricar efigies; por eso la serie no dibuja el linchamiento ni el alma que el narrador declara cerrada. El tercero es de método: el dibujo depende de los datos del texto y hereda sus silencios. Puede hacerlos visibles, pero no llenarlos.</w:t>
-      </w:r>
-    </w:p>
-    <w:p>
-      <w:pPr>
-        <w:pStyle w:val="BodyText"/>
-      </w:pPr>
-      <w:r>
-        <w:t xml:space="preserve">Queda el montón. «Quizá un día la montaña de piedras sobrepase la altura del cerro», esperaban los comunarios (Botelho Gosálvez, 1982 [1945]: 9). La novela cumple la profecía al revés: la montaña crece en el desmonte de la mina y en el «informe montón» que sepulta a Juan Condori (ibid.: 154). El dibujo no repara lo que la novela deja caer al foso; a lo sumo, puede impedir que el foso se cierre. Si en Jatun-Kolla habitar es despejar piedras, leer</w:t>
-      </w:r>
-      <w:r>
-        <w:t xml:space="preserve"> </w:t>
-      </w:r>
-      <w:r>
-        <w:rPr>
-          <w:i/>
-          <w:iCs/>
-        </w:rPr>
-        <w:t xml:space="preserve">Altiplano</w:t>
-      </w:r>
-      <w:r>
-        <w:t xml:space="preserve"> </w:t>
-      </w:r>
-      <w:r>
-        <w:t xml:space="preserve">con la mano es, quizá, volver a amontonarlas para ver qué queda debajo.</w:t>
-      </w:r>
-    </w:p>
-    <w:bookmarkEnd w:id="37"/>
-    <w:bookmarkStart w:id="38" w:name="declaraciones-finales"/>
-    <w:p>
-      <w:pPr>
-        <w:pStyle w:val="Heading2"/>
-      </w:pPr>
-      <w:r>
-        <w:t xml:space="preserve">Declaraciones finales</w:t>
-      </w:r>
-    </w:p>
-    <w:p>
-      <w:pPr>
-        <w:pStyle w:val="FirstParagraph"/>
+        <w:pStyle w:val="Figura"/>
+      </w:pPr>
+      <w:r>
+        <w:drawing>
+          <wp:inline>
+            <wp:extent cx="5039999" cy="2995199"/>
+            <wp:effectExtent b="0" l="0" r="0" t="0"/>
+            <wp:docPr descr="" title="" id="37" name="Picture"/>
+            <a:graphic>
+              <a:graphicData uri="http://schemas.openxmlformats.org/drawingml/2006/picture">
+                <pic:pic>
+                  <pic:nvPicPr>
+                    <pic:cNvPr descr="figuras/figura_7.png" id="38" name="Picture"/>
+                    <pic:cNvPicPr>
+                      <a:picLocks noChangeArrowheads="1" noChangeAspect="1"/>
+                    </pic:cNvPicPr>
+                  </pic:nvPicPr>
+                  <pic:blipFill>
+                    <a:blip r:embed="rId36"/>
+                    <a:stretch>
+                      <a:fillRect/>
+                    </a:stretch>
+                  </pic:blipFill>
+                  <pic:spPr bwMode="auto">
+                    <a:xfrm>
+                      <a:off x="0" y="0"/>
+                      <a:ext cx="5039999" cy="2995199"/>
+                    </a:xfrm>
+                    <a:prstGeom prst="rect">
+                      <a:avLst/>
+                    </a:prstGeom>
+                    <a:noFill/>
+                    <a:ln w="9525">
+                      <a:noFill/>
+                      <a:headEnd/>
+                      <a:tailEnd/>
+                    </a:ln>
+                  </pic:spPr>
+                </pic:pic>
+              </a:graphicData>
+            </a:graphic>
+          </wp:inline>
+        </w:drawing>
+      </w:r>
+    </w:p>
+    <w:p>
+      <w:pPr>
+        <w:pStyle w:val="Piedefigura"/>
       </w:pPr>
       <w:r>
         <w:rPr>
           <w:b/>
           <w:bCs/>
         </w:rPr>
-        <w:t xml:space="preserve">Conflicto de intereses.</w:t>
-      </w:r>
-      <w:r>
-        <w:t xml:space="preserve"> </w:t>
-      </w:r>
-      <w:r>
-        <w:t xml:space="preserve">El autor declara no tener conflictos de intereses.</w:t>
-      </w:r>
-    </w:p>
-    <w:p>
-      <w:pPr>
-        <w:pStyle w:val="BodyText"/>
+        <w:t xml:space="preserve">Figura 7.</w:t>
+      </w:r>
+      <w:r>
+        <w:t xml:space="preserve"> </w:t>
+      </w:r>
+      <w:r>
+        <w:rPr>
+          <w:i/>
+          <w:iCs/>
+        </w:rPr>
+        <w:t xml:space="preserve">La memoria del retorno</w:t>
+      </w:r>
+      <w:r>
+        <w:t xml:space="preserve">. Diagrama. Fuente: elaboración propia con asistencia de IA.</w:t>
+      </w:r>
+    </w:p>
+    <w:p>
+      <w:pPr>
+        <w:pStyle w:val="BodyText"/>
+      </w:pPr>
+      <w:r>
+        <w:t xml:space="preserve">Ursula K. Le Guin opuso dos formas de contar: la del arma y la del recipiente. «Una novela es un botiquín», escribió, «que contiene cosas en una relación particular, poderosa, entre sí, y con nosotros» (Le Guin, 2021 [1986]: 10). La mina pertenece a la historia del arma: jornal, revólver, boquete. El ayllu del retorno, a la del recipiente: la casa, «un recipiente para personas» (ibid.: 8), vuelve a guardar la cosecha y a reunir los nombres. Pero todo recipiente elige qué guarda. El narrador cierra con héroes: los derrotados vuelven a ser «los patriarcas fecundadores del suelo, los sembradores del destino» (Botelho Gosálvez, 1982 [1945]: 159). El héroe, advierte Le Guin, no cabe en la bolsa: «Necesita un escenario, o un pedestal, o una cima» (Le Guin, 2021 [1986]: 11). Aquí, la atalaya. La novela, que guarda lo que el ayllu prefiere no mirar, es el recipiente más grande.</w:t>
+      </w:r>
+    </w:p>
+    <w:bookmarkEnd w:id="39"/>
+    <w:bookmarkStart w:id="43" w:name="X6513926464102a35f22aafc801b0596a5c3805e"/>
+    <w:p>
+      <w:pPr>
+        <w:pStyle w:val="Heading2"/>
+      </w:pPr>
+      <w:r>
+        <w:t xml:space="preserve">8. Conclusiones: lo que muestra el dibujo y sus límites</w:t>
+      </w:r>
+    </w:p>
+    <w:p>
+      <w:pPr>
+        <w:pStyle w:val="FirstParagraph"/>
+      </w:pPr>
+      <w:r>
+        <w:t xml:space="preserve">La lectura permite sostener cuatro hallazgos. Primero: el montón de piedras es la arquitectura mínima de la novela, masa sin edificio, y la cosecha de estaño que promete el capataz (Botelho Gosálvez, 1982 [1945]: 142) es la captura de ese gesto por la máquina (Figura 8). Segundo: el Signo Escalonado vuelve a escalonar a la gente en el ayllu, la aldea, el cocal y el campamento, y el retorno lo rehace sin su último escalón. Tercero: el despojo funciona con una cadena de personas, instituciones y soportes (expediente, papel sellado, radio urbano, infolio, huella dactilar) que vuelven legibles la tierra y los cuerpos. La oposición entre la mano y el papel es el discurso de la aldea, y la novela la confirma al callar lo que los aymaras hicieron con la escritura: títulos coloniales, tinterillos aliados, escuelas propias. Cuarto: el narrador, que convierte a los comunarios en piedra fuera de la historia y culmina su desigualdad de género en la muchacha sin nombre, vuelve paisaje una posesión que la novela, a sus espaldas, deja escrita en la piedra: mojones, pircas, linderos, un apellido.</w:t>
+      </w:r>
+    </w:p>
+    <w:p>
+      <w:pPr>
+        <w:pStyle w:val="Figura"/>
+      </w:pPr>
+      <w:r>
+        <w:drawing>
+          <wp:inline>
+            <wp:extent cx="5039999" cy="3110399"/>
+            <wp:effectExtent b="0" l="0" r="0" t="0"/>
+            <wp:docPr descr="" title="" id="41" name="Picture"/>
+            <a:graphic>
+              <a:graphicData uri="http://schemas.openxmlformats.org/drawingml/2006/picture">
+                <pic:pic>
+                  <pic:nvPicPr>
+                    <pic:cNvPr descr="figuras/figura_8.png" id="42" name="Picture"/>
+                    <pic:cNvPicPr>
+                      <a:picLocks noChangeArrowheads="1" noChangeAspect="1"/>
+                    </pic:cNvPicPr>
+                  </pic:nvPicPr>
+                  <pic:blipFill>
+                    <a:blip r:embed="rId40"/>
+                    <a:stretch>
+                      <a:fillRect/>
+                    </a:stretch>
+                  </pic:blipFill>
+                  <pic:spPr bwMode="auto">
+                    <a:xfrm>
+                      <a:off x="0" y="0"/>
+                      <a:ext cx="5039999" cy="3110399"/>
+                    </a:xfrm>
+                    <a:prstGeom prst="rect">
+                      <a:avLst/>
+                    </a:prstGeom>
+                    <a:noFill/>
+                    <a:ln w="9525">
+                      <a:noFill/>
+                      <a:headEnd/>
+                      <a:tailEnd/>
+                    </a:ln>
+                  </pic:spPr>
+                </pic:pic>
+              </a:graphicData>
+            </a:graphic>
+          </wp:inline>
+        </w:drawing>
+      </w:r>
+    </w:p>
+    <w:p>
+      <w:pPr>
+        <w:pStyle w:val="Piedefigura"/>
       </w:pPr>
       <w:r>
         <w:rPr>
           <w:b/>
           <w:bCs/>
         </w:rPr>
+        <w:t xml:space="preserve">Figura 8.</w:t>
+      </w:r>
+      <w:r>
+        <w:t xml:space="preserve"> </w:t>
+      </w:r>
+      <w:r>
+        <w:rPr>
+          <w:i/>
+          <w:iCs/>
+        </w:rPr>
+        <w:t xml:space="preserve">Tres montones</w:t>
+      </w:r>
+      <w:r>
+        <w:t xml:space="preserve">. Diagrama. Fuente: elaboración propia con asistencia de IA.</w:t>
+      </w:r>
+    </w:p>
+    <w:p>
+      <w:pPr>
+        <w:pStyle w:val="BodyText"/>
+      </w:pPr>
+      <w:r>
+        <w:t xml:space="preserve">¿Qué muestra el dibujo? Ante todo, posiciones. Los esquemas obligan a decidir lo que el texto deja abierto (desde dónde se mira, a qué escala, qué queda dentro y qué fuera), y cada decisión deja ver la del narrador: fuera de la chujlla, en la tribuna del linchamiento, frente a las cumbres góticas. Cuando la decisión es del dibujante, como el cráneo o los mojones, la comparación con el texto y con el vocabulario aymara dice si se sostiene. Además, las operaciones del pastel (sumar, quitar, manchar, rayar, disolver) repiten las de la novela: amontonar, despejar, dejar «manchones» (ibid.: 60, 156), escribir, derretirse. Leer con la mano no es solo ilustrar escenas, sino repetir operaciones: un manuaje de la lectura, táctil como la prosa que lee.</w:t>
+      </w:r>
+    </w:p>
+    <w:p>
+      <w:pPr>
+        <w:pStyle w:val="BodyText"/>
+      </w:pPr>
+      <w:r>
+        <w:t xml:space="preserve">El trabajo tiene tres límites. El primero es el que advertía Hall: el corte, el</w:t>
+      </w:r>
+      <w:r>
+        <w:t xml:space="preserve"> </w:t>
+      </w:r>
+      <w:r>
+        <w:rPr>
+          <w:i/>
+          <w:iCs/>
+        </w:rPr>
+        <w:t xml:space="preserve">capriccio</w:t>
+      </w:r>
+      <w:r>
+        <w:t xml:space="preserve">, Bacon, la tectónica y hasta la pelvis son maneras de ver ajenas al mundo narrado. Los dibujos hablan de la novela, no del ayllu ni de la manera aymara de entender el espacio, que pedirían otras fuentes y otros autores: los de la historia que los aymaras, escribía Roberto Choque Canqui, «hace tiempo, hemos añorado por escribir» (Choque Canqui, 1978 [1974]: s. p.). El segundo es ético: la inmersión seduce, y un pastel puede embellecer la miseria o fabricar efigies; por eso la serie no dibuja el linchamiento ni el alma que el narrador declara cerrada. El tercero es de método: el dibujo depende de los datos del texto y hereda sus silencios. Puede hacerlos visibles, pero no llenarlos.</w:t>
+      </w:r>
+    </w:p>
+    <w:p>
+      <w:pPr>
+        <w:pStyle w:val="BodyText"/>
+      </w:pPr>
+      <w:r>
+        <w:t xml:space="preserve">Queda el montón. «Quizá un día la montaña de piedras sobrepase la altura del cerro», esperaban los comunarios (Botelho Gosálvez, 1982 [1945]: 9). La novela cumple la profecía al revés: la montaña crece en el desmonte de la mina y en el «informe montón» que sepulta a Juan Condori (ibid.: 154). El dibujo no repara lo que la novela deja caer al foso; a lo sumo, puede impedir que el foso se cierre. Si en Jatun-Kolla habitar es despejar piedras, leer</w:t>
+      </w:r>
+      <w:r>
+        <w:t xml:space="preserve"> </w:t>
+      </w:r>
+      <w:r>
+        <w:rPr>
+          <w:i/>
+          <w:iCs/>
+        </w:rPr>
+        <w:t xml:space="preserve">Altiplano</w:t>
+      </w:r>
+      <w:r>
+        <w:t xml:space="preserve"> </w:t>
+      </w:r>
+      <w:r>
+        <w:t xml:space="preserve">con la mano es, quizá, volver a amontonarlas para ver qué queda debajo.</w:t>
+      </w:r>
+    </w:p>
+    <w:bookmarkEnd w:id="43"/>
+    <w:bookmarkStart w:id="44" w:name="declaraciones-finales"/>
+    <w:p>
+      <w:pPr>
+        <w:pStyle w:val="Heading2"/>
+      </w:pPr>
+      <w:r>
+        <w:t xml:space="preserve">Declaraciones finales</w:t>
+      </w:r>
+    </w:p>
+    <w:p>
+      <w:pPr>
+        <w:pStyle w:val="FirstParagraph"/>
+      </w:pPr>
+      <w:r>
+        <w:rPr>
+          <w:b/>
+          <w:bCs/>
+        </w:rPr>
+        <w:t xml:space="preserve">Conflicto de intereses.</w:t>
+      </w:r>
+      <w:r>
+        <w:t xml:space="preserve"> </w:t>
+      </w:r>
+      <w:r>
+        <w:t xml:space="preserve">El autor declara no tener conflictos de intereses.</w:t>
+      </w:r>
+    </w:p>
+    <w:p>
+      <w:pPr>
+        <w:pStyle w:val="BodyText"/>
+      </w:pPr>
+      <w:r>
+        <w:rPr>
+          <w:b/>
+          <w:bCs/>
+        </w:rPr>
         <w:t xml:space="preserve">Declaración de uso de inteligencia artificial.</w:t>
       </w:r>
       <w:r>
@@ -2888,7 +3032,7 @@
         <w:t xml:space="preserve">Herramientas</w:t>
       </w:r>
       <w:r>
-        <w:t xml:space="preserve">: Claude (Anthropic) y ChatGPT (OpenAI), asistentes de inteligencia artificial generativa. b)</w:t>
+        <w:t xml:space="preserve">: Claude (Anthropic) y ChatGPT (OpenAI), asistentes de IA generativa. b)</w:t>
       </w:r>
       <w:r>
         <w:t xml:space="preserve"> </w:t>
@@ -2901,7 +3045,7 @@
         <w:t xml:space="preserve">Alcance</w:t>
       </w:r>
       <w:r>
-        <w:t xml:space="preserve">: se emplearon en la exploración bibliográfica, la transcripción y paginación de fuentes digitalizadas, la localización y el cotejo de citas con su página, el contraste de pasajes de la novela, la revisión conceptual y la redacción de borradores, y la codificación vectorial de los esquemas de encaje de las figuras 1 a 6. c)</w:t>
+        <w:t xml:space="preserve">: se emplearon en la exploración bibliográfica, la transcripción y paginación de fuentes digitalizadas, la localización y el cotejo de citas con su página, el contraste de pasajes de la novela, la revisión conceptual y la redacción de borradores, y la codificación vectorial de los esquemas de encaje (figuras 1-6) y el diseño y trazado de los diagramas (figuras 7 y 8). c)</w:t>
       </w:r>
       <w:r>
         <w:t xml:space="preserve"> </w:t>
@@ -2917,8 +3061,8 @@
         <w:t xml:space="preserve">: el autor concibió la hipótesis original, diseñó la metodología de lectura tectónica, seleccionó las fuentes, decidió las interpretaciones, dirigió y revisó la redacción y es autor exclusivo de los pasteles al óleo que sustentan la investigación; asume la plena responsabilidad intelectual por la versión final del manuscrito.</w:t>
       </w:r>
     </w:p>
-    <w:bookmarkEnd w:id="38"/>
-    <w:bookmarkStart w:id="39" w:name="bibliografía"/>
+    <w:bookmarkEnd w:id="44"/>
+    <w:bookmarkStart w:id="45" w:name="bibliografía"/>
     <w:p>
       <w:pPr>
         <w:pStyle w:val="Heading2"/>
@@ -3541,8 +3685,8 @@
         <w:t xml:space="preserve">. México: Siglo XXI.</w:t>
       </w:r>
     </w:p>
-    <w:bookmarkEnd w:id="39"/>
-    <w:bookmarkEnd w:id="40"/>
+    <w:bookmarkEnd w:id="45"/>
+    <w:bookmarkEnd w:id="46"/>
     <w:sectPr>
       <w:footnotePr>
         <w:numRestart w:val="eachSect"/>

</xml_diff>

<commit_message>
Rehace las figuras 7 y 8 como notaciones orgánicas
- Figura 7: la mirada es también la línea del tiempo; la cara de la
  pirca son los apellidos que vuelven; líneas de mira que la muralla
  corta; foso de alquitrán con ciento cincuenta marcas raspadas;
  horizonte de pan de oro.
- Figura 8, vertical: el eje son las páginas de la novela (9 a 154,
  con un corte); tres montones de tres materias en sus órbitas, unidos
  por una espiral, de la altura del cerro al informe montón.
- Generador nuevo sin rough.js, con la letra Nothing You Could Do (OFL);
  guías sin texto regeneradas (la de la Figura 8, vertical).
- analisis/21; notas en 19 y 20; README, 04 y LEEME al día. El texto del
  artículo no cambia: 49.485 caracteres.

Co-Authored-By: Claude Opus 5.5 <noreply@anthropic.com>
Claude-Session: https://claude.ai/code/session_01QWC9b4jcZbzQ8czhYUvPYd
</commit_message>
<xml_diff>
--- a/articulo/articulo_cosecha_de_piedras.docx
+++ b/articulo/articulo_cosecha_de_piedras.docx
@@ -2760,7 +2760,7 @@
       <w:r>
         <w:drawing>
           <wp:inline>
-            <wp:extent cx="5039999" cy="2995199"/>
+            <wp:extent cx="5039999" cy="3239999"/>
             <wp:effectExtent b="0" l="0" r="0" t="0"/>
             <wp:docPr descr="" title="" id="37" name="Picture"/>
             <a:graphic>
@@ -2781,7 +2781,7 @@
                   <pic:spPr bwMode="auto">
                     <a:xfrm>
                       <a:off x="0" y="0"/>
-                      <a:ext cx="5039999" cy="2995199"/>
+                      <a:ext cx="5039999" cy="3239999"/>
                     </a:xfrm>
                     <a:prstGeom prst="rect">
                       <a:avLst/>
@@ -2858,7 +2858,7 @@
       <w:r>
         <w:drawing>
           <wp:inline>
-            <wp:extent cx="5039999" cy="3110399"/>
+            <wp:extent cx="4338227" cy="6119999"/>
             <wp:effectExtent b="0" l="0" r="0" t="0"/>
             <wp:docPr descr="" title="" id="41" name="Picture"/>
             <a:graphic>
@@ -2879,7 +2879,7 @@
                   <pic:spPr bwMode="auto">
                     <a:xfrm>
                       <a:off x="0" y="0"/>
-                      <a:ext cx="5039999" cy="3110399"/>
+                      <a:ext cx="4338227" cy="6119999"/>
                     </a:xfrm>
                     <a:prstGeom prst="rect">
                       <a:avLst/>

</xml_diff>

<commit_message>
Cambia el título y completa las notas de la búsqueda de convocatorias
- Título nuevo: «Cosecha de piedras: el ayllu, el Estado y la mina. Dibujando
  Altiplano de Raúl Botelho Gosálvez» (en inglés, «Harvest of Stones:
  The Ayllu, the State and the Mine. Drawing Raúl Botelho Gosálvez's
  Altiplano»). En §1, «En la aldea, el Estado la reescribe con
  papeles», para que el texto nombre los tres términos del título.
- Extensión: 49.549 caracteres. Word y Word con cambios regenerados.
- Notas finales de los cinco frentes de la búsqueda de convocatorias.

Co-Authored-By: Claude Opus 5.5 <noreply@anthropic.com>
Claude-Session: https://claude.ai/code/session_01QWC9b4jcZbzQ8czhYUvPYd
</commit_message>
<xml_diff>
--- a/articulo/articulo_cosecha_de_piedras.docx
+++ b/articulo/articulo_cosecha_de_piedras.docx
@@ -2,13 +2,13 @@
 <file path=word/document.xml><?xml version="1.0" encoding="utf-8"?>
 <w:document xmlns:w="http://schemas.openxmlformats.org/wordprocessingml/2006/main" xmlns:m="http://schemas.openxmlformats.org/officeDocument/2006/math" xmlns:r="http://schemas.openxmlformats.org/officeDocument/2006/relationships" xmlns:o="urn:schemas-microsoft-com:office:office" xmlns:v="urn:schemas-microsoft-com:vml" xmlns:w10="urn:schemas-microsoft-com:office:word" xmlns:a="http://schemas.openxmlformats.org/drawingml/2006/main" xmlns:pic="http://schemas.openxmlformats.org/drawingml/2006/picture" xmlns:wp="http://schemas.openxmlformats.org/drawingml/2006/wordprocessingDrawing">
   <w:body>
-    <w:bookmarkStart w:id="46" w:name="Xfdf5c4b111121f61c3e47682ce38e3b1cc2db9c"/>
+    <w:bookmarkStart w:id="46" w:name="X283b9038d5fc7da7cd10d4024bb014ac454e9d4"/>
     <w:p>
       <w:pPr>
         <w:pStyle w:val="Heading1"/>
       </w:pPr>
       <w:r>
-        <w:t xml:space="preserve">La cosecha de piedras: piedra, papel y máquina en</w:t>
+        <w:t xml:space="preserve">Cosecha de piedras: el ayllu, el Estado y la mina. Dibujando</w:t>
       </w:r>
       <w:r>
         <w:t xml:space="preserve"> </w:t>
@@ -19,6 +19,12 @@
           <w:iCs/>
         </w:rPr>
         <w:t xml:space="preserve">Altiplano</w:t>
+      </w:r>
+      <w:r>
+        <w:t xml:space="preserve"> </w:t>
+      </w:r>
+      <w:r>
+        <w:t xml:space="preserve">de Raúl Botelho Gosálvez</w:t>
       </w:r>
     </w:p>
     <w:p>
@@ -30,7 +36,7 @@
           <w:b/>
           <w:bCs/>
         </w:rPr>
-        <w:t xml:space="preserve">The Harvest of Stones: Stone, Paper and Machine in</w:t>
+        <w:t xml:space="preserve">Harvest of Stones: The Ayllu, the State and the Mine. Drawing Raúl Botelho Gosálvez’s</w:t>
       </w:r>
       <w:r>
         <w:rPr>
@@ -351,7 +357,7 @@
         <w:t xml:space="preserve"> </w:t>
       </w:r>
       <w:r>
-        <w:t xml:space="preserve">Nuestra respuesta es que la novela registra, a espaldas de su narrador, la mecánica material del despojo: cómo se pierde la tierra, con qué objetos y con qué gestos. Leer así se parece al esgrafiado: se raspa la capa del narrador para que aparezca la de abajo. El argumento cabe en tres materiales. El ayllu marca su tierra con piedras: despeja, amontona, cerca y amojona. La aldea la reescribe con papeles: títulos, expedientes, ordenanzas. La mina convierte el mismo gesto en mercancía con máquinas. Como en el juego de piedra, papel o tijera, el papel le gana a la piedra por regla, no por peso: ante la ley, un mojón no vale lo que un título. El dibujo, al repetir las operaciones de la novela con otra materia, obliga a decidir lo que el texto deja abierto y deja ver lo que el narrador impone.</w:t>
+        <w:t xml:space="preserve">Nuestra respuesta es que la novela registra, a espaldas de su narrador, la mecánica material del despojo: cómo se pierde la tierra, con qué objetos y con qué gestos. Leer así se parece al esgrafiado: se raspa la capa del narrador para que aparezca la de abajo. El argumento cabe en tres materiales. El ayllu marca su tierra con piedras: despeja, amontona, cerca y amojona. En la aldea, el Estado la reescribe con papeles: títulos, expedientes, ordenanzas. La mina convierte el mismo gesto en mercancía con máquinas. Como en el juego de piedra, papel o tijera, el papel le gana a la piedra por regla, no por peso: ante la ley, un mojón no vale lo que un título. El dibujo, al repetir las operaciones de la novela con otra materia, obliga a decidir lo que el texto deja abierto y deja ver lo que el narrador impone.</w:t>
       </w:r>
     </w:p>
     <w:p>

</xml_diff>

<commit_message>
Integra A Pattern Language y añade el informe de convocatorias
- analisis/25: Alexander frente al artículo (qué fortalece, qué discutir,
  cómo ir más allá), textos listos, patrones por verificar y citas con su
  original inglés y página.
- Artículo: las tres chujllas alrededor del patio (p. 30) y la casa
  comprimida (Alexander, 1977: xliii) en §3; la propiedad como control y
  reparación (1977: 395) en §7; Alexander entre las miradas ajenas en §8;
  nueva entrada de bibliografía; recortes que compensan (49.969 caracteres).
- Word regenerado y Word con cambios marcados respecto de la versión previa.
- reports/: revistas y convocatorias abiertas al 10 de octubre de 2026.
- README y documento 04 al día.

Co-Authored-By: Claude Opus 5.5 <noreply@anthropic.com>
Claude-Session: https://claude.ai/code/session_01QWC9b4jcZbzQ8czhYUvPYd
</commit_message>
<xml_diff>
--- a/articulo/articulo_cosecha_de_piedras.docx
+++ b/articulo/articulo_cosecha_de_piedras.docx
@@ -389,7 +389,7 @@
         <w:pStyle w:val="BodyText"/>
       </w:pPr>
       <w:r>
-        <w:t xml:space="preserve">La lectura se hace desde la arquitectura y el dibujo, con las herramientas de ese oficio: la planta, el corte, el peso de los materiales, la mano que dibuja. Primero, en</w:t>
+        <w:t xml:space="preserve">La lectura parte de tres premisas. En</w:t>
       </w:r>
       <w:r>
         <w:t xml:space="preserve"> </w:t>
@@ -402,10 +402,7 @@
         <w:t xml:space="preserve">Altiplano</w:t>
       </w:r>
       <w:r>
-        <w:t xml:space="preserve"> </w:t>
-      </w:r>
-      <w:r>
-        <w:t xml:space="preserve">el saber sobre el espacio es material: piedra, adobe, paja y papel. Segundo, el dibujo, que obliga a decidir punto de vista, escala y límite, deja a la vista las categorías que el lector proyecta. Tercero, si dibujar es, como propone Mauricio Cárcamo Pino, un</w:t>
+        <w:t xml:space="preserve">, el saber sobre el espacio es material: piedra, adobe, paja y papel. El dibujo, que obliga a decidir punto de vista, escala y límite, deja a la vista las categorías que el lector proyecta. Y si dibujar es, como propone Mauricio Cárcamo Pino, un</w:t>
       </w:r>
       <w:r>
         <w:t xml:space="preserve"> </w:t>
@@ -579,7 +576,7 @@
         <w:t xml:space="preserve"> </w:t>
       </w:r>
       <w:r>
-        <w:t xml:space="preserve">a lo que hacen las manos cuando piensan, expresan o comunican: un «neologismo homólogo al lenguaje, pero con las manos» (Cárcamo Pino, 2019: 1412, cit. en Cárcamo Pino, 2025b: 244). Escribir es una de esas acciones. Cárcamo Pino recuerda además que la misma mano hace dos agarres: el de fuerza, como al tomar un martillo, y el de precisión, como al «sujetar un papel con dos yemas dactilares» (Cárcamo Pino, 2025a: 10). Paulo Huanca sale de su chujlla «con la madera del arado en un hombro y las correas del yugo en las manos» (Botelho Gosálvez, 1982 [1945]: 34); el doctor Mendoza firma la ordenanza que dejará sin ganado a los Villca (ibid.: 96). No es una mano frente a un papel, sino dos manos con dos agarres.</w:t>
+        <w:t xml:space="preserve">a lo que hacen las manos cuando piensan, expresan o comunican: un «neologismo homólogo al lenguaje, pero con las manos» (Cárcamo Pino, 2019: 1412, cit. en Cárcamo Pino, 2025b: 244). Escribir es una de esas acciones. Cárcamo Pino recuerda que la misma mano hace dos agarres: el de fuerza, como al tomar un martillo, y el de precisión, como al «sujetar un papel con dos yemas dactilares» (Cárcamo Pino, 2025a: 10). Paulo Huanca sale de su chujlla «con la madera del arado en un hombro y las correas del yugo en las manos» (Botelho Gosálvez, 1982 [1945]: 34); el doctor Mendoza firma la ordenanza que dejará sin ganado a los Villca (ibid.: 96). No es una mano frente a un papel, sino dos manos con dos agarres.</w:t>
       </w:r>
     </w:p>
     <w:p>
@@ -1402,7 +1399,7 @@
         <w:pStyle w:val="FirstParagraph"/>
       </w:pPr>
       <w:r>
-        <w:t xml:space="preserve">El narrador presenta el ayllu desde lo alto, como en un plano de situación: en la falda del cerro, «las chujllas de las familias más antiguas han trepado en los riscos del cerro y desde allí parecen ocupar un sitio de preeminencia sobre el resto de chozas» (Botelho Gosálvez, 1982 [1945]: 6). La palabra clave es</w:t>
+        <w:t xml:space="preserve">El narrador presenta el ayllu desde lo alto, como en un plano de situación: «las chujllas de las familias más antiguas han trepado en los riscos del cerro y desde allí parecen ocupar un sitio de preeminencia sobre el resto de chozas» (Botelho Gosálvez, 1982 [1945]: 6). La palabra clave es</w:t>
       </w:r>
       <w:r>
         <w:t xml:space="preserve"> </w:t>
@@ -1503,7 +1500,7 @@
         <w:t xml:space="preserve">Contraste</w:t>
       </w:r>
       <w:r>
-        <w:t xml:space="preserve">. El esquema tiene que decidir desde dónde se mira, y el texto ofrece dos lugares: el del narrador, intruso en la puerta, y el del cuerpo que habita, al que remiten el hollín, los camastros y las herramientas. El corte elige el segundo y se detiene ante el alma de los comunarios, para no hablar por ellos. El narrador, en cambio, la declara cerrada, «nadie podía entrar», y los ve como estatuas de «hierático aspecto» (Botelho Gosálvez, 1982 [1945]: 65).</w:t>
+        <w:t xml:space="preserve">. El esquema tiene que decidir desde dónde se mira, y el texto ofrece dos: el del narrador, intruso en la puerta, y el del cuerpo que habita, al que remiten el hollín, los camastros y las herramientas. El corte elige el segundo y se detiene ante el alma de los comunarios, para no hablar por ellos. El narrador, en cambio, la declara cerrada, «nadie podía entrar», y los ve como estatuas de «hierático aspecto» (ibid.: 65).</w:t>
       </w:r>
     </w:p>
     <w:p>
@@ -1583,6 +1580,14 @@
         <w:pStyle w:val="BodyText"/>
       </w:pPr>
       <w:r>
+        <w:t xml:space="preserve">El narrador tampoco le ve cuartos: «Las chujllas no tienen cuartos ni mucho menos» (ibid.: 30). Pero los Huanca viven en «tres chujllas de adobe y paja brava que rodean al patio» (ibid.): los cuartos son las chujllas. Para Christopher Alexander, todos los patrones de una casa caben, superpuestos, «en una simple cabaña de una sola habitación» (Alexander et al., 1977: xliii). Donde el narrador ve una madriguera, él vería una casa comprimida.</w:t>
+      </w:r>
+    </w:p>
+    <w:p>
+      <w:pPr>
+        <w:pStyle w:val="BodyText"/>
+      </w:pPr>
+      <w:r>
         <w:t xml:space="preserve">La jerarquía no viene solo de fuera. El antepasado de los Villca llega tras la sublevación de Tupaj Katari, y su hijo Pedro «empotró en el suelo del ayllu las estacas de propiedad y empezó a dominar» (Botelho Gosálvez, 1982 [1945]: 20). La primera estaca la clava una mano aymara, y con ella entra en el ayllu la idea señorial del suelo. Los Villca inventan genealogías imperiales porque «necesitaban aquel blasón para sustentar su orgullo y su riqueza» (ibid.: 28): el mito hace de título de propiedad. Hasta la memoria tiene pisos. La de los Villca es «edificante y fantástica»; los peones «no tienen historia», salvo tres palabras: «¡hambre, persecución y muerte!» (ibid.: 22-23). El capítulo cierra con una fórmula: «Así los Villca, Huanca y Condori, son las generaciones del Signo Escalonado» (ibid.: 38). El glosario define el término como «Signo sagrado de Tiwanaco» (ibid.: 163). El narrador convierte un signo sagrado en un diagrama de clases, justo lo que advertía Hall.</w:t>
       </w:r>
     </w:p>
@@ -1591,7 +1596,7 @@
         <w:pStyle w:val="BodyText"/>
       </w:pPr>
       <w:r>
-        <w:t xml:space="preserve">El mismo capítulo cuenta cómo se perdió Kero-Pata, el ayllu de origen de Juan Condori. Sus comunarios habían estado «amparados por las Cédulas Reales», hasta que, con la República, «los doctores alto-peruanos les birlaron la tierra» (ibid.: 36). El papel protegió y el papel despojó, a través de una cadena de personas. Una hectárea pagada al cura por unos responsos pasa a un doctor; tras «una gran cuestión de títulos, papel sellado y pago de impuestos», el doctor ya tiene veinte hectáreas, porque «así lo declaraban los papeles del Gobierno». Frente a la iglesia levanta su hacienda: «La religión y la propiedad quedaron frente a frente, guiñándose con sus ventanucos empolvados» (ibid.: 36-37). Hasta los edificios son cómplices. Lo que la novela calla es un tercer uso del papel: después de la Ley de Exvinculación de 1874, las comunidades empezaron «a desenterrar antiguos títulos de propiedad» coloniales, «una pieza clave en la lucha legal» (Rivera Cusicanqui, 2010 [1984]: 99). Y dos años después de publicada la novela, la piedra tuvo también un uso político: en el ciclo rebelde de 1947, en el Altiplano, el asedio a las haciendas incluía la «destrucción simbólica de mojones o linderos», fogatas y pututus (ibid.: 125).</w:t>
+        <w:t xml:space="preserve">El mismo capítulo cuenta cómo se perdió Kero-Pata, el ayllu de origen de Juan Condori. Sus comunarios habían estado «amparados por las Cédulas Reales», hasta que, con la República, «los doctores alto-peruanos les birlaron la tierra» (ibid.: 36). El papel protegió y el papel despojó, a través de una cadena de personas. Una hectárea pagada al cura por unos responsos pasa a un doctor; tras «una gran cuestión de títulos, papel sellado y pago de impuestos», el doctor ya tiene veinte hectáreas, porque «así lo declaraban los papeles del Gobierno». Frente a la iglesia levanta su hacienda: «La religión y la propiedad quedaron frente a frente, guiñándose con sus ventanucos empolvados» (ibid.: 36-37). Lo que la novela calla es un tercer uso del papel: después de la Ley de Exvinculación de 1874, las comunidades empezaron «a desenterrar antiguos títulos de propiedad» coloniales, «una pieza clave en la lucha legal» (Rivera Cusicanqui, 2010 [1984]: 99). Y dos años después de publicada la novela, la piedra tuvo también un uso político: en el ciclo rebelde de 1947, en el Altiplano, el asedio a las haciendas incluía la «destrucción simbólica de mojones o linderos», fogatas y pututus (ibid.: 125).</w:t>
       </w:r>
     </w:p>
     <w:p>
@@ -1801,7 +1806,7 @@
         <w:pStyle w:val="BodyText"/>
       </w:pPr>
       <w:r>
-        <w:t xml:space="preserve">La letra, además, pesa. En el cuartucho del tinterillo al que Vicente acude hay «un desordenado montón de papeles y libracos» (ibid.): otra vez un montón. El letrado cobra la defensa por peso: señala «un Código Penal en infolio y un manual del Procedimiento Civil» y asegura que el grande «tiene más peso legal y jurídico que el chiquitito» (ibid.: 104). El tinterillo no escribe: señala, compara y, al final, «recontó los billetes»; Vicente, para pagar, tiene que «desanudar la punta de la faja» donde guarda «un atado de pobres y traposos billetes» (ibid.: 105). Como en la escena de Cajamarca que abre el libro de Cornejo Polar, el libro es «mucho más fetiche que texto y mucho más gesto de dominio que acto de lenguaje» (Cornejo Polar, 2003 [1994]: 41). Vicente no puede leer el código, pero sabe leer a quien lo vende: «estos tinterillos son de una sola casta y todos obran con una mala fe del demonio» (Botelho Gosálvez, 1982 [1945]: 104). La escena no enfrenta a un indio ignorante con la escritura. Y calla que, en la historia real, los «abogados de pueblo (peyorativamente designados como “tinterillos”)» asesoraron la lucha legal de las comunidades y fueron «la manifestación embrionaria del indigenismo criollo» (Rivera Cusicanqui, 2010 [1984]: 101), el mismo indigenismo al que pertenece la novela.</w:t>
+        <w:t xml:space="preserve">La letra, además, pesa. En el cuartucho del tinterillo al que Vicente acude hay «un desordenado montón de papeles y libracos» (ibid.): otra vez un montón. El letrado cobra la defensa por peso: señala «un Código Penal en infolio y un manual del Procedimiento Civil» y asegura que el grande «tiene más peso legal y jurídico que el chiquitito» (ibid.: 104). El tinterillo no escribe: señala, compara y, al final, «recontó los billetes»; Vicente, para pagar, tiene que «desanudar la punta de la faja» donde guarda «un atado de pobres y traposos billetes» (ibid.: 105). Como en la escena de Cajamarca que abre el libro de Cornejo Polar, el libro es «mucho más fetiche que texto y mucho más gesto de dominio que acto de lenguaje» (Cornejo Polar, 2003 [1994]: 41). Vicente no puede leer el código, pero sabe leer a quien lo vende: «estos tinterillos son de una sola casta y todos obran con una mala fe del demonio» (Botelho Gosálvez, 1982 [1945]: 104). La escena no enfrenta a un indio ignorante con la escritura. Y calla que, en la historia, los «abogados de pueblo (peyorativamente designados como “tinterillos”)» asesoraron la lucha legal de las comunidades y fueron «la manifestación embrionaria del indigenismo criollo» (Rivera Cusicanqui, 2010 [1984]: 101), el mismo indigenismo al que pertenece la novela.</w:t>
       </w:r>
     </w:p>
     <w:p>
@@ -1864,7 +1869,7 @@
         <w:pStyle w:val="BodyText"/>
       </w:pPr>
       <w:r>
-        <w:t xml:space="preserve">Del otro lado, las manos del puneño pierden su oficio: «Sabrás arar en la puna, pero aquí esa es otra música» (ibid.: 113). Paulo se consume «derritiéndose como muñeco de cera» (ibid.: 123). En el aserradero, el contratista le echa en cara que otro puneño «se ha cercenado una mano en la sierra», y solo lo anota en la planilla cuando Paulo se ofrece como «peón, siquiera» (ibid.: 129): la mutilación se usa como argumento contra las víctimas. La hija mayor de Paulo, a quien el narrador presenta dejando «ver sus nacientes senos» (ibid.: 125), «había sido desflorada por el patrón»; «en seguida vinieron los capataces y peones: le daban dinero», y la desesperación la «obligó a venderse» hasta que «con su propia mano se quitó la vida» (ibid.: 132). Ella no tiene nombre, y su historia cabe en un inciso: «vieja historia». Así, una violencia que empezó el patrón se cuenta como una venta de la muchacha. Su padre jura que fue un crimen, pero «las pruebas eran irrefutables» (ibid.). La palabra</w:t>
+        <w:t xml:space="preserve">Del otro lado, las manos del puneño pierden su oficio: «Sabrás arar en la puna, pero aquí esa es otra música» (ibid.: 113). Paulo se consume «derritiéndose como muñeco de cera» (ibid.: 123). En el aserradero, el contratista le echa en cara que otro puneño «se ha cercenado una mano en la sierra» (ibid.: 129): la mutilación se usa como argumento contra las víctimas. La hija mayor de Paulo, a quien el narrador presenta dejando «ver sus nacientes senos» (ibid.: 125), «había sido desflorada por el patrón»; «en seguida vinieron los capataces y peones: le daban dinero», y la desesperación la «obligó a venderse» hasta que «con su propia mano se quitó la vida» (ibid.: 132). Ella no tiene nombre, y su historia cabe en un inciso: «vieja historia». Así, una violencia que empezó el patrón se cuenta como una venta de la muchacha. Su padre jura que fue un crimen, pero «las pruebas eran irrefutables» (ibid.). La palabra</w:t>
       </w:r>
       <w:r>
         <w:t xml:space="preserve"> </w:t>
@@ -2247,7 +2252,7 @@
         <w:pStyle w:val="FirstParagraph"/>
       </w:pPr>
       <w:r>
-        <w:t xml:space="preserve">La sequía se cuenta con palabras de arquitecto y de dibujante: las sementeras «se agrietan como paredes envejecidas» (Botelho Gosálvez, 1982 [1945]: 56); «Ni una pincelada enturbió el papel celeste y deslumbrador del cielo» (ibid.: 57). En la rogativa, los comunarios avanzan de rodillas y su piel sangrante deja «manchones en el cascajo» (ibid.: 60): los cuerpos dibujan sobre el suelo. Pronto, «cielo y tierra eran para ellos como una tremenda cárcel» (ibid.: 72). Al salir del ayllu, las casas ajenas se les cierran: a los vecinos, la sequía «les endureció el alma como había endurecido la tierra», y los reciben «dándoles con las puertas» y a pedradas (ibid.: 80).</w:t>
+        <w:t xml:space="preserve">La sequía se cuenta con palabras de arquitecto y de dibujante: las sementeras «se agrietan como paredes envejecidas» (Botelho Gosálvez, 1982 [1945]: 56); «Ni una pincelada enturbió el papel celeste y deslumbrador del cielo» (ibid.: 57). En la rogativa, los comunarios avanzan de rodillas y su piel sangrante deja «manchones en el cascajo» (ibid.: 60): los cuerpos dibujan sobre el suelo. Al salir del ayllu, las casas ajenas se les cierran: a los vecinos, la sequía «les endureció el alma como había endurecido la tierra», y los reciben «dándoles con las puertas» y a pedradas (ibid.: 80).</w:t>
       </w:r>
     </w:p>
     <w:p>
@@ -2687,7 +2692,7 @@
         <w:t xml:space="preserve">saywaña</w:t>
       </w:r>
       <w:r>
-        <w:t xml:space="preserve">: «mojonar las chácaras con montones de piedra» (Bertonio, 2011 [1612]: 466). En Umacachi, la ordenanza se llevó los bueyes de los Villca, que se lamentaban: «Y ni siquiera tenemos una yunta» (Botelho Gosálvez, 1982 [1945]: 105). Al volver, sin yuntas, «los mismos hombres eran quienes tiraban el arado» (ibid.: 156). El cuerpo ocupa el lugar del buey. Y el narrador vuelve a convertirlos en piedra: trabajan «con una voluntad de siglos de piedra» (ibid.), una piedra fuera de la historia, no la</w:t>
+        <w:t xml:space="preserve">: «mojonar las chácaras con montones de piedra» (Bertonio, 2011 [1612]: 466). Alexander define la propiedad por el control, no por el dinero, y pide «el poder legal y la oportunidad física de modificar y reparar sus propios lugares» (Alexander et al., 1977: 395). La novela las separa: el poder, en los papeles; la oportunidad, en las manos. En Umacachi, la ordenanza se llevó los bueyes de los Villca, que se lamentaban: «Y ni siquiera tenemos una yunta» (Botelho Gosálvez, 1982 [1945]: 105). Al volver, sin yuntas, «los mismos hombres eran quienes tiraban el arado» (ibid.: 156). El cuerpo ocupa el lugar del buey. Y el narrador vuelve a convertirlos en piedra: trabajan «con una voluntad de siglos de piedra» (ibid.), una piedra fuera de la historia, no la</w:t>
       </w:r>
       <w:r>
         <w:t xml:space="preserve"> </w:t>
@@ -2955,7 +2960,7 @@
         <w:t xml:space="preserve">capriccio</w:t>
       </w:r>
       <w:r>
-        <w:t xml:space="preserve">, Bacon, la tectónica y hasta la pelvis son maneras de ver ajenas al mundo narrado. Los dibujos hablan de la novela, no del ayllu ni de la manera aymara de entender el espacio, que pedirían otras fuentes y otros autores: los de la historia que los aymaras, escribía Roberto Choque Canqui, «hace tiempo, hemos añorado por escribir» (Choque Canqui, 1978 [1974]: s. p.). El segundo es ético: la inmersión seduce, y un pastel puede embellecer la miseria o fabricar efigies; por eso la serie no dibuja el linchamiento ni el alma que el narrador declara cerrada. El tercero es de método: el dibujo depende de los datos del texto y hereda sus silencios. Puede hacerlos visibles, pero no llenarlos.</w:t>
+        <w:t xml:space="preserve">, Bacon, la tectónica, Alexander y hasta la pelvis son maneras de ver ajenas al mundo narrado. Los dibujos hablan de la novela, no del ayllu ni de la manera aymara de entender el espacio, que pedirían otras fuentes y otros autores: los de la historia que los aymaras, escribía Roberto Choque Canqui, «hace tiempo, hemos añorado por escribir» (Choque Canqui, 1978 [1974]: s. p.). El segundo es ético: la inmersión seduce, y un pastel puede embellecer la miseria o fabricar efigies; por eso la serie no dibuja el linchamiento ni el alma que el narrador declara cerrada. El tercero es de método: el dibujo depende de los datos del texto y hereda sus silencios. Puede hacerlos visibles, pero no llenarlos.</w:t>
       </w:r>
     </w:p>
     <w:p>
@@ -3080,6 +3085,27 @@
     <w:p>
       <w:pPr>
         <w:pStyle w:val="FirstParagraph"/>
+      </w:pPr>
+      <w:r>
+        <w:t xml:space="preserve">Alexander, Christopher; Ishikawa, Sara y Silverstein, Murray (1977).</w:t>
+      </w:r>
+      <w:r>
+        <w:t xml:space="preserve"> </w:t>
+      </w:r>
+      <w:r>
+        <w:rPr>
+          <w:i/>
+          <w:iCs/>
+        </w:rPr>
+        <w:t xml:space="preserve">A Pattern Language. Towns, Buildings, Construction</w:t>
+      </w:r>
+      <w:r>
+        <w:t xml:space="preserve">. Nueva York: Oxford University Press.</w:t>
+      </w:r>
+    </w:p>
+    <w:p>
+      <w:pPr>
+        <w:pStyle w:val="BodyText"/>
       </w:pPr>
       <w:r>
         <w:t xml:space="preserve">Bachelard, Gaston (1978 [1942]).</w:t>
@@ -3777,7 +3803,7 @@
         <w:t xml:space="preserve"> </w:t>
       </w:r>
       <w:r>
-        <w:t xml:space="preserve">El pastel al óleo es pigmento unido con cera y aceite. A diferencia de la tinta, que fija la línea al secar, no llega a secar del todo: se puede empastar, arrastrar con el dedo, raspar con una punta hasta descubrir la capa de abajo (esgrafiado) o disolver con solvente. Por eso se trabaja sumando y quitando materia, como se limpia un campo, más que trazando líneas.</w:t>
+        <w:t xml:space="preserve">El pastel al óleo es pigmento unido con cera y aceite, y no llega a secar del todo: se puede empastar, arrastrar con el dedo, raspar con una punta hasta descubrir la capa de abajo (esgrafiado) o disolver con solvente. Por eso se trabaja sumando y quitando materia, como se limpia un campo, más que trazando líneas.</w:t>
       </w:r>
     </w:p>
   </w:footnote>

</xml_diff>

<commit_message>
Audita las propuestas de otra IA y cruza The Voidz con la novela
Verifica contra las fuentes el análisis de Casa collage, Fuão, los
títulos y las canciones de The Voidz (analisis/27). Entran solo los
títulos de dos canciones, el apodo «el lobo» del Alcalde con los tres
cerditos de Cárcamo Pino, el antecedente de McLeod para manuaje y la
segunda incisión de Fuão.

Co-Authored-By: Claude Opus 5.5 <noreply@anthropic.com>
Claude-Session: https://claude.ai/code/session_01QWC9b4jcZbzQ8czhYUvPYd
</commit_message>
<xml_diff>
--- a/articulo/articulo_cosecha_de_piedras.docx
+++ b/articulo/articulo_cosecha_de_piedras.docx
@@ -600,7 +600,68 @@
         <w:t xml:space="preserve"> </w:t>
       </w:r>
       <w:r>
-        <w:t xml:space="preserve">de Achacachi sostenían escuelas propias ya en 1929 (Barnadas, 1978 [1975]: 84). La pregunta no es si la mano o el papel, sino qué prácticas se autorizan y cuáles quedaron «minusvaloradas, invisibilizadas» por el «monopolio de la escritura y el lenguaje» (Cárcamo Pino, 2025b: 259). Los arquitectos Xavier Monteys y Pere Fuertes reconocen ese saber en quienes habitan las casas: su acción sobre la arquitectura, «lenta y sistemática», expresa «una opinión no escrita pero de innegable valor» (Monteys y Fuertes, 2001: 26).</w:t>
+        <w:t xml:space="preserve">de Achacachi sostenían escuelas propias ya en 1929 (Barnadas, 1978 [1975]: 84). La pregunta no es si la mano o el papel, sino qué prácticas se autorizan y cuáles quedaron «minusvaloradas, invisibilizadas» por el «monopolio de la escritura y el lenguaje» (Cárcamo Pino, 2025b: 259). La palabra</w:t>
+      </w:r>
+      <w:r>
+        <w:t xml:space="preserve"> </w:t>
+      </w:r>
+      <w:r>
+        <w:rPr>
+          <w:i/>
+          <w:iCs/>
+        </w:rPr>
+        <w:t xml:space="preserve">manuaje</w:t>
+      </w:r>
+      <w:r>
+        <w:t xml:space="preserve"> </w:t>
+      </w:r>
+      <w:r>
+        <w:t xml:space="preserve">tiene antecedentes, que Cárcamo Pino repasa. Uno es el de Randall McLeod, que llamó</w:t>
+      </w:r>
+      <w:r>
+        <w:t xml:space="preserve"> </w:t>
+      </w:r>
+      <w:r>
+        <w:rPr>
+          <w:i/>
+          <w:iCs/>
+        </w:rPr>
+        <w:t xml:space="preserve">manuage</w:t>
+      </w:r>
+      <w:r>
+        <w:t xml:space="preserve"> </w:t>
+      </w:r>
+      <w:r>
+        <w:t xml:space="preserve">al idioma de los</w:t>
+      </w:r>
+      <w:r>
+        <w:t xml:space="preserve"> </w:t>
+      </w:r>
+      <w:r>
+        <w:rPr>
+          <w:i/>
+          <w:iCs/>
+        </w:rPr>
+        <w:t xml:space="preserve">choughs</w:t>
+      </w:r>
+      <w:r>
+        <w:t xml:space="preserve"> </w:t>
+      </w:r>
+      <w:r>
+        <w:t xml:space="preserve">en</w:t>
+      </w:r>
+      <w:r>
+        <w:t xml:space="preserve"> </w:t>
+      </w:r>
+      <w:r>
+        <w:rPr>
+          <w:i/>
+          <w:iCs/>
+        </w:rPr>
+        <w:t xml:space="preserve">All’s Well That Ends Well</w:t>
+      </w:r>
+      <w:r>
+        <w:t xml:space="preserve">, de Shakespeare: un idioma «inventado in situ por los personajes» y hecho «con la mano de Shakespeare, no con la boca» (Cárcamo Pino, 2025b: 241-242). La banda The Voidz, de Julian Casablancas, lleva la idea al extremo en el título de una canción: «All Wordz Are Made Up», todas las palabras son inventadas (The Voidz, 2018). Inventar no es mentir, es hacer. Hechas fueron la ordenanza del Alcalde y la genealogía imperial que se atribuyen los Villca, y también los títulos coloniales que las comunidades desenterraron para litigar (Rivera Cusicanqui, 2010 [1984]: 99). Lo que las separa no es que unas palabras sean inventadas y otras no, sino quién logra que las suyas valgan como ley. Los arquitectos Xavier Monteys y Pere Fuertes reconocen ese saber en quienes habitan las casas: su acción sobre la arquitectura, «lenta y sistemática», expresa «una opinión no escrita pero de innegable valor» (Monteys y Fuertes, 2001: 26).</w:t>
       </w:r>
     </w:p>
     <w:p>
@@ -1668,7 +1729,7 @@
         <w:pStyle w:val="BodyText"/>
       </w:pPr>
       <w:r>
-        <w:t xml:space="preserve">La jerarquía no viene solo de fuera. El antepasado de los Villca llega tras la sublevación de Tupaj Katari, y su hijo Pedro «empotró en el suelo del ayllu las estacas de propiedad y empezó a dominar» (Botelho Gosálvez, 1982 [1945]: 20). La primera estaca la clava una mano aymara, y con ella entra en el ayllu la idea señorial del suelo. Los Villca inventan genealogías imperiales porque «necesitaban aquel blasón para sustentar su orgullo y su riqueza» (ibid.: 28): el mito hace de título de propiedad. Hasta la memoria tiene pisos. La de los Villca es «edificante y fantástica»; los peones «no tienen historia», salvo tres palabras: «¡hambre, persecución y muerte!» (ibid.: 22-23). El capítulo cierra con una fórmula: «Así los Villca, Huanca y Condori, son las generaciones del Signo Escalonado» (ibid.: 38). El glosario define el término como «Signo sagrado de Tiwanaco» (ibid.: 163). El narrador convierte un signo sagrado en un diagrama de clases, justo lo que advertía Hall.</w:t>
+        <w:t xml:space="preserve">La jerarquía no viene solo de fuera. El antepasado de los Villca llega tras la sublevación de Tupaj Katari, y su hijo Pedro «empotró en el suelo del ayllu las estacas de propiedad y empezó a dominar» (Botelho Gosálvez, 1982 [1945]: 20). La primera estaca la clava una mano aymara, y con ella entra en el ayllu la idea señorial del suelo. Los Villca inventan genealogías imperiales porque «necesitaban aquel blasón para sustentar su orgullo y su riqueza» (ibid.: 28): el mito hace de título de propiedad. Hasta la memoria tiene pisos. La de los Villca es «edificante y fantástica»; los peones «no tienen historia», salvo tres palabras: «¡hambre, persecución y muerte!» (ibid.: 22-23). Una canción de The Voidz lleva un título que describe ese edificio: «Pyramid of Bones», pirámide de huesos (The Voidz, 2018). Arriba, el blasón; abajo, el hambre, la persecución y la muerte. El capítulo cierra con una fórmula: «Así los Villca, Huanca y Condori, son las generaciones del Signo Escalonado» (Botelho Gosálvez, 1982 [1945]: 38). El glosario define el término como «Signo sagrado de Tiwanaco» (ibid.: 163). El narrador convierte un signo sagrado en un diagrama de clases, justo lo que advertía Hall.</w:t>
       </w:r>
     </w:p>
     <w:p>
@@ -1854,7 +1915,7 @@
         <w:pStyle w:val="BodyText"/>
       </w:pPr>
       <w:r>
-        <w:t xml:space="preserve">Allí manda el Alcalde vitalicio, el doctor Margarito Mendoza, que anda «con el fajo de expedientes bajo el brazo» y sabe «tejer obscuras mallas de términos seudo jurídicos»; los tinterillos «urden pleitos por nada» (ibid.: 86).</w:t>
+        <w:t xml:space="preserve">Allí manda el Alcalde vitalicio, el doctor Margarito Mendoza, alias «el lobo», que anda «con el fajo de expedientes bajo el brazo» y sabe «tejer obscuras mallas de términos seudo jurídicos»; los tinterillos «urden pleitos por nada» (ibid.: 86).</w:t>
       </w:r>
       <w:r>
         <w:t xml:space="preserve"> </w:t>
@@ -1878,7 +1939,7 @@
         <w:pStyle w:val="BodyText"/>
       </w:pPr>
       <w:r>
-        <w:t xml:space="preserve">Los Villca llegan a la aldea con treinta y cuatro ovejas, y la chola Encarnación, por cincuenta bolivianos, les cede el corral: «Tu familia puede acomodarse en el pesebre» (Botelho Gosálvez, 1982 [1945]: 92). Entonces llega la letra: «Todos los animales de carneo que existen dentro del radio urbano serán requisados […] (Fdo.) Dr. Margarito Mendoza» (ibid.: 96). El radio urbano funciona como un corral invisible: un círculo trazado en un papel encierra a todos los animales que quedan dentro, y lo cierra una firma. Es un corte en el sentido de Fuão: la tijera, «un instrumento al servicio de la razón», define, y definir es distinguir «entre lo incluido y lo excluido, el dentro y el fuera» (Fuão, 2011: 33-35). La aldea mide con compás; el ayllu medía con la pendiente y con las piedras. James C. Scott observa que un mapa catastral «no se limita a describir un sistema de tenencia de la tierra; lo crea», porque da a sus categorías «la fuerza de la ley» (Scott, 2020 [1998]: 3). El radio hace lo mismo con el ganado, y no trata a todos igual: a los mestizos «no les alcanzaba la Ordenanza» (Botelho Gosálvez, 1982 [1945]: 102). En una sociedad «de dudosa cuantificación como Bolivia» (Zavaleta Mercado, 1986: 21, n. 1), el poder cuenta a ojo: los animales de los indios, tasados «a ojo de buen cubero», entran por el «embudo» de las fincas del Alcalde «hasta esfumarse» (Botelho Gosálvez, 1982 [1945]: 102). Por un lado entran bueyes, vacas y ovejas; por el otro sale papel: la fortuna de los Villca se reduce «a mil seiscientos bolivianos en papel» (ibid.: 103).</w:t>
+        <w:t xml:space="preserve">Los Villca llegan a la aldea con treinta y cuatro ovejas, y la chola Encarnación, por cincuenta bolivianos, les cede el corral: «Tu familia puede acomodarse en el pesebre» (Botelho Gosálvez, 1982 [1945]: 92). Entonces llega la letra: «Todos los animales de carneo que existen dentro del radio urbano serán requisados […] (Fdo.) Dr. Margarito Mendoza» (ibid.: 96). Cárcamo Pino explica la madera con «el imaginario de los tres cerditos» (Cárcamo Pino, 2025a: 8). En Umacachi el cuento es otro: el lobo no sopla ninguna casa, firma. El radio urbano funciona como un corral invisible: un círculo trazado en un papel encierra a todos los animales que quedan dentro, y lo cierra una firma. Es un corte en el sentido de Fuão: la tijera, «un instrumento al servicio de la razón», define, y definir es distinguir «entre lo incluido y lo excluido, el dentro y el fuera» (Fuão, 2011: 33-35). La aldea mide con compás; el ayllu medía con la pendiente y con las piedras. James C. Scott observa que un mapa catastral «no se limita a describir un sistema de tenencia de la tierra; lo crea», porque da a sus categorías «la fuerza de la ley» (Scott, 2020 [1998]: 3). El radio hace lo mismo con el ganado, y no trata a todos igual: a los mestizos «no les alcanzaba la Ordenanza» (Botelho Gosálvez, 1982 [1945]: 102). En una sociedad «de dudosa cuantificación como Bolivia» (Zavaleta Mercado, 1986: 21, n. 1), el poder cuenta a ojo: los animales de los indios, tasados «a ojo de buen cubero», entran por el «embudo» de las fincas del Alcalde «hasta esfumarse» (Botelho Gosálvez, 1982 [1945]: 102). Por un lado entran bueyes, vacas y ovejas; por el otro sale papel: la fortuna de los Villca se reduce «a mil seiscientos bolivianos en papel» (ibid.: 103).</w:t>
       </w:r>
     </w:p>
     <w:p>
@@ -3858,6 +3919,30 @@
         <w:pStyle w:val="BodyText"/>
       </w:pPr>
       <w:r>
+        <w:t xml:space="preserve">The Voidz (2018).</w:t>
+      </w:r>
+      <w:r>
+        <w:t xml:space="preserve"> </w:t>
+      </w:r>
+      <w:r>
+        <w:rPr>
+          <w:i/>
+          <w:iCs/>
+        </w:rPr>
+        <w:t xml:space="preserve">Virtue</w:t>
+      </w:r>
+      <w:r>
+        <w:t xml:space="preserve"> </w:t>
+      </w:r>
+      <w:r>
+        <w:t xml:space="preserve">[álbum]. Cult Records y RCA Records. Pistas 3, «Pyramid of Bones», y 7, «All Wordz Are Made Up».</w:t>
+      </w:r>
+    </w:p>
+    <w:p>
+      <w:pPr>
+        <w:pStyle w:val="BodyText"/>
+      </w:pPr>
+      <w:r>
         <w:t xml:space="preserve">Spedding, Alison (2025).</w:t>
       </w:r>
       <w:r>
@@ -4036,7 +4121,7 @@
         <w:t xml:space="preserve"> </w:t>
       </w:r>
       <w:r>
-        <w:t xml:space="preserve">suprime», y juntas «reduplican su significado» (Fuão, 2011: 43).</w:t>
+        <w:t xml:space="preserve">suprime», y juntas «reduplican su significado» (Fuão, 2011: 43). El esgrafiado hace lo que Fuão llama «la segunda incisión»: la cámara ya cortó la realidad en rectángulos, y «un segundo recorte desfigura la imagen rectangular inicial, dándole un nuevo significado» (ibid.: 29). La novela es el primer corte; el dibujo, el segundo.</w:t>
       </w:r>
     </w:p>
   </w:footnote>

</xml_diff>

<commit_message>
Revisión final del artículo con todo lo acumulado
Relee el artículo entero y recupera los textos que habían quedado fuera
solo por el límite de Estudios Bolivianos: dos frases de Dean (la
petrificación andina y el olvido), el voyeur de Fuão y su nota sobre
las comillas. Da párrafo propio al pasaje de McLeod y The Voidz, divide
los párrafos largos de §7, unifica los años de Pallasmaa y Hall y
ordena la bibliografía (31 entradas). Actualiza el estado, los
pendientes y el Word con cambios marcados.

Co-Authored-By: Claude Opus 5.5 <noreply@anthropic.com>
Claude-Session: https://claude.ai/code/session_01QWC9b4jcZbzQ8czhYUvPYd
</commit_message>
<xml_diff>
--- a/articulo/articulo_cosecha_de_piedras.docx
+++ b/articulo/articulo_cosecha_de_piedras.docx
@@ -2,7 +2,7 @@
 <file path=word/document.xml><?xml version="1.0" encoding="utf-8"?>
 <w:document xmlns:w="http://schemas.openxmlformats.org/wordprocessingml/2006/main" xmlns:m="http://schemas.openxmlformats.org/officeDocument/2006/math" xmlns:r="http://schemas.openxmlformats.org/officeDocument/2006/relationships" xmlns:o="urn:schemas-microsoft-com:office:office" xmlns:v="urn:schemas-microsoft-com:vml" xmlns:w10="urn:schemas-microsoft-com:office:word" xmlns:a="http://schemas.openxmlformats.org/drawingml/2006/main" xmlns:pic="http://schemas.openxmlformats.org/drawingml/2006/picture" xmlns:wp="http://schemas.openxmlformats.org/drawingml/2006/wordprocessingDrawing">
   <w:body>
-    <w:bookmarkStart w:id="46" w:name="X283b9038d5fc7da7cd10d4024bb014ac454e9d4"/>
+    <w:bookmarkStart w:id="47" w:name="X283b9038d5fc7da7cd10d4024bb014ac454e9d4"/>
     <w:p>
       <w:pPr>
         <w:pStyle w:val="Heading1"/>
@@ -305,7 +305,7 @@
         <w:t xml:space="preserve">chhaxwa</w:t>
       </w:r>
       <w:r>
-        <w:t xml:space="preserve">, para las piedras «que amontonan limpiando las chácaras» y para la piedra «hincada en la pared para atar en ella los palos del techo» (ibid.: 330). Que la faena tenga verbo importa: para Juhani Pallasmaa, «las experiencias arquitectónicas básicas tienen carácter de verbos más que de sustantivos» (Pallasmaa, 2014: 158). Kenneth Frampton distingue la masa formada por «apilamiento repetitivo de elementos pesados», «ya sea piedra o adobe», del armazón que ensambla «componentes ligeros y lineales» (Frampton, 1995: 5): la estereotomía y la tectónica. El montón es masa sin edificio, y</w:t>
+        <w:t xml:space="preserve">, para las piedras «que amontonan limpiando las chácaras» y para la piedra «hincada en la pared para atar en ella los palos del techo» (ibid.: 330). Que la faena tenga verbo importa: para Juhani Pallasmaa, «las experiencias arquitectónicas básicas tienen carácter de verbos más que de sustantivos» (Pallasmaa, 2014 [2011]: 158). Kenneth Frampton distingue la masa formada por «apilamiento repetitivo de elementos pesados», «ya sea piedra o adobe», del armazón que ensambla «componentes ligeros y lineales» (Frampton, 1995: 5): la estereotomía y la tectónica. El montón es masa sin edificio, y</w:t>
       </w:r>
       <w:r>
         <w:t xml:space="preserve"> </w:t>
@@ -419,7 +419,7 @@
       </w:r>
     </w:p>
     <w:bookmarkEnd w:id="12"/>
-    <w:bookmarkStart w:id="13" w:name="X92427c7b6fba06e7fef4b61070b9c7628a70d2e"/>
+    <w:bookmarkStart w:id="14" w:name="X92427c7b6fba06e7fef4b61070b9c7628a70d2e"/>
     <w:p>
       <w:pPr>
         <w:pStyle w:val="Heading2"/>
@@ -433,7 +433,7 @@
         <w:pStyle w:val="FirstParagraph"/>
       </w:pPr>
       <w:r>
-        <w:t xml:space="preserve">Fernando Vázquez Ramos y sus colegas recuerdan que el espacio es un tema moderno y abstracto, que «no habla sobre la arquitectura, sino sobre nosotros» (Vázquez Ramos et al., 2023: 4). Citan también a Edward T. Hall, que advertía contra quienes «proyectan sobre el mundo visual del pasado las estructuras del mundo visual del presente» (Hall, 1973: 133, cit. en ibid.: 3). La advertencia vale para nosotros: no hay que atribuir al ayllu una idea de espacio que la novela no formula, porque sus categorías son otras: la piedra, la pirca, el mojón, el título. Y vale para el narrador, que mira Jatun-Kolla con la sociología de la ciudad: los Villca «son la burguesía usurpadora»; los Condori, Mamani y Quispe, «el proletariado campesino» (Botelho Gosálvez, 1982 [1945]: 22).</w:t>
+        <w:t xml:space="preserve">Fernando Vázquez Ramos y sus colegas recuerdan que el espacio es un tema moderno y abstracto, que «no habla sobre la arquitectura, sino sobre nosotros» (Vázquez Ramos et al., 2023: 4). Citan también a Edward T. Hall, que advertía contra quienes «proyectan sobre el mundo visual del pasado las estructuras del mundo visual del presente» (Hall, 1973 [1966]: 133, cit. en ibid.: 3). La advertencia vale para nosotros: no hay que atribuir al ayllu una idea de espacio que la novela no formula, porque sus categorías son otras: la piedra, la pirca, el mojón, el título. Y vale para el narrador, que mira Jatun-Kolla con la sociología de la ciudad: los Villca «son la burguesía usurpadora»; los Condori, Mamani y Quispe, «el proletariado campesino» (Botelho Gosálvez, 1982 [1945]: 22).</w:t>
       </w:r>
     </w:p>
     <w:p>
@@ -539,15 +539,15 @@
         <w:t xml:space="preserve"> </w:t>
       </w:r>
       <w:r>
-        <w:t xml:space="preserve">es una piedra con dueño y con lugar; la del narrador, una abstracción.</w:t>
-      </w:r>
-    </w:p>
-    <w:p>
-      <w:pPr>
-        <w:pStyle w:val="BodyText"/>
-      </w:pPr>
-      <w:r>
-        <w:t xml:space="preserve">¿Con qué leer, entonces? Con las manos. De las imágenes de la materia, Gaston Bachelard escribió: «La vista las nombra, pero la mano las conoce» (Bachelard, 1978 [1942]: 7-8, cit. en Pallasmaa, 2014: 53). En</w:t>
+        <w:t xml:space="preserve">es una piedra con dueño y con lugar; la del narrador, una abstracción. Y, como muestra Carolyn Dean para los incas, volverse piedra no era morir: «la petrificación señalaba la suspensión, pero no el fin, de la vida» (Dean, 2010: 5).</w:t>
+      </w:r>
+    </w:p>
+    <w:p>
+      <w:pPr>
+        <w:pStyle w:val="BodyText"/>
+      </w:pPr>
+      <w:r>
+        <w:t xml:space="preserve">¿Con qué leer, entonces? Con las manos. De las imágenes de la materia, Gaston Bachelard escribió: «La vista las nombra, pero la mano las conoce» (Bachelard, 1978 [1942]: 7-8, cit. en Pallasmaa, 2014 [2011]: 53). En</w:t>
       </w:r>
       <w:r>
         <w:t xml:space="preserve"> </w:t>
@@ -600,7 +600,15 @@
         <w:t xml:space="preserve"> </w:t>
       </w:r>
       <w:r>
-        <w:t xml:space="preserve">de Achacachi sostenían escuelas propias ya en 1929 (Barnadas, 1978 [1975]: 84). La pregunta no es si la mano o el papel, sino qué prácticas se autorizan y cuáles quedaron «minusvaloradas, invisibilizadas» por el «monopolio de la escritura y el lenguaje» (Cárcamo Pino, 2025b: 259). La palabra</w:t>
+        <w:t xml:space="preserve">de Achacachi sostenían escuelas propias ya en 1929 (Barnadas, 1978 [1975]: 84). La pregunta no es si la mano o el papel, sino qué prácticas se autorizan y cuáles quedaron «minusvaloradas, invisibilizadas» por el «monopolio de la escritura y el lenguaje» (Cárcamo Pino, 2025b: 259). Los arquitectos Xavier Monteys y Pere Fuertes reconocen ese saber en quienes habitan las casas: su acción sobre la arquitectura, «lenta y sistemática», expresa «una opinión no escrita pero de innegable valor» (Monteys y Fuertes, 2001: 26).</w:t>
+      </w:r>
+    </w:p>
+    <w:p>
+      <w:pPr>
+        <w:pStyle w:val="BodyText"/>
+      </w:pPr>
+      <w:r>
+        <w:t xml:space="preserve">La palabra</w:t>
       </w:r>
       <w:r>
         <w:t xml:space="preserve"> </w:t>
@@ -661,7 +669,7 @@
         <w:t xml:space="preserve">All’s Well That Ends Well</w:t>
       </w:r>
       <w:r>
-        <w:t xml:space="preserve">, de Shakespeare: un idioma «inventado in situ por los personajes» y hecho «con la mano de Shakespeare, no con la boca» (Cárcamo Pino, 2025b: 241-242). La banda The Voidz, de Julian Casablancas, lleva la idea al extremo en el título de una canción: «All Wordz Are Made Up», todas las palabras son inventadas (The Voidz, 2018). Inventar no es mentir, es hacer. Hechas fueron la ordenanza del Alcalde y la genealogía imperial que se atribuyen los Villca, y también los títulos coloniales que las comunidades desenterraron para litigar (Rivera Cusicanqui, 2010 [1984]: 99). Lo que las separa no es que unas palabras sean inventadas y otras no, sino quién logra que las suyas valgan como ley. Los arquitectos Xavier Monteys y Pere Fuertes reconocen ese saber en quienes habitan las casas: su acción sobre la arquitectura, «lenta y sistemática», expresa «una opinión no escrita pero de innegable valor» (Monteys y Fuertes, 2001: 26).</w:t>
+        <w:t xml:space="preserve">, de Shakespeare: un idioma «inventado in situ por los personajes» y hecho «con la mano de Shakespeare, no con la boca» (Cárcamo Pino, 2025b: 241-242). La banda The Voidz, de Julian Casablancas, lleva la idea al extremo en el título de una canción: «All Wordz Are Made Up», todas las palabras son inventadas (The Voidz, 2018). Inventar no es mentir, es hacer. Hechas fueron la ordenanza del doctor Mendoza y la genealogía imperial que se atribuyen los Villca, y también los títulos coloniales que las comunidades desenterraron para litigar (Rivera Cusicanqui, 2010 [1984]: 99). Lo que las separa no es que unas palabras sean inventadas y otras no, sino quién logra que las suyas valgan como ley.</w:t>
       </w:r>
     </w:p>
     <w:p>
@@ -781,7 +789,19 @@
         <w:t xml:space="preserve"> </w:t>
       </w:r>
       <w:r>
-        <w:t xml:space="preserve">tiene una teoría propia: la de la collage. Fuão la describe en cuatro tiempos: el recorte, los fragmentos o figuras, los encuentros y la cola. Lo decisivo no está en cortar ni en pegar, sino en el «intervalo» entre ambos, cuando las figuras recortadas se prueban unas junto a otras «antes de que la cola las fije» (Fuão, 2011: 8, 52). Allí se toman las decisiones del dibujo. Fuão pone además una condición que este trabajo adopta: se pueden juntar figuras e ideas lejanas, pero «con la condición de que haya una referencia explícita» que permita la analogía (ibid.: 53). Monteys y Fuertes llaman</w:t>
+        <w:t xml:space="preserve">tiene una teoría propia: la de la collage. Fuão la describe en cuatro tiempos: el recorte, los fragmentos o figuras, los encuentros y la cola. Lo decisivo no está en cortar ni en pegar, sino en el «intervalo» entre ambos, cuando las figuras recortadas se prueban unas junto a otras «antes de que la cola las fije» (Fuão, 2011: 8, 52). Allí se toman las decisiones del dibujo. Fuão pone además una condición que este trabajo adopta: se pueden juntar figuras e ideas lejanas, pero «con la condición de que haya una referencia explícita» que permita la analogía (ibid.: 53).</w:t>
+      </w:r>
+      <w:r>
+        <w:rPr>
+          <w:rStyle w:val="FootnoteReference"/>
+        </w:rPr>
+        <w:footnoteReference w:id="13"/>
+      </w:r>
+      <w:r>
+        <w:t xml:space="preserve"> </w:t>
+      </w:r>
+      <w:r>
+        <w:t xml:space="preserve">Monteys y Fuertes llaman</w:t>
       </w:r>
       <w:r>
         <w:t xml:space="preserve"> </w:t>
@@ -1485,8 +1505,8 @@
         <w:t xml:space="preserve">Fuente: elaboración propia a partir de Botelho Gosálvez (1982 [1945]); entre paréntesis, páginas de la novela.</w:t>
       </w:r>
     </w:p>
-    <w:bookmarkEnd w:id="13"/>
-    <w:bookmarkStart w:id="20" w:name="X2ca922873cfceb7333a31b77617b9aa1ee4c107"/>
+    <w:bookmarkEnd w:id="14"/>
+    <w:bookmarkStart w:id="21" w:name="X2ca922873cfceb7333a31b77617b9aa1ee4c107"/>
     <w:p>
       <w:pPr>
         <w:pStyle w:val="Heading2"/>
@@ -1521,7 +1541,7 @@
         <w:pStyle w:val="BodyText"/>
       </w:pPr>
       <w:r>
-        <w:t xml:space="preserve">La chujlla de los Huanca tiene dos metros de alto, paredes «renegridas por el hollín» y camastros de «apenas la altura de un adobe»; de las vigas, «mal unidas con lazos de paja trenzada», cuelgan «las hoces, el arado, el yugo de madera» (ibid.: 30-31). Junta las dos maneras de construir de Frampton: muros de piedra y adobe que pesan, y un armazón atado como una cestería (Frampton, 1995: 5). Se mide con el cuerpo y es una caja de herramientas, que para Cárcamo Pino es a las manos lo que un idioma a la lengua (Cárcamo Pino, 2025a: 12). Es lo que Monteys y Fuertes piden a la cocina moderna: que no esconda sus utensilios, sino que los cuelgue a la vista, hasta que «ella misma deviene utensilio» (Monteys y Fuertes, 2001: 112). Para ellos, «una casa es una vivienda más la gente que la habita y los objetos que guarda» (ibid.: 14), y para Christopher Alexander un cuarto vale cuando deja ver «las cosas que cuentan tu historia» (Alexander et al., 1977: 1166). De las vigas cuelgan también «los ponchos y rebozos para los días de fiesta», y los charangos esperan «la mano que les acaricie» (Botelho Gosálvez, 1982 [1945]: 31). El narrador, en cambio, entra como un intruso que no habita, sino que escribe: los camastros son «morada de piojos y pulgas» (ibid.). Pallasmaa recuerda que «la casa es una metáfora del cuerpo y el cuerpo una metáfora de la casa» (Pallasmaa, 2014: 159); el narrador hace de la chujlla una madriguera.</w:t>
+        <w:t xml:space="preserve">La chujlla de los Huanca tiene dos metros de alto, paredes «renegridas por el hollín» y camastros de «apenas la altura de un adobe»; de las vigas, «mal unidas con lazos de paja trenzada», cuelgan «las hoces, el arado, el yugo de madera» (ibid.: 30-31). Junta las dos maneras de construir de Frampton: muros de piedra y adobe que pesan, y un armazón atado como una cestería (Frampton, 1995: 5). Se mide con el cuerpo y es una caja de herramientas, que para Cárcamo Pino es a las manos lo que un idioma a la lengua (Cárcamo Pino, 2025a: 12). Es lo que Monteys y Fuertes piden a la cocina moderna: que no esconda sus utensilios, sino que los cuelgue a la vista, hasta que «ella misma deviene utensilio» (Monteys y Fuertes, 2001: 112). Para ellos, «una casa es una vivienda más la gente que la habita y los objetos que guarda» (ibid.: 14), y para Christopher Alexander un cuarto vale cuando deja ver «las cosas que cuentan tu historia» (Alexander et al., 1977: 1166). De las vigas cuelgan también «los ponchos y rebozos para los días de fiesta», y los charangos esperan «la mano que les acaricie» (Botelho Gosálvez, 1982 [1945]: 31). El narrador, en cambio, entra como un intruso que no habita, sino que escribe: los camastros son «morada de piojos y pulgas» (ibid.). Pallasmaa recuerda que «la casa es una metáfora del cuerpo y el cuerpo una metáfora de la casa» (Pallasmaa, 2014 [2011]: 159); el narrador hace de la chujlla una madriguera.</w:t>
       </w:r>
     </w:p>
     <w:p>
@@ -1613,18 +1633,18 @@
           <wp:inline>
             <wp:extent cx="5039999" cy="3383999"/>
             <wp:effectExtent b="0" l="0" r="0" t="0"/>
-            <wp:docPr descr="" title="" id="15" name="Picture"/>
+            <wp:docPr descr="" title="" id="16" name="Picture"/>
             <a:graphic>
               <a:graphicData uri="http://schemas.openxmlformats.org/drawingml/2006/picture">
                 <pic:pic>
                   <pic:nvPicPr>
-                    <pic:cNvPr descr="figuras/figura_1.png" id="16" name="Picture"/>
+                    <pic:cNvPr descr="figuras/figura_1.png" id="17" name="Picture"/>
                     <pic:cNvPicPr>
                       <a:picLocks noChangeArrowheads="1" noChangeAspect="1"/>
                     </pic:cNvPicPr>
                   </pic:nvPicPr>
                   <pic:blipFill>
-                    <a:blip r:embed="rId14"/>
+                    <a:blip r:embed="rId15"/>
                     <a:stretch>
                       <a:fillRect/>
                     </a:stretch>
@@ -1729,7 +1749,7 @@
         <w:pStyle w:val="BodyText"/>
       </w:pPr>
       <w:r>
-        <w:t xml:space="preserve">La jerarquía no viene solo de fuera. El antepasado de los Villca llega tras la sublevación de Tupaj Katari, y su hijo Pedro «empotró en el suelo del ayllu las estacas de propiedad y empezó a dominar» (Botelho Gosálvez, 1982 [1945]: 20). La primera estaca la clava una mano aymara, y con ella entra en el ayllu la idea señorial del suelo. Los Villca inventan genealogías imperiales porque «necesitaban aquel blasón para sustentar su orgullo y su riqueza» (ibid.: 28): el mito hace de título de propiedad. Hasta la memoria tiene pisos. La de los Villca es «edificante y fantástica»; los peones «no tienen historia», salvo tres palabras: «¡hambre, persecución y muerte!» (ibid.: 22-23). Una canción de The Voidz lleva un título que describe ese edificio: «Pyramid of Bones», pirámide de huesos (The Voidz, 2018). Arriba, el blasón; abajo, el hambre, la persecución y la muerte. El capítulo cierra con una fórmula: «Así los Villca, Huanca y Condori, son las generaciones del Signo Escalonado» (Botelho Gosálvez, 1982 [1945]: 38). El glosario define el término como «Signo sagrado de Tiwanaco» (ibid.: 163). El narrador convierte un signo sagrado en un diagrama de clases, justo lo que advertía Hall.</w:t>
+        <w:t xml:space="preserve">La jerarquía no viene solo de fuera. El antepasado de los Villca llega tras la sublevación de Tupaj Katari, y su hijo Pedro «empotró en el suelo del ayllu las estacas de propiedad y empezó a dominar» (Botelho Gosálvez, 1982 [1945]: 20). La primera estaca la clava una mano aymara, y con ella entra en el ayllu la idea señorial del suelo. Los Villca inventan genealogías imperiales porque «necesitaban aquel blasón para sustentar su orgullo y su riqueza» (ibid.: 28): el mito hace de título de propiedad. Hasta la memoria tiene pisos. La de los Villca es «edificante y fantástica»; los peones «no tienen historia», salvo tres palabras: «¡hambre, persecución y muerte!» (ibid.: 22-23). Una canción de The Voidz lleva un título que describe ese edificio: «Pyramid of Bones», pirámide de huesos (The Voidz, 2018). Arriba, el blasón; abajo, los que lo sostienen. El capítulo cierra con una fórmula: «Así los Villca, Huanca y Condori, son las generaciones del Signo Escalonado» (Botelho Gosálvez, 1982 [1945]: 38). El glosario define el término como «Signo sagrado de Tiwanaco» (ibid.: 163). El narrador convierte un signo sagrado en un diagrama de clases, justo lo que advertía Hall.</w:t>
       </w:r>
     </w:p>
     <w:p>
@@ -1829,18 +1849,18 @@
           <wp:inline>
             <wp:extent cx="4031999" cy="5759999"/>
             <wp:effectExtent b="0" l="0" r="0" t="0"/>
-            <wp:docPr descr="" title="" id="18" name="Picture"/>
+            <wp:docPr descr="" title="" id="19" name="Picture"/>
             <a:graphic>
               <a:graphicData uri="http://schemas.openxmlformats.org/drawingml/2006/picture">
                 <pic:pic>
                   <pic:nvPicPr>
-                    <pic:cNvPr descr="figuras/figura_2.png" id="19" name="Picture"/>
+                    <pic:cNvPr descr="figuras/figura_2.png" id="20" name="Picture"/>
                     <pic:cNvPicPr>
                       <a:picLocks noChangeArrowheads="1" noChangeAspect="1"/>
                     </pic:cNvPicPr>
                   </pic:nvPicPr>
                   <pic:blipFill>
-                    <a:blip r:embed="rId17"/>
+                    <a:blip r:embed="rId18"/>
                     <a:stretch>
                       <a:fillRect/>
                     </a:stretch>
@@ -1892,8 +1912,8 @@
         <w:t xml:space="preserve">. Esquema de encaje del pastel al óleo. Fuente: elaboración propia con asistencia de IA.</w:t>
       </w:r>
     </w:p>
-    <w:bookmarkEnd w:id="20"/>
-    <w:bookmarkStart w:id="21" w:name="umacachi-la-trampa-de-los-papeles"/>
+    <w:bookmarkEnd w:id="21"/>
+    <w:bookmarkStart w:id="22" w:name="umacachi-la-trampa-de-los-papeles"/>
     <w:p>
       <w:pPr>
         <w:pStyle w:val="Heading2"/>
@@ -1987,8 +2007,8 @@
         <w:t xml:space="preserve">, casa: la aldea los alojó como a animales de casa.</w:t>
       </w:r>
     </w:p>
-    <w:bookmarkEnd w:id="21"/>
-    <w:bookmarkStart w:id="28" w:name="el-éxodo-los-yungas-y-la-mina"/>
+    <w:bookmarkEnd w:id="22"/>
+    <w:bookmarkStart w:id="29" w:name="el-éxodo-los-yungas-y-la-mina"/>
     <w:p>
       <w:pPr>
         <w:pStyle w:val="Heading2"/>
@@ -2163,18 +2183,18 @@
           <wp:inline>
             <wp:extent cx="5039999" cy="3599999"/>
             <wp:effectExtent b="0" l="0" r="0" t="0"/>
-            <wp:docPr descr="" title="" id="23" name="Picture"/>
+            <wp:docPr descr="" title="" id="24" name="Picture"/>
             <a:graphic>
               <a:graphicData uri="http://schemas.openxmlformats.org/drawingml/2006/picture">
                 <pic:pic>
                   <pic:nvPicPr>
-                    <pic:cNvPr descr="figuras/figura_3.png" id="24" name="Picture"/>
+                    <pic:cNvPr descr="figuras/figura_3.png" id="25" name="Picture"/>
                     <pic:cNvPicPr>
                       <a:picLocks noChangeArrowheads="1" noChangeAspect="1"/>
                     </pic:cNvPicPr>
                   </pic:nvPicPr>
                   <pic:blipFill>
-                    <a:blip r:embed="rId22"/>
+                    <a:blip r:embed="rId23"/>
                     <a:stretch>
                       <a:fillRect/>
                     </a:stretch>
@@ -2360,18 +2380,18 @@
           <wp:inline>
             <wp:extent cx="4214634" cy="5759999"/>
             <wp:effectExtent b="0" l="0" r="0" t="0"/>
-            <wp:docPr descr="" title="" id="26" name="Picture"/>
+            <wp:docPr descr="" title="" id="27" name="Picture"/>
             <a:graphic>
               <a:graphicData uri="http://schemas.openxmlformats.org/drawingml/2006/picture">
                 <pic:pic>
                   <pic:nvPicPr>
-                    <pic:cNvPr descr="figuras/figura_4.png" id="27" name="Picture"/>
+                    <pic:cNvPr descr="figuras/figura_4.png" id="28" name="Picture"/>
                     <pic:cNvPicPr>
                       <a:picLocks noChangeArrowheads="1" noChangeAspect="1"/>
                     </pic:cNvPicPr>
                   </pic:nvPicPr>
                   <pic:blipFill>
-                    <a:blip r:embed="rId25"/>
+                    <a:blip r:embed="rId26"/>
                     <a:stretch>
                       <a:fillRect/>
                     </a:stretch>
@@ -2423,8 +2443,8 @@
         <w:t xml:space="preserve">. Esquema de encaje del pastel al óleo. Fuente: elaboración propia con asistencia de IA.</w:t>
       </w:r>
     </w:p>
-    <w:bookmarkEnd w:id="28"/>
-    <w:bookmarkStart w:id="35" w:name="X708018351417205dc0884bafc6e4107def1df7f"/>
+    <w:bookmarkEnd w:id="29"/>
+    <w:bookmarkStart w:id="36" w:name="X708018351417205dc0884bafc6e4107def1df7f"/>
     <w:p>
       <w:pPr>
         <w:pStyle w:val="Heading2"/>
@@ -2475,7 +2495,23 @@
         <w:t xml:space="preserve">kenchería</w:t>
       </w:r>
       <w:r>
-        <w:t xml:space="preserve">, «mal de ojo, brujería» (Botelho Gosálvez, 1982 [1945]: 162): la espina del muñeco reaparece en la carne, y la efigie actúa. El narrador presenta a la multitud como animales, vuelve sexual la furia de Justina y sienta al lector en la tribuna, como un juez. Por eso la serie no dibuja el linchamiento: un pastel de ese cuerpo sería otra efigie, y reunir sus pedazos en una hoja, una collage.</w:t>
+        <w:t xml:space="preserve">, «mal de ojo, brujería» (Botelho Gosálvez, 1982 [1945]: 162): la espina del muñeco reaparece en la carne, y la efigie actúa. El narrador presenta a la multitud como animales, vuelve sexual la furia de Justina y sienta al lector en la tribuna, como un juez. Fuão llama</w:t>
+      </w:r>
+      <w:r>
+        <w:t xml:space="preserve"> </w:t>
+      </w:r>
+      <w:r>
+        <w:rPr>
+          <w:i/>
+          <w:iCs/>
+        </w:rPr>
+        <w:t xml:space="preserve">voyeurismo</w:t>
+      </w:r>
+      <w:r>
+        <w:t xml:space="preserve"> </w:t>
+      </w:r>
+      <w:r>
+        <w:t xml:space="preserve">a esa posición: separar al observador del objeto «mediante un distanciamiento de la mirada y el ocultamiento del propio cuerpo» (Fuão, 2011: 24). Por eso la serie no dibuja el linchamiento: un pastel de ese cuerpo sería otra efigie, y reunir sus pedazos en una hoja, una collage.</w:t>
       </w:r>
     </w:p>
     <w:p>
@@ -2529,7 +2565,7 @@
         <w:t xml:space="preserve">Texto</w:t>
       </w:r>
       <w:r>
-        <w:t xml:space="preserve">. «La Pacha Mama, sorda, vieja, extenuada, recibía el cuerpo de sus más fieles hijos para encerrarlos en su vientre de sequedad inexorable» (ibid.: 66); las vacas hambrientas muestran «las nalgas abiertas a la manera de una luna menguante» (ibid.: 64). (2)</w:t>
+        <w:t xml:space="preserve">. «La Pacha Mama, sorda, vieja, extenuada, recibía el cuerpo de sus más fieles hijos para encerrarlos en su vientre de sequedad inexorable» (Botelho Gosálvez, 1982 [1945]: 66); las vacas hambrientas muestran «las nalgas abiertas a la manera de una luna menguante» (ibid.: 64). (2)</w:t>
       </w:r>
       <w:r>
         <w:t xml:space="preserve"> </w:t>
@@ -2596,18 +2632,18 @@
           <wp:inline>
             <wp:extent cx="5039999" cy="3743999"/>
             <wp:effectExtent b="0" l="0" r="0" t="0"/>
-            <wp:docPr descr="" title="" id="30" name="Picture"/>
+            <wp:docPr descr="" title="" id="31" name="Picture"/>
             <a:graphic>
               <a:graphicData uri="http://schemas.openxmlformats.org/drawingml/2006/picture">
                 <pic:pic>
                   <pic:nvPicPr>
-                    <pic:cNvPr descr="figuras/figura_5.png" id="31" name="Picture"/>
+                    <pic:cNvPr descr="figuras/figura_5.png" id="32" name="Picture"/>
                     <pic:cNvPicPr>
                       <a:picLocks noChangeArrowheads="1" noChangeAspect="1"/>
                     </pic:cNvPicPr>
                   </pic:nvPicPr>
                   <pic:blipFill>
-                    <a:blip r:embed="rId29"/>
+                    <a:blip r:embed="rId30"/>
                     <a:stretch>
                       <a:fillRect/>
                     </a:stretch>
@@ -2774,18 +2810,18 @@
           <wp:inline>
             <wp:extent cx="3839999" cy="5759999"/>
             <wp:effectExtent b="0" l="0" r="0" t="0"/>
-            <wp:docPr descr="" title="" id="33" name="Picture"/>
+            <wp:docPr descr="" title="" id="34" name="Picture"/>
             <a:graphic>
               <a:graphicData uri="http://schemas.openxmlformats.org/drawingml/2006/picture">
                 <pic:pic>
                   <pic:nvPicPr>
-                    <pic:cNvPr descr="figuras/figura_6.png" id="34" name="Picture"/>
+                    <pic:cNvPr descr="figuras/figura_6.png" id="35" name="Picture"/>
                     <pic:cNvPicPr>
                       <a:picLocks noChangeArrowheads="1" noChangeAspect="1"/>
                     </pic:cNvPicPr>
                   </pic:nvPicPr>
                   <pic:blipFill>
-                    <a:blip r:embed="rId32"/>
+                    <a:blip r:embed="rId33"/>
                     <a:stretch>
                       <a:fillRect/>
                     </a:stretch>
@@ -2837,8 +2873,8 @@
         <w:t xml:space="preserve">. Esquema de encaje del pastel al óleo. Fuente: elaboración propia con asistencia de IA.</w:t>
       </w:r>
     </w:p>
-    <w:bookmarkEnd w:id="35"/>
-    <w:bookmarkStart w:id="39" w:name="Xd33dadc6dc41c4f190a3160c8a87a45b956b4eb"/>
+    <w:bookmarkEnd w:id="36"/>
+    <w:bookmarkStart w:id="40" w:name="Xd33dadc6dc41c4f190a3160c8a87a45b956b4eb"/>
     <w:p>
       <w:pPr>
         <w:pStyle w:val="Heading2"/>
@@ -2852,7 +2888,7 @@
         <w:pStyle w:val="FirstParagraph"/>
       </w:pPr>
       <w:r>
-        <w:t xml:space="preserve">Con las heladas vuelven los sobrevivientes: «en el dintel de Jatun-Kolla se detenían para ponerse de rodillas y besar el suelo que habían abandonado en el terror» (Botelho Gosálvez, 1982 [1945]: 155). El ayllu tiene dintel: es una casa. Volver es también juntar lo disperso: las familias llegan «de los cuatro rumbos de la pampa» (ibid.: 155), y la palabra</w:t>
+        <w:t xml:space="preserve">Con las heladas vuelven los sobrevivientes: «en el dintel de Jatun-Kolla se detenían para ponerse de rodillas y besar el suelo que habían abandonado en el terror» (Botelho Gosálvez, 1982 [1945]: 155). El ayllu tiene dintel: es una casa. Volver es también juntar lo disperso: las familias llegan «de los cuatro rumbos de la pampa» (ibid.), y la palabra</w:t>
       </w:r>
       <w:r>
         <w:t xml:space="preserve"> </w:t>
@@ -2891,7 +2927,15 @@
         <w:t xml:space="preserve">saywaña</w:t>
       </w:r>
       <w:r>
-        <w:t xml:space="preserve">: «mojonar las chácaras con montones de piedra» (Bertonio, 2011 [1612]: 466). Alexander define la propiedad por el control, no por el dinero, y pide «el poder legal y la oportunidad física de modificar y reparar sus propios lugares» (Alexander et al., 1977: 395). La novela las separa: el poder, en los papeles; la oportunidad, en las manos. Reparar a la vez la casa y el lindero es lo que Alexander pide a todo el que construye: «reparar el mundo a su alrededor, y dentro de él» (Alexander et al., 1977: xiii). En Umacachi, la ordenanza se llevó los bueyes de los Villca, que se lamentaban: «Y ni siquiera tenemos una yunta» (Botelho Gosálvez, 1982 [1945]: 105). Al volver, sin yuntas, «los mismos hombres eran quienes tiraban el arado» (ibid.: 156). El cuerpo ocupa el lugar del buey, y recuerda: al volver a la casa antigua, escribe Bachelard, «los gestos más finos, los gestos primeros, son súbitamente vivos, siempre perfectos», porque «la casa natal ha inscrito en nosotros la jerarquía de las diversas funciones del habitar» (Bachelard, 1983 [1957]: 45, cit. en Monteys y Fuertes, 2001: 42). Y el narrador vuelve a convertirlos en piedra: trabajan «con una voluntad de siglos de piedra» (Botelho Gosálvez, 1982 [1945]: 156), una piedra fuera de la historia, no la</w:t>
+        <w:t xml:space="preserve">: «mojonar las chácaras con montones de piedra» (Bertonio, 2011 [1612]: 466). Alexander define la propiedad por el control, no por el dinero, y pide «el poder legal y la oportunidad física de modificar y reparar sus propios lugares» (Alexander et al., 1977: 395). La novela las separa: el poder, en los papeles; la oportunidad, en las manos. Reparar a la vez la casa y el lindero es lo que Alexander pide a todo el que construye: «reparar el mundo a su alrededor, y dentro de él» (ibid.: xiii).</w:t>
+      </w:r>
+    </w:p>
+    <w:p>
+      <w:pPr>
+        <w:pStyle w:val="BodyText"/>
+      </w:pPr>
+      <w:r>
+        <w:t xml:space="preserve">En Umacachi, la ordenanza se llevó los bueyes de los Villca, que se lamentaban: «Y ni siquiera tenemos una yunta» (Botelho Gosálvez, 1982 [1945]: 105). Al volver, sin yuntas, «los mismos hombres eran quienes tiraban el arado» (ibid.: 156). El cuerpo ocupa el lugar del buey, y recuerda: al volver a la casa antigua, escribe Bachelard, «los gestos más finos, los gestos primeros, son súbitamente vivos, siempre perfectos», porque «la casa natal ha inscrito en nosotros la jerarquía de las diversas funciones del habitar» (Bachelard, 1983 [1957]: 45, cit. en Monteys y Fuertes, 2001: 42). Y el narrador vuelve a convertirlos en piedra: trabajan «con una voluntad de siglos de piedra» (Botelho Gosálvez, 1982 [1945]: 156), una piedra fuera de la historia, no la</w:t>
       </w:r>
       <w:r>
         <w:t xml:space="preserve"> </w:t>
@@ -2931,7 +2975,15 @@
         <w:pStyle w:val="FirstParagraph"/>
       </w:pPr>
       <w:r>
-        <w:t xml:space="preserve">Muralla, foso, atalaya: recordar es construir, y olvidar también (Figura 7). Fuão describe ese olvido como el trabajo de la cola: crea «la ilusión de integridad», «no cura ni salva, solo cierra la boca de los abismos» (Fuão, 2011: 88); y el tiempo, añade, es la más potente de las colas, porque «cierra cicatrices» (ibid.: 91). Es lo contrario del lema del epígrafe: los comunarios de la novela no caminan mirando al pasado; lo esconden en un foso. La selección tiene nombres: «Llegaron los Villca, los Huanca, los Huallpa, los Yupanqui, los Ticona, los Choque, los Chuquihuanca» (Botelho Gosálvez, 1982 [1945]: 156). Faltan los Condori, los Mamani y los Quispe, la «legión» sin tierra que cerraba la escalera del narrador (ibid.: 22). El Signo Escalonado se rehace sin su último escalón. Si, como concluyen Monteys y Fuertes, las personas «son la casa» (Monteys y Fuertes, 2001: 148), el ayllu se rehace incompleto. Una pirca de doble cara enseña lo que esa memoria olvida: las piedras grandes dan la cara, pero adentro van las menudas, y sin ese relleno el muro se cae. El narrador también llama «legión» a la «piedrecilla menuda» que baja del cerro hasta las pircas (Botelho Gosálvez, 1982 [1945]: 8). Los sin tierra fueron ese relleno: tres de ellos, sin nombre, cuidaron el ayllu vacío, y el retorno no los cuenta. Con la cosecha, los derrotados «olvidaron la pesadilla pasada» (ibid.: 159). Endurecerse para no sufrir la pérdida tiene nombre en aymara:</w:t>
+        <w:t xml:space="preserve">Muralla, foso, atalaya: recordar es construir, y olvidar también (Figura 7). Dean lo dice de las piedras incas, «memorias materializadas»: «recordar una versión del pasado exige olvidar o reprimir otra versión de ese mismo pasado» (Dean, 2010: 39). Fuão describe ese olvido como el trabajo de la cola: crea «la ilusión de integridad», «no cura ni salva, solo cierra la boca de los abismos» (Fuão, 2011: 88); y el tiempo, añade, es la más potente de las colas, porque «cierra cicatrices» (ibid.: 91). Es lo contrario del lema del epígrafe: los comunarios de la novela no caminan mirando al pasado; lo esconden en un foso. La selección tiene nombres: «Llegaron los Villca, los Huanca, los Huallpa, los Yupanqui, los Ticona, los Choque, los Chuquihuanca» (Botelho Gosálvez, 1982 [1945]: 156). Faltan los Condori, los Mamani y los Quispe, la «legión» sin tierra que cerraba la escalera del narrador (ibid.: 22). El Signo Escalonado se rehace sin su último escalón. Si, como concluyen Monteys y Fuertes, las personas «son la casa» (Monteys y Fuertes, 2001: 148), el ayllu se rehace incompleto.</w:t>
+      </w:r>
+    </w:p>
+    <w:p>
+      <w:pPr>
+        <w:pStyle w:val="BodyText"/>
+      </w:pPr>
+      <w:r>
+        <w:t xml:space="preserve">Una pirca de doble cara enseña lo que esa memoria olvida: las piedras grandes dan la cara, pero adentro van las menudas, y sin ese relleno el muro se cae. El narrador también llama «legión» a la «piedrecilla menuda» que baja del cerro hasta las pircas (Botelho Gosálvez, 1982 [1945]: 8). Los sin tierra fueron ese relleno: tres de ellos, sin nombre, cuidaron el ayllu vacío, y el retorno no los cuenta. Con la cosecha, los derrotados «olvidaron la pesadilla pasada» (ibid.: 159). Endurecerse para no sufrir la pérdida tiene nombre en aymara:</w:t>
       </w:r>
       <w:r>
         <w:t xml:space="preserve"> </w:t>
@@ -2972,18 +3024,18 @@
           <wp:inline>
             <wp:extent cx="5039999" cy="3239999"/>
             <wp:effectExtent b="0" l="0" r="0" t="0"/>
-            <wp:docPr descr="" title="" id="37" name="Picture"/>
+            <wp:docPr descr="" title="" id="38" name="Picture"/>
             <a:graphic>
               <a:graphicData uri="http://schemas.openxmlformats.org/drawingml/2006/picture">
                 <pic:pic>
                   <pic:nvPicPr>
-                    <pic:cNvPr descr="figuras/figura_7.png" id="38" name="Picture"/>
+                    <pic:cNvPr descr="figuras/figura_7.png" id="39" name="Picture"/>
                     <pic:cNvPicPr>
                       <a:picLocks noChangeArrowheads="1" noChangeAspect="1"/>
                     </pic:cNvPicPr>
                   </pic:nvPicPr>
                   <pic:blipFill>
-                    <a:blip r:embed="rId36"/>
+                    <a:blip r:embed="rId37"/>
                     <a:stretch>
                       <a:fillRect/>
                     </a:stretch>
@@ -3043,8 +3095,8 @@
         <w:t xml:space="preserve">Ursula K. Le Guin opuso dos formas de contar: la del arma y la del recipiente. «Una novela es un botiquín», escribió, «que contiene cosas en una relación particular, poderosa, entre sí, y con nosotros» (Le Guin, 2021 [1986]: 10). La mina pertenece a la historia del arma: jornal, revólver, boquete. El ayllu del retorno, a la del recipiente: la casa, «un recipiente para personas» (ibid.: 8), vuelve a guardar la cosecha y a reunir los nombres. Pero todo recipiente elige qué guarda. El narrador cierra con héroes: los derrotados vuelven a ser «los patriarcas fecundadores del suelo, los sembradores del destino» (Botelho Gosálvez, 1982 [1945]: 159). El héroe, advierte Le Guin, no cabe en la bolsa: «Necesita un escenario, o un pedestal, o una cima» (Le Guin, 2021 [1986]: 11). Aquí, la atalaya. La novela, que guarda lo que el ayllu prefiere no mirar, es el recipiente más grande.</w:t>
       </w:r>
     </w:p>
-    <w:bookmarkEnd w:id="39"/>
-    <w:bookmarkStart w:id="43" w:name="X6513926464102a35f22aafc801b0596a5c3805e"/>
+    <w:bookmarkEnd w:id="40"/>
+    <w:bookmarkStart w:id="44" w:name="X6513926464102a35f22aafc801b0596a5c3805e"/>
     <w:p>
       <w:pPr>
         <w:pStyle w:val="Heading2"/>
@@ -3070,18 +3122,18 @@
           <wp:inline>
             <wp:extent cx="4338227" cy="6119999"/>
             <wp:effectExtent b="0" l="0" r="0" t="0"/>
-            <wp:docPr descr="" title="" id="41" name="Picture"/>
+            <wp:docPr descr="" title="" id="42" name="Picture"/>
             <a:graphic>
               <a:graphicData uri="http://schemas.openxmlformats.org/drawingml/2006/picture">
                 <pic:pic>
                   <pic:nvPicPr>
-                    <pic:cNvPr descr="figuras/figura_8.png" id="42" name="Picture"/>
+                    <pic:cNvPr descr="figuras/figura_8.png" id="43" name="Picture"/>
                     <pic:cNvPicPr>
                       <a:picLocks noChangeArrowheads="1" noChangeAspect="1"/>
                     </pic:cNvPicPr>
                   </pic:nvPicPr>
                   <pic:blipFill>
-                    <a:blip r:embed="rId40"/>
+                    <a:blip r:embed="rId41"/>
                     <a:stretch>
                       <a:fillRect/>
                     </a:stretch>
@@ -3159,7 +3211,7 @@
         <w:t xml:space="preserve">capriccio</w:t>
       </w:r>
       <w:r>
-        <w:t xml:space="preserve">, Bacon, la tectónica, Alexander, la collage y hasta la pelvis son maneras de ver ajenas al mundo narrado. Los dibujos hablan de la novela, no del ayllu ni de la manera aymara de entender el espacio, que pedirían otras fuentes y otros autores: los de la historia que los aymaras, escribía Roberto Choque Canqui, «hace tiempo, hemos añorado por escribir» (Choque Canqui, 1978 [1974]: s. p.). El segundo es ético: la inmersión seduce, y un pastel puede embellecer la miseria o fabricar efigies; por eso la serie no dibuja el linchamiento ni el alma que el narrador declara cerrada. El tercero es de método: el dibujo depende de los datos del texto y hereda sus silencios. Puede hacerlos visibles, pero no llenarlos.</w:t>
+        <w:t xml:space="preserve">, Bacon, la tectónica, Alexander, la collage, los tres cerditos, The Voidz y hasta la pelvis son maneras de ver ajenas al mundo narrado. Los dibujos hablan de la novela, no del ayllu ni de la manera aymara de entender el espacio, que pedirían otras fuentes y otros autores: los de la historia que los aymaras, escribía Roberto Choque Canqui, «hace tiempo, hemos añorado por escribir» (Choque Canqui, 1978 [1974]: s. p.). El segundo es ético: la inmersión seduce, y un pastel puede embellecer la miseria o fabricar efigies; por eso la serie no dibuja el linchamiento ni el alma que el narrador declara cerrada. El tercero es de método: el dibujo depende de los datos del texto y hereda sus silencios. Puede hacerlos visibles, pero no llenarlos.</w:t>
       </w:r>
     </w:p>
     <w:p>
@@ -3202,8 +3254,8 @@
         <w:t xml:space="preserve">con la mano es, quizá, volver a amontonarlas para ver qué queda debajo.</w:t>
       </w:r>
     </w:p>
-    <w:bookmarkEnd w:id="43"/>
-    <w:bookmarkStart w:id="44" w:name="declaraciones-finales"/>
+    <w:bookmarkEnd w:id="44"/>
+    <w:bookmarkStart w:id="45" w:name="declaraciones-finales"/>
     <w:p>
       <w:pPr>
         <w:pStyle w:val="Heading2"/>
@@ -3287,8 +3339,8 @@
         <w:t xml:space="preserve">: el autor concibió la hipótesis original, diseñó la metodología de lectura tectónica, seleccionó las fuentes, decidió las interpretaciones, dirigió y revisó la redacción y es autor exclusivo de los pasteles al óleo que sustentan la investigación; asume la plena responsabilidad intelectual por la versión final del manuscrito.</w:t>
       </w:r>
     </w:p>
-    <w:bookmarkEnd w:id="44"/>
-    <w:bookmarkStart w:id="45" w:name="bibliografía"/>
+    <w:bookmarkEnd w:id="45"/>
+    <w:bookmarkStart w:id="46" w:name="bibliografía"/>
     <w:p>
       <w:pPr>
         <w:pStyle w:val="Heading2"/>
@@ -3919,6 +3971,36 @@
         <w:pStyle w:val="BodyText"/>
       </w:pPr>
       <w:r>
+        <w:t xml:space="preserve">Spedding, Alison (2025).</w:t>
+      </w:r>
+      <w:r>
+        <w:t xml:space="preserve"> </w:t>
+      </w:r>
+      <w:r>
+        <w:t xml:space="preserve">“Piedras en el camino”</w:t>
+      </w:r>
+      <w:r>
+        <w:t xml:space="preserve">. En Eloísa Paz y alfonso borragán (dirs.),</w:t>
+      </w:r>
+      <w:r>
+        <w:t xml:space="preserve"> </w:t>
+      </w:r>
+      <w:r>
+        <w:rPr>
+          <w:i/>
+          <w:iCs/>
+        </w:rPr>
+        <w:t xml:space="preserve">Susto al susto</w:t>
+      </w:r>
+      <w:r>
+        <w:t xml:space="preserve">. La Paz: A ediciones: XIII-XXIII.</w:t>
+      </w:r>
+    </w:p>
+    <w:p>
+      <w:pPr>
+        <w:pStyle w:val="BodyText"/>
+      </w:pPr>
+      <w:r>
         <w:t xml:space="preserve">The Voidz (2018).</w:t>
       </w:r>
       <w:r>
@@ -3943,36 +4025,6 @@
         <w:pStyle w:val="BodyText"/>
       </w:pPr>
       <w:r>
-        <w:t xml:space="preserve">Spedding, Alison (2025).</w:t>
-      </w:r>
-      <w:r>
-        <w:t xml:space="preserve"> </w:t>
-      </w:r>
-      <w:r>
-        <w:t xml:space="preserve">“Piedras en el camino”</w:t>
-      </w:r>
-      <w:r>
-        <w:t xml:space="preserve">. En Eloísa Paz y alfonso borragán (dirs.),</w:t>
-      </w:r>
-      <w:r>
-        <w:t xml:space="preserve"> </w:t>
-      </w:r>
-      <w:r>
-        <w:rPr>
-          <w:i/>
-          <w:iCs/>
-        </w:rPr>
-        <w:t xml:space="preserve">Susto al susto</w:t>
-      </w:r>
-      <w:r>
-        <w:t xml:space="preserve">. La Paz: A ediciones: XIII-XXIII.</w:t>
-      </w:r>
-    </w:p>
-    <w:p>
-      <w:pPr>
-        <w:pStyle w:val="BodyText"/>
-      </w:pPr>
-      <w:r>
         <w:t xml:space="preserve">Vázquez Ramos, Fernando Guillermo; Dias Ribeiro, Carlos Eduardo; Quedas Campoy, Carlos y Ferreira de Paula, Franklin Roberto (2023).</w:t>
       </w:r>
       <w:r>
@@ -4019,8 +4071,8 @@
         <w:t xml:space="preserve">. México: Siglo XXI.</w:t>
       </w:r>
     </w:p>
-    <w:bookmarkEnd w:id="45"/>
     <w:bookmarkEnd w:id="46"/>
+    <w:bookmarkEnd w:id="47"/>
     <w:sectPr>
       <w:footnotePr>
         <w:numRestart w:val="eachSect"/>
@@ -4122,6 +4174,25 @@
       </w:r>
       <w:r>
         <w:t xml:space="preserve">suprime», y juntas «reduplican su significado» (Fuão, 2011: 43). El esgrafiado hace lo que Fuão llama «la segunda incisión»: la cámara ya cortó la realidad en rectángulos, y «un segundo recorte desfigura la imagen rectangular inicial, dándole un nuevo significado» (ibid.: 29). La novela es el primer corte; el dibujo, el segundo.</w:t>
+      </w:r>
+    </w:p>
+  </w:footnote>
+  <w:footnote w:id="13">
+    <w:p>
+      <w:pPr>
+        <w:pStyle w:val="FootnoteText"/>
+      </w:pPr>
+      <w:r>
+        <w:rPr>
+          <w:rStyle w:val="FootnoteReference"/>
+        </w:rPr>
+        <w:footnoteRef/>
+      </w:r>
+      <w:r>
+        <w:t xml:space="preserve"> </w:t>
+      </w:r>
+      <w:r>
+        <w:t xml:space="preserve">Este artículo está hecho, literalmente, de recortes: más de ciento cincuenta citas de la novela. Fuão ve en las comillas «la mejor evidencia del recorte», una herida que marca «una sutura de cuatro puntos» (Fuão, 2011: 39).</w:t>
       </w:r>
     </w:p>
   </w:footnote>

</xml_diff>

<commit_message>
Cita dos pasajes de las letras de The Voidz y quita los tres cerditos
Con las letras que aportó el autor entran dos pasajes: «They play the
game by different rules / Insisting it's all equal», para la ordenanza
que no alcanza a los mestizos (§4), y «I do not want to see the whole
mess / I wish I could live in retrospect», para la memoria del retorno
(§7). Salen los tres cerditos, que eran solo un ejemplo del método de
Cárcamo Pino; queda el apodo «el lobo», que es de la novela. El
análisis 27 coteja con las letras los versos de la otra IA (dos de
trece eran correctos) y corrige el veredicto sobre «Lies are simple».

Co-Authored-By: Claude Opus 5.5 <noreply@anthropic.com>
Claude-Session: https://claude.ai/code/session_01QWC9b4jcZbzQ8czhYUvPYd
</commit_message>
<xml_diff>
--- a/articulo/articulo_cosecha_de_piedras.docx
+++ b/articulo/articulo_cosecha_de_piedras.docx
@@ -1959,7 +1959,7 @@
         <w:pStyle w:val="BodyText"/>
       </w:pPr>
       <w:r>
-        <w:t xml:space="preserve">Los Villca llegan a la aldea con treinta y cuatro ovejas, y la chola Encarnación, por cincuenta bolivianos, les cede el corral: «Tu familia puede acomodarse en el pesebre» (Botelho Gosálvez, 1982 [1945]: 92). Entonces llega la letra: «Todos los animales de carneo que existen dentro del radio urbano serán requisados […] (Fdo.) Dr. Margarito Mendoza» (ibid.: 96). Cárcamo Pino explica la madera con «el imaginario de los tres cerditos» (Cárcamo Pino, 2025a: 8). En Umacachi el cuento es otro: el lobo no sopla ninguna casa, firma. El radio urbano funciona como un corral invisible: un círculo trazado en un papel encierra a todos los animales que quedan dentro, y lo cierra una firma. Es un corte en el sentido de Fuão: la tijera, «un instrumento al servicio de la razón», define, y definir es distinguir «entre lo incluido y lo excluido, el dentro y el fuera» (Fuão, 2011: 33-35). La aldea mide con compás; el ayllu medía con la pendiente y con las piedras. James C. Scott observa que un mapa catastral «no se limita a describir un sistema de tenencia de la tierra; lo crea», porque da a sus categorías «la fuerza de la ley» (Scott, 2020 [1998]: 3). El radio hace lo mismo con el ganado, y no trata a todos igual: a los mestizos «no les alcanzaba la Ordenanza» (Botelho Gosálvez, 1982 [1945]: 102). En una sociedad «de dudosa cuantificación como Bolivia» (Zavaleta Mercado, 1986: 21, n. 1), el poder cuenta a ojo: los animales de los indios, tasados «a ojo de buen cubero», entran por el «embudo» de las fincas del Alcalde «hasta esfumarse» (Botelho Gosálvez, 1982 [1945]: 102). Por un lado entran bueyes, vacas y ovejas; por el otro sale papel: la fortuna de los Villca se reduce «a mil seiscientos bolivianos en papel» (ibid.: 103).</w:t>
+        <w:t xml:space="preserve">Los Villca llegan a la aldea con treinta y cuatro ovejas, y la chola Encarnación, por cincuenta bolivianos, les cede el corral: «Tu familia puede acomodarse en el pesebre» (Botelho Gosálvez, 1982 [1945]: 92). Entonces llega la letra: «Todos los animales de carneo que existen dentro del radio urbano serán requisados […] (Fdo.) Dr. Margarito Mendoza» (ibid.: 96). La firma es la del lobo. El radio urbano funciona como un corral invisible: un círculo trazado en un papel encierra a todos los animales que quedan dentro, y lo cierra una firma. Es un corte en el sentido de Fuão: la tijera, «un instrumento al servicio de la razón», define, y definir es distinguir «entre lo incluido y lo excluido, el dentro y el fuera» (Fuão, 2011: 33-35). La aldea mide con compás; el ayllu medía con la pendiente y con las piedras. James C. Scott observa que un mapa catastral «no se limita a describir un sistema de tenencia de la tierra; lo crea», porque da a sus categorías «la fuerza de la ley» (Scott, 2020 [1998]: 3). El radio hace lo mismo con el ganado, y no trata a todos igual: a los mestizos «no les alcanzaba la Ordenanza» (Botelho Gosálvez, 1982 [1945]: 102). Lo dicen dos versos de «Pyramid of Bones»: «They play the game by different rules / Insisting it’s all equal», juegan con otras reglas e insisten en que todo es igual (The Voidz, 2018). En una sociedad «de dudosa cuantificación como Bolivia» (Zavaleta Mercado, 1986: 21, n. 1), el poder cuenta a ojo: los animales de los indios, tasados «a ojo de buen cubero», entran por el «embudo» de las fincas del Alcalde «hasta esfumarse» (Botelho Gosálvez, 1982 [1945]: 102). Por un lado entran bueyes, vacas y ovejas; por el otro sale papel: la fortuna de los Villca se reduce «a mil seiscientos bolivianos en papel» (ibid.: 103).</w:t>
       </w:r>
     </w:p>
     <w:p>
@@ -2975,7 +2975,15 @@
         <w:pStyle w:val="FirstParagraph"/>
       </w:pPr>
       <w:r>
-        <w:t xml:space="preserve">Muralla, foso, atalaya: recordar es construir, y olvidar también (Figura 7). Dean lo dice de las piedras incas, «memorias materializadas»: «recordar una versión del pasado exige olvidar o reprimir otra versión de ese mismo pasado» (Dean, 2010: 39). Fuão describe ese olvido como el trabajo de la cola: crea «la ilusión de integridad», «no cura ni salva, solo cierra la boca de los abismos» (Fuão, 2011: 88); y el tiempo, añade, es la más potente de las colas, porque «cierra cicatrices» (ibid.: 91). Es lo contrario del lema del epígrafe: los comunarios de la novela no caminan mirando al pasado; lo esconden en un foso. La selección tiene nombres: «Llegaron los Villca, los Huanca, los Huallpa, los Yupanqui, los Ticona, los Choque, los Chuquihuanca» (Botelho Gosálvez, 1982 [1945]: 156). Faltan los Condori, los Mamani y los Quispe, la «legión» sin tierra que cerraba la escalera del narrador (ibid.: 22). El Signo Escalonado se rehace sin su último escalón. Si, como concluyen Monteys y Fuertes, las personas «son la casa» (Monteys y Fuertes, 2001: 148), el ayllu se rehace incompleto.</w:t>
+        <w:t xml:space="preserve">Muralla, foso, atalaya: recordar es construir, y olvidar también (Figura 7). Dean lo dice de las piedras incas, «memorias materializadas»: «recordar una versión del pasado exige olvidar o reprimir otra versión de ese mismo pasado» (Dean, 2010: 39). Fuão describe ese olvido como el trabajo de la cola: crea «la ilusión de integridad», «no cura ni salva, solo cierra la boca de los abismos» (Fuão, 2011: 88); y el tiempo, añade, es la más potente de las colas, porque «cierra cicatrices» (ibid.: 91). Es lo contrario del lema del epígrafe: los comunarios de la novela no caminan mirando al pasado; lo esconden en un foso. Dos versos seguidos de «Father Electricity» juntan los dos gestos de esa memoria: «I do not want to see the whole mess / I wish I could live in retrospect», no quiero ver todo el desastre; ojalá pudiera vivir mirando atrás (Julian Casablancas+The Voidz, 2014). Los comunarios miran atrás, pero no para caminar, como pide el lema, sino para saltar el foso: recuerdan las cosechas, no el hambre.</w:t>
+      </w:r>
+    </w:p>
+    <w:p>
+      <w:pPr>
+        <w:pStyle w:val="BodyText"/>
+      </w:pPr>
+      <w:r>
+        <w:t xml:space="preserve">La selección tiene nombres: «Llegaron los Villca, los Huanca, los Huallpa, los Yupanqui, los Ticona, los Choque, los Chuquihuanca» (Botelho Gosálvez, 1982 [1945]: 156). Faltan los Condori, los Mamani y los Quispe, la «legión» sin tierra que cerraba la escalera del narrador (ibid.: 22). El Signo Escalonado se rehace sin su último escalón. Si, como concluyen Monteys y Fuertes, las personas «son la casa» (Monteys y Fuertes, 2001: 148), el ayllu se rehace incompleto.</w:t>
       </w:r>
     </w:p>
     <w:p>
@@ -3211,7 +3219,7 @@
         <w:t xml:space="preserve">capriccio</w:t>
       </w:r>
       <w:r>
-        <w:t xml:space="preserve">, Bacon, la tectónica, Alexander, la collage, los tres cerditos, The Voidz y hasta la pelvis son maneras de ver ajenas al mundo narrado. Los dibujos hablan de la novela, no del ayllu ni de la manera aymara de entender el espacio, que pedirían otras fuentes y otros autores: los de la historia que los aymaras, escribía Roberto Choque Canqui, «hace tiempo, hemos añorado por escribir» (Choque Canqui, 1978 [1974]: s. p.). El segundo es ético: la inmersión seduce, y un pastel puede embellecer la miseria o fabricar efigies; por eso la serie no dibuja el linchamiento ni el alma que el narrador declara cerrada. El tercero es de método: el dibujo depende de los datos del texto y hereda sus silencios. Puede hacerlos visibles, pero no llenarlos.</w:t>
+        <w:t xml:space="preserve">, Bacon, la tectónica, Alexander, la collage, The Voidz y hasta la pelvis son maneras de ver ajenas al mundo narrado. Los dibujos hablan de la novela, no del ayllu ni de la manera aymara de entender el espacio, que pedirían otras fuentes y otros autores: los de la historia que los aymaras, escribía Roberto Choque Canqui, «hace tiempo, hemos añorado por escribir» (Choque Canqui, 1978 [1974]: s. p.). El segundo es ético: la inmersión seduce, y un pastel puede embellecer la miseria o fabricar efigies; por eso la serie no dibuja el linchamiento ni el alma que el narrador declara cerrada. El tercero es de método: el dibujo depende de los datos del texto y hereda sus silencios. Puede hacerlos visibles, pero no llenarlos.</w:t>
       </w:r>
     </w:p>
     <w:p>
@@ -3770,6 +3778,30 @@
       </w:r>
       <w:r>
         <w:t xml:space="preserve">. Londres y Nueva York: Routledge.</w:t>
+      </w:r>
+    </w:p>
+    <w:p>
+      <w:pPr>
+        <w:pStyle w:val="BodyText"/>
+      </w:pPr>
+      <w:r>
+        <w:t xml:space="preserve">Julian Casablancas+The Voidz (2014).</w:t>
+      </w:r>
+      <w:r>
+        <w:t xml:space="preserve"> </w:t>
+      </w:r>
+      <w:r>
+        <w:rPr>
+          <w:i/>
+          <w:iCs/>
+        </w:rPr>
+        <w:t xml:space="preserve">Tyranny</w:t>
+      </w:r>
+      <w:r>
+        <w:t xml:space="preserve"> </w:t>
+      </w:r>
+      <w:r>
+        <w:t xml:space="preserve">[álbum]. Cult Records. Pista 6, «Father Electricity».</w:t>
       </w:r>
     </w:p>
     <w:p>

</xml_diff>